<commit_message>
upate vocabulary of IELTS
</commit_message>
<xml_diff>
--- a/IELTS Notes/Vocabulary of IELTS Test/Vocabulary of Listening Test.docx
+++ b/IELTS Notes/Vocabulary of IELTS Test/Vocabulary of Listening Test.docx
@@ -132,6 +132,298 @@
           <w:sz w:val="24"/>
           <w:szCs w:val="24"/>
         </w:rPr>
+        <w:t>account</w:t>
+      </w:r>
+      <w:r>
+        <w:rPr>
+          <w:rFonts w:ascii="Times New Roman" w:hAnsi="Times New Roman" w:cs="Times New Roman"/>
+          <w:b/>
+          <w:bCs/>
+          <w:sz w:val="24"/>
+          <w:szCs w:val="24"/>
+        </w:rPr>
+        <w:br/>
+      </w:r>
+      <w:r>
+        <w:rPr>
+          <w:rFonts w:ascii="Times New Roman" w:hAnsi="Times New Roman" w:cs="Times New Roman" w:hint="eastAsia"/>
+          <w:sz w:val="24"/>
+          <w:szCs w:val="24"/>
+        </w:rPr>
+        <w:t>[n</w:t>
+      </w:r>
+      <w:r>
+        <w:rPr>
+          <w:rFonts w:ascii="Times New Roman" w:hAnsi="Times New Roman" w:cs="Times New Roman" w:hint="eastAsia"/>
+          <w:sz w:val="24"/>
+          <w:szCs w:val="24"/>
+        </w:rPr>
+        <w:t>.</w:t>
+      </w:r>
+      <w:r>
+        <w:rPr>
+          <w:rFonts w:ascii="Times New Roman" w:hAnsi="Times New Roman" w:cs="Times New Roman" w:hint="eastAsia"/>
+          <w:sz w:val="24"/>
+          <w:szCs w:val="24"/>
+        </w:rPr>
+        <w:t>C.</w:t>
+      </w:r>
+      <w:r>
+        <w:rPr>
+          <w:rFonts w:ascii="Times New Roman" w:hAnsi="Times New Roman" w:cs="Times New Roman" w:hint="eastAsia"/>
+          <w:sz w:val="24"/>
+          <w:szCs w:val="24"/>
+        </w:rPr>
+        <w:t xml:space="preserve">] </w:t>
+      </w:r>
+      <w:r>
+        <w:rPr>
+          <w:rFonts w:ascii="Times New Roman" w:hAnsi="Times New Roman" w:cs="Times New Roman" w:hint="eastAsia"/>
+          <w:sz w:val="24"/>
+          <w:szCs w:val="24"/>
+        </w:rPr>
+        <w:t>a written or spoken of something that has happened</w:t>
+      </w:r>
+      <w:r>
+        <w:rPr>
+          <w:rFonts w:ascii="Times New Roman" w:hAnsi="Times New Roman" w:cs="Times New Roman" w:hint="eastAsia"/>
+          <w:sz w:val="24"/>
+          <w:szCs w:val="24"/>
+        </w:rPr>
+        <w:t>.</w:t>
+      </w:r>
+      <w:r>
+        <w:rPr>
+          <w:rFonts w:ascii="Times New Roman" w:hAnsi="Times New Roman" w:cs="Times New Roman"/>
+          <w:sz w:val="24"/>
+          <w:szCs w:val="24"/>
+        </w:rPr>
+        <w:br/>
+      </w:r>
+      <w:r>
+        <w:rPr>
+          <w:rFonts w:ascii="Times New Roman" w:hAnsi="Times New Roman" w:cs="Times New Roman" w:hint="eastAsia"/>
+          <w:sz w:val="24"/>
+          <w:szCs w:val="24"/>
+        </w:rPr>
+        <w:t>She gave the police a full account of the incident.</w:t>
+      </w:r>
+    </w:p>
+    <w:p>
+      <w:pPr>
+        <w:rPr>
+          <w:rFonts w:ascii="Times New Roman" w:hAnsi="Times New Roman" w:cs="Times New Roman" w:hint="eastAsia"/>
+          <w:sz w:val="24"/>
+          <w:szCs w:val="24"/>
+        </w:rPr>
+      </w:pPr>
+      <w:r>
+        <w:rPr>
+          <w:rFonts w:ascii="Times New Roman" w:hAnsi="Times New Roman" w:cs="Times New Roman" w:hint="eastAsia"/>
+          <w:b/>
+          <w:sz w:val="24"/>
+          <w:szCs w:val="24"/>
+        </w:rPr>
+        <w:t>roam</w:t>
+      </w:r>
+      <w:r>
+        <w:rPr>
+          <w:rFonts w:ascii="Times New Roman" w:hAnsi="Times New Roman" w:cs="Times New Roman"/>
+          <w:sz w:val="24"/>
+          <w:szCs w:val="24"/>
+        </w:rPr>
+        <w:br/>
+      </w:r>
+      <w:r>
+        <w:rPr>
+          <w:rFonts w:ascii="Times New Roman" w:hAnsi="Times New Roman" w:cs="Times New Roman" w:hint="eastAsia"/>
+          <w:sz w:val="24"/>
+          <w:szCs w:val="24"/>
+        </w:rPr>
+        <w:t>[vi.vt.] to walk or travel around an area without any definite aim or direction.</w:t>
+      </w:r>
+      <w:r>
+        <w:rPr>
+          <w:rFonts w:ascii="Times New Roman" w:hAnsi="Times New Roman" w:cs="Times New Roman"/>
+          <w:sz w:val="24"/>
+          <w:szCs w:val="24"/>
+        </w:rPr>
+        <w:br/>
+      </w:r>
+      <w:r>
+        <w:rPr>
+          <w:rFonts w:ascii="Times New Roman" w:hAnsi="Times New Roman" w:cs="Times New Roman" w:hint="eastAsia"/>
+          <w:sz w:val="24"/>
+          <w:szCs w:val="24"/>
+        </w:rPr>
+        <w:t xml:space="preserve">The sheep are allowed to roam freely on this land. </w:t>
+      </w:r>
+    </w:p>
+    <w:p>
+      <w:pPr>
+        <w:rPr>
+          <w:rFonts w:ascii="Times New Roman" w:hAnsi="Times New Roman" w:cs="Times New Roman" w:hint="eastAsia"/>
+          <w:sz w:val="24"/>
+          <w:szCs w:val="24"/>
+        </w:rPr>
+      </w:pPr>
+      <w:r>
+        <w:rPr>
+          <w:rFonts w:ascii="Times New Roman" w:hAnsi="Times New Roman" w:cs="Times New Roman" w:hint="eastAsia"/>
+          <w:b/>
+          <w:sz w:val="24"/>
+          <w:szCs w:val="24"/>
+        </w:rPr>
+        <w:t>stable</w:t>
+      </w:r>
+      <w:r>
+        <w:rPr>
+          <w:rFonts w:ascii="Times New Roman" w:hAnsi="Times New Roman" w:cs="Times New Roman"/>
+          <w:b/>
+          <w:sz w:val="24"/>
+          <w:szCs w:val="24"/>
+        </w:rPr>
+        <w:br/>
+      </w:r>
+      <w:r>
+        <w:rPr>
+          <w:rFonts w:ascii="Times New Roman" w:hAnsi="Times New Roman" w:cs="Times New Roman" w:hint="eastAsia"/>
+          <w:sz w:val="24"/>
+          <w:szCs w:val="24"/>
+        </w:rPr>
+        <w:t>[n.C.] a building in which horses are kept.</w:t>
+      </w:r>
+      <w:r>
+        <w:rPr>
+          <w:rFonts w:ascii="Times New Roman" w:hAnsi="Times New Roman" w:cs="Times New Roman"/>
+          <w:sz w:val="24"/>
+          <w:szCs w:val="24"/>
+        </w:rPr>
+        <w:br/>
+      </w:r>
+      <w:r>
+        <w:rPr>
+          <w:rFonts w:ascii="Times New Roman" w:hAnsi="Times New Roman" w:cs="Times New Roman" w:hint="eastAsia"/>
+          <w:sz w:val="24"/>
+          <w:szCs w:val="24"/>
+        </w:rPr>
+        <w:t>The hosre was led back to its stable.</w:t>
+      </w:r>
+    </w:p>
+    <w:p>
+      <w:pPr>
+        <w:rPr>
+          <w:rFonts w:ascii="Times New Roman" w:hAnsi="Times New Roman" w:cs="Times New Roman" w:hint="eastAsia"/>
+          <w:sz w:val="24"/>
+          <w:szCs w:val="24"/>
+        </w:rPr>
+      </w:pPr>
+      <w:bookmarkStart w:id="0" w:name="_GoBack"/>
+      <w:r>
+        <w:rPr>
+          <w:rFonts w:ascii="Times New Roman" w:hAnsi="Times New Roman" w:cs="Times New Roman" w:hint="eastAsia"/>
+          <w:b/>
+          <w:sz w:val="24"/>
+          <w:szCs w:val="24"/>
+        </w:rPr>
+        <w:t>account</w:t>
+      </w:r>
+      <w:bookmarkEnd w:id="0"/>
+      <w:r>
+        <w:rPr>
+          <w:rFonts w:ascii="Times New Roman" w:hAnsi="Times New Roman" w:cs="Times New Roman"/>
+          <w:sz w:val="24"/>
+          <w:szCs w:val="24"/>
+        </w:rPr>
+        <w:br/>
+      </w:r>
+      <w:r>
+        <w:rPr>
+          <w:rFonts w:ascii="Times New Roman" w:hAnsi="Times New Roman" w:cs="Times New Roman" w:hint="eastAsia"/>
+          <w:sz w:val="24"/>
+          <w:szCs w:val="24"/>
+        </w:rPr>
+        <w:t>[C.] a written record of money that owed to a business and of money that has paid by it.</w:t>
+      </w:r>
+      <w:r>
+        <w:rPr>
+          <w:rFonts w:ascii="Times New Roman" w:hAnsi="Times New Roman" w:cs="Times New Roman"/>
+          <w:sz w:val="24"/>
+          <w:szCs w:val="24"/>
+        </w:rPr>
+        <w:br/>
+      </w:r>
+      <w:r>
+        <w:rPr>
+          <w:rFonts w:ascii="Times New Roman" w:hAnsi="Times New Roman" w:cs="Times New Roman" w:hint="eastAsia"/>
+          <w:sz w:val="24"/>
+          <w:szCs w:val="24"/>
+        </w:rPr>
+        <w:t>e.g. to keep the accounts up to date.</w:t>
+      </w:r>
+    </w:p>
+    <w:p>
+      <w:pPr>
+        <w:rPr>
+          <w:rFonts w:ascii="Times New Roman" w:hAnsi="Times New Roman" w:cs="Times New Roman" w:hint="eastAsia"/>
+          <w:sz w:val="24"/>
+          <w:szCs w:val="24"/>
+        </w:rPr>
+      </w:pPr>
+    </w:p>
+    <w:p>
+      <w:pPr>
+        <w:rPr>
+          <w:rFonts w:ascii="Times New Roman" w:hAnsi="Times New Roman" w:cs="Times New Roman"/>
+          <w:b/>
+          <w:bCs/>
+          <w:i/>
+          <w:iCs/>
+          <w:sz w:val="24"/>
+          <w:szCs w:val="24"/>
+        </w:rPr>
+      </w:pPr>
+      <w:r>
+        <w:rPr>
+          <w:rFonts w:ascii="Times New Roman" w:hAnsi="Times New Roman" w:cs="Times New Roman"/>
+          <w:b/>
+          <w:bCs/>
+          <w:i/>
+          <w:iCs/>
+          <w:sz w:val="24"/>
+          <w:szCs w:val="24"/>
+        </w:rPr>
+        <w:t xml:space="preserve">Section </w:t>
+      </w:r>
+      <w:r>
+        <w:rPr>
+          <w:rFonts w:ascii="Times New Roman" w:hAnsi="Times New Roman" w:cs="Times New Roman" w:hint="eastAsia"/>
+          <w:b/>
+          <w:bCs/>
+          <w:i/>
+          <w:iCs/>
+          <w:sz w:val="24"/>
+          <w:szCs w:val="24"/>
+        </w:rPr>
+        <w:t>4</w:t>
+      </w:r>
+    </w:p>
+    <w:p>
+      <w:pPr>
+        <w:rPr>
+          <w:rFonts w:ascii="Times New Roman" w:hAnsi="Times New Roman" w:cs="Times New Roman"/>
+          <w:sz w:val="24"/>
+          <w:szCs w:val="24"/>
+        </w:rPr>
+      </w:pPr>
+      <w:r>
+        <w:rPr>
+          <w:rFonts w:ascii="Times New Roman" w:hAnsi="Times New Roman" w:cs="Times New Roman" w:hint="eastAsia"/>
+          <w:b/>
+          <w:bCs/>
+          <w:sz w:val="24"/>
+          <w:szCs w:val="24"/>
+        </w:rPr>
         <w:t>evaporate</w:t>
       </w:r>
       <w:r>
@@ -164,13 +456,29 @@
           <w:sz w:val="24"/>
           <w:szCs w:val="24"/>
         </w:rPr>
-        <w:t>to change liquid inot a gas, especially steam</w:t>
-      </w:r>
-    </w:p>
-    <w:p>
-      <w:pPr>
-        <w:rPr>
-          <w:rFonts w:ascii="华文宋体" w:eastAsia="华文宋体" w:hAnsi="华文宋体" w:cs="Times New Roman" w:hint="eastAsia"/>
+        <w:t>to change liquid into</w:t>
+      </w:r>
+      <w:r>
+        <w:rPr>
+          <w:rFonts w:ascii="Times New Roman" w:hAnsi="Times New Roman" w:cs="Times New Roman" w:hint="eastAsia"/>
+          <w:sz w:val="24"/>
+          <w:szCs w:val="24"/>
+        </w:rPr>
+        <w:t xml:space="preserve"> a gas, especially steam</w:t>
+      </w:r>
+      <w:r>
+        <w:rPr>
+          <w:rFonts w:ascii="Times New Roman" w:hAnsi="Times New Roman" w:cs="Times New Roman" w:hint="eastAsia"/>
+          <w:sz w:val="24"/>
+          <w:szCs w:val="24"/>
+        </w:rPr>
+        <w:t>.</w:t>
+      </w:r>
+    </w:p>
+    <w:p>
+      <w:pPr>
+        <w:rPr>
+          <w:rFonts w:ascii="华文宋体" w:eastAsia="华文宋体" w:hAnsi="华文宋体" w:cs="Times New Roman"/>
           <w:sz w:val="24"/>
           <w:szCs w:val="24"/>
         </w:rPr>
@@ -230,23 +538,13 @@
           <w:sz w:val="24"/>
           <w:szCs w:val="24"/>
         </w:rPr>
-        <w:t>The wind gusted through the branches</w:t>
-      </w:r>
-      <w:bookmarkStart w:id="0" w:name="_GoBack"/>
-      <w:bookmarkEnd w:id="0"/>
-      <w:r>
-        <w:rPr>
-          <w:rFonts w:ascii="Times New Roman" w:hAnsi="Times New Roman" w:cs="Times New Roman" w:hint="eastAsia"/>
-          <w:sz w:val="24"/>
-          <w:szCs w:val="24"/>
-        </w:rPr>
-        <w:t>.</w:t>
-      </w:r>
-    </w:p>
-    <w:p>
-      <w:pPr>
-        <w:rPr>
-          <w:rFonts w:ascii="华文宋体" w:eastAsia="华文宋体" w:hAnsi="华文宋体" w:cs="Times New Roman" w:hint="eastAsia"/>
+        <w:t>The wind gusted through the branches.</w:t>
+      </w:r>
+    </w:p>
+    <w:p>
+      <w:pPr>
+        <w:rPr>
+          <w:rFonts w:ascii="华文宋体" w:eastAsia="华文宋体" w:hAnsi="华文宋体" w:cs="Times New Roman"/>
           <w:sz w:val="24"/>
           <w:szCs w:val="24"/>
         </w:rPr>
@@ -480,6 +778,7 @@
           <w:sz w:val="24"/>
           <w:szCs w:val="24"/>
         </w:rPr>
+        <w:lastRenderedPageBreak/>
         <w:t>minus</w:t>
       </w:r>
       <w:r>
@@ -769,7 +1068,6 @@
           <w:sz w:val="24"/>
           <w:szCs w:val="24"/>
         </w:rPr>
-        <w:lastRenderedPageBreak/>
         <w:t>prospectus</w:t>
       </w:r>
       <w:r>
@@ -1103,6 +1401,7 @@
           <w:b/>
           <w:bCs/>
         </w:rPr>
+        <w:lastRenderedPageBreak/>
         <w:t>consignment</w:t>
       </w:r>
       <w:r>
@@ -1493,7 +1792,6 @@
           <w:sz w:val="28"/>
           <w:szCs w:val="28"/>
         </w:rPr>
-        <w:lastRenderedPageBreak/>
         <w:t>Section 2</w:t>
       </w:r>
     </w:p>
@@ -2196,6 +2494,7 @@
           <w:sz w:val="24"/>
           <w:szCs w:val="24"/>
         </w:rPr>
+        <w:lastRenderedPageBreak/>
         <w:t>baling</w:t>
       </w:r>
       <w:r>
@@ -2648,7 +2947,6 @@
           <w:sz w:val="24"/>
           <w:szCs w:val="24"/>
         </w:rPr>
-        <w:lastRenderedPageBreak/>
         <w:t>session</w:t>
       </w:r>
       <w:r>
@@ -3289,6 +3587,7 @@
           <w:sz w:val="32"/>
           <w:szCs w:val="32"/>
         </w:rPr>
+        <w:lastRenderedPageBreak/>
         <w:t xml:space="preserve">Cambridge IELTS </w:t>
       </w:r>
       <w:r>
@@ -4000,7 +4299,6 @@
           <w:sz w:val="28"/>
           <w:szCs w:val="24"/>
         </w:rPr>
-        <w:lastRenderedPageBreak/>
         <w:t xml:space="preserve">Section </w:t>
       </w:r>
       <w:r>
@@ -4578,6 +4876,7 @@
           <w:sz w:val="24"/>
           <w:szCs w:val="24"/>
         </w:rPr>
+        <w:lastRenderedPageBreak/>
         <w:t>e</w:t>
       </w:r>
       <w:r>
@@ -4977,7 +5276,6 @@
           <w:sz w:val="24"/>
           <w:szCs w:val="24"/>
         </w:rPr>
-        <w:lastRenderedPageBreak/>
         <w:t xml:space="preserve">let </w:t>
       </w:r>
       <w:r>
@@ -5495,6 +5793,7 @@
           <w:sz w:val="24"/>
           <w:szCs w:val="24"/>
         </w:rPr>
+        <w:lastRenderedPageBreak/>
         <w:t>footbridge</w:t>
       </w:r>
       <w:r>
@@ -5706,238 +6005,870 @@
           <w:sz w:val="24"/>
           <w:szCs w:val="24"/>
         </w:rPr>
+        <w:t>hunter-gatherer</w:t>
+      </w:r>
+      <w:r>
+        <w:rPr>
+          <w:rFonts w:ascii="Times New Roman" w:eastAsia="华文宋体" w:hAnsi="Times New Roman" w:cs="Times New Roman"/>
+          <w:sz w:val="24"/>
+          <w:szCs w:val="24"/>
+        </w:rPr>
+        <w:br/>
+      </w:r>
+      <w:r>
+        <w:rPr>
+          <w:rFonts w:ascii="Times New Roman" w:eastAsia="华文宋体" w:hAnsi="Times New Roman" w:cs="Times New Roman" w:hint="eastAsia"/>
+          <w:sz w:val="24"/>
+          <w:szCs w:val="24"/>
+        </w:rPr>
+        <w:t>a number of a group of people who do not live in one place but move around and live by hunting, fishing and gathering plants</w:t>
+      </w:r>
+    </w:p>
+    <w:p>
+      <w:pPr>
+        <w:rPr>
+          <w:rFonts w:ascii="Times New Roman" w:eastAsia="华文宋体" w:hAnsi="Times New Roman" w:cs="Times New Roman"/>
+          <w:sz w:val="24"/>
+          <w:szCs w:val="24"/>
+        </w:rPr>
+      </w:pPr>
+      <w:r>
+        <w:rPr>
+          <w:rFonts w:ascii="Times New Roman" w:eastAsia="华文宋体" w:hAnsi="Times New Roman" w:cs="Times New Roman" w:hint="eastAsia"/>
+          <w:b/>
+          <w:sz w:val="24"/>
+          <w:szCs w:val="24"/>
+        </w:rPr>
+        <w:t>beforehand</w:t>
+      </w:r>
+      <w:r>
+        <w:rPr>
+          <w:rFonts w:ascii="Times New Roman" w:eastAsia="华文宋体" w:hAnsi="Times New Roman" w:cs="Times New Roman"/>
+          <w:b/>
+          <w:sz w:val="24"/>
+          <w:szCs w:val="24"/>
+        </w:rPr>
+        <w:br/>
+      </w:r>
+      <w:r>
+        <w:rPr>
+          <w:rFonts w:ascii="Times New Roman" w:eastAsia="华文宋体" w:hAnsi="Times New Roman" w:cs="Times New Roman" w:hint="eastAsia"/>
+          <w:sz w:val="24"/>
+          <w:szCs w:val="24"/>
+        </w:rPr>
+        <w:t>[adv.]</w:t>
+      </w:r>
+      <w:r>
+        <w:rPr>
+          <w:rFonts w:ascii="Times New Roman" w:eastAsia="华文宋体" w:hAnsi="Times New Roman" w:cs="Times New Roman"/>
+          <w:sz w:val="24"/>
+          <w:szCs w:val="24"/>
+        </w:rPr>
+        <w:br/>
+      </w:r>
+      <w:r>
+        <w:rPr>
+          <w:rFonts w:ascii="Times New Roman" w:eastAsia="华文宋体" w:hAnsi="Times New Roman" w:cs="Times New Roman" w:hint="eastAsia"/>
+          <w:sz w:val="24"/>
+          <w:szCs w:val="24"/>
+        </w:rPr>
+        <w:t>earlier; before something else happens or is done</w:t>
+      </w:r>
+      <w:r>
+        <w:rPr>
+          <w:rFonts w:ascii="Times New Roman" w:eastAsia="华文宋体" w:hAnsi="Times New Roman" w:cs="Times New Roman"/>
+          <w:sz w:val="24"/>
+          <w:szCs w:val="24"/>
+        </w:rPr>
+        <w:br/>
+      </w:r>
+      <w:r>
+        <w:rPr>
+          <w:rFonts w:ascii="Times New Roman" w:eastAsia="华文宋体" w:hAnsi="Times New Roman" w:cs="Times New Roman" w:hint="eastAsia"/>
+          <w:sz w:val="24"/>
+          <w:szCs w:val="24"/>
+        </w:rPr>
+        <w:t>I wish we</w:t>
+      </w:r>
+      <w:r>
+        <w:rPr>
+          <w:rFonts w:ascii="Times New Roman" w:eastAsia="华文宋体" w:hAnsi="Times New Roman" w:cs="Times New Roman"/>
+          <w:sz w:val="24"/>
+          <w:szCs w:val="24"/>
+        </w:rPr>
+        <w:t>’</w:t>
+      </w:r>
+      <w:r>
+        <w:rPr>
+          <w:rFonts w:ascii="Times New Roman" w:eastAsia="华文宋体" w:hAnsi="Times New Roman" w:cs="Times New Roman" w:hint="eastAsia"/>
+          <w:sz w:val="24"/>
+          <w:szCs w:val="24"/>
+        </w:rPr>
+        <w:t xml:space="preserve">d known about it </w:t>
+      </w:r>
+      <w:r>
+        <w:rPr>
+          <w:rFonts w:ascii="Times New Roman" w:eastAsia="华文宋体" w:hAnsi="Times New Roman" w:cs="Times New Roman" w:hint="eastAsia"/>
+          <w:sz w:val="24"/>
+          <w:szCs w:val="24"/>
+        </w:rPr>
+        <w:t>beforehand.</w:t>
+      </w:r>
+    </w:p>
+    <w:p>
+      <w:pPr>
+        <w:rPr>
+          <w:rFonts w:ascii="Times New Roman" w:eastAsia="华文宋体" w:hAnsi="Times New Roman" w:cs="Times New Roman"/>
+          <w:sz w:val="24"/>
+          <w:szCs w:val="24"/>
+        </w:rPr>
+      </w:pPr>
+      <w:r>
+        <w:rPr>
+          <w:rFonts w:ascii="Times New Roman" w:eastAsia="华文宋体" w:hAnsi="Times New Roman" w:cs="Times New Roman" w:hint="eastAsia"/>
+          <w:b/>
+          <w:sz w:val="24"/>
+          <w:szCs w:val="24"/>
+        </w:rPr>
+        <w:t xml:space="preserve">viable </w:t>
+      </w:r>
+      <w:r>
+        <w:rPr>
+          <w:rFonts w:ascii="Times New Roman" w:eastAsia="华文宋体" w:hAnsi="Times New Roman" w:cs="Times New Roman"/>
+          <w:b/>
+          <w:sz w:val="24"/>
+          <w:szCs w:val="24"/>
+        </w:rPr>
+        <w:br/>
+      </w:r>
+      <w:r>
+        <w:rPr>
+          <w:rFonts w:ascii="Times New Roman" w:eastAsia="华文宋体" w:hAnsi="Times New Roman" w:cs="Times New Roman" w:hint="eastAsia"/>
+          <w:sz w:val="24"/>
+          <w:szCs w:val="24"/>
+        </w:rPr>
+        <w:t xml:space="preserve">[adj.] capable of developing and surviving independently. </w:t>
+      </w:r>
+      <w:r>
+        <w:rPr>
+          <w:rFonts w:ascii="Times New Roman" w:eastAsia="华文宋体" w:hAnsi="Times New Roman" w:cs="Times New Roman"/>
+          <w:sz w:val="24"/>
+          <w:szCs w:val="24"/>
+        </w:rPr>
+        <w:br/>
+      </w:r>
+      <w:r>
+        <w:rPr>
+          <w:rFonts w:ascii="Times New Roman" w:eastAsia="华文宋体" w:hAnsi="Times New Roman" w:cs="Times New Roman" w:hint="eastAsia"/>
+          <w:sz w:val="24"/>
+          <w:szCs w:val="24"/>
+        </w:rPr>
+        <w:t xml:space="preserve">to establish a viable population. </w:t>
+      </w:r>
+    </w:p>
+    <w:p>
+      <w:pPr>
+        <w:rPr>
+          <w:rFonts w:ascii="Times New Roman" w:eastAsia="华文宋体" w:hAnsi="Times New Roman" w:cs="Times New Roman"/>
+          <w:sz w:val="24"/>
+          <w:szCs w:val="24"/>
+        </w:rPr>
+      </w:pPr>
+      <w:r>
+        <w:rPr>
+          <w:rFonts w:ascii="Times New Roman" w:eastAsia="华文宋体" w:hAnsi="Times New Roman" w:cs="Times New Roman" w:hint="eastAsia"/>
+          <w:b/>
+          <w:sz w:val="24"/>
+          <w:szCs w:val="24"/>
+        </w:rPr>
+        <w:t>sufficient</w:t>
+      </w:r>
+      <w:r>
+        <w:rPr>
+          <w:rFonts w:ascii="Times New Roman" w:eastAsia="华文宋体" w:hAnsi="Times New Roman" w:cs="Times New Roman"/>
+          <w:sz w:val="24"/>
+          <w:szCs w:val="24"/>
+        </w:rPr>
+        <w:br/>
+      </w:r>
+      <w:r>
+        <w:rPr>
+          <w:rFonts w:ascii="Times New Roman" w:eastAsia="华文宋体" w:hAnsi="Times New Roman" w:cs="Times New Roman" w:hint="eastAsia"/>
+          <w:sz w:val="24"/>
+          <w:szCs w:val="24"/>
+        </w:rPr>
+        <w:t>[adj.] enough for a particular purpose.</w:t>
+      </w:r>
+      <w:r>
+        <w:rPr>
+          <w:rFonts w:ascii="Times New Roman" w:eastAsia="华文宋体" w:hAnsi="Times New Roman" w:cs="Times New Roman"/>
+          <w:sz w:val="24"/>
+          <w:szCs w:val="24"/>
+        </w:rPr>
+        <w:br/>
+      </w:r>
+      <w:r>
+        <w:rPr>
+          <w:rFonts w:ascii="Times New Roman" w:eastAsia="华文宋体" w:hAnsi="Times New Roman" w:cs="Times New Roman" w:hint="eastAsia"/>
+          <w:sz w:val="24"/>
+          <w:szCs w:val="24"/>
+        </w:rPr>
+        <w:t>e.g. a sufficient number of men and women were transported to Ireland.</w:t>
+      </w:r>
+    </w:p>
+    <w:p>
+      <w:pPr>
+        <w:rPr>
+          <w:rFonts w:ascii="Times New Roman" w:eastAsia="华文宋体" w:hAnsi="Times New Roman" w:cs="Times New Roman"/>
+          <w:sz w:val="24"/>
+          <w:szCs w:val="24"/>
+        </w:rPr>
+      </w:pPr>
+      <w:r>
+        <w:rPr>
+          <w:rFonts w:ascii="Times New Roman" w:eastAsia="华文宋体" w:hAnsi="Times New Roman" w:cs="Times New Roman" w:hint="eastAsia"/>
+          <w:b/>
+          <w:sz w:val="24"/>
+          <w:szCs w:val="24"/>
+        </w:rPr>
+        <w:t>descend</w:t>
+      </w:r>
+      <w:r>
+        <w:rPr>
+          <w:rFonts w:ascii="Times New Roman" w:eastAsia="华文宋体" w:hAnsi="Times New Roman" w:cs="Times New Roman"/>
+          <w:sz w:val="24"/>
+          <w:szCs w:val="24"/>
+        </w:rPr>
+        <w:br/>
+      </w:r>
+      <w:r>
+        <w:rPr>
+          <w:rFonts w:ascii="Times New Roman" w:eastAsia="华文宋体" w:hAnsi="Times New Roman" w:cs="Times New Roman" w:hint="eastAsia"/>
+          <w:sz w:val="24"/>
+          <w:szCs w:val="24"/>
+        </w:rPr>
+        <w:t xml:space="preserve">[vt.] </w:t>
+      </w:r>
+      <w:r>
+        <w:rPr>
+          <w:rFonts w:ascii="Times New Roman" w:eastAsia="华文宋体" w:hAnsi="Times New Roman" w:cs="Times New Roman" w:hint="eastAsia"/>
+          <w:sz w:val="24"/>
+          <w:szCs w:val="24"/>
+        </w:rPr>
+        <w:t xml:space="preserve">be a blood relative of </w:t>
+      </w:r>
+    </w:p>
+    <w:p>
+      <w:pPr>
+        <w:rPr>
+          <w:rFonts w:ascii="Times New Roman" w:eastAsia="华文宋体" w:hAnsi="Times New Roman" w:cs="Times New Roman"/>
+          <w:sz w:val="24"/>
+          <w:szCs w:val="24"/>
+        </w:rPr>
+      </w:pPr>
+      <w:r>
+        <w:rPr>
+          <w:rFonts w:ascii="Times New Roman" w:eastAsia="华文宋体" w:hAnsi="Times New Roman" w:cs="Times New Roman" w:hint="eastAsia"/>
+          <w:b/>
+          <w:sz w:val="24"/>
+          <w:szCs w:val="24"/>
+        </w:rPr>
+        <w:t>plough</w:t>
+      </w:r>
+      <w:r>
+        <w:rPr>
+          <w:rFonts w:ascii="Times New Roman" w:eastAsia="华文宋体" w:hAnsi="Times New Roman" w:cs="Times New Roman" w:hint="eastAsia"/>
+          <w:sz w:val="24"/>
+          <w:szCs w:val="24"/>
+        </w:rPr>
+        <w:t xml:space="preserve"> /</w:t>
+      </w:r>
+      <w:r>
+        <w:rPr>
+          <w:rFonts w:ascii="GWIPA" w:eastAsia="华文宋体" w:hAnsi="GWIPA" w:cs="Times New Roman"/>
+          <w:sz w:val="24"/>
+          <w:szCs w:val="24"/>
+        </w:rPr>
+        <w:t></w:t>
+      </w:r>
+      <w:r>
+        <w:rPr>
+          <w:rFonts w:ascii="GWIPA" w:eastAsia="华文宋体" w:hAnsi="GWIPA" w:cs="Times New Roman"/>
+          <w:sz w:val="24"/>
+          <w:szCs w:val="24"/>
+        </w:rPr>
+        <w:t></w:t>
+      </w:r>
+      <w:r>
+        <w:rPr>
+          <w:rFonts w:ascii="GWIPA" w:eastAsia="华文宋体" w:hAnsi="GWIPA" w:cs="Times New Roman"/>
+          <w:sz w:val="24"/>
+          <w:szCs w:val="24"/>
+        </w:rPr>
+        <w:t></w:t>
+      </w:r>
+      <w:r>
+        <w:rPr>
+          <w:rFonts w:ascii="GWIPA" w:eastAsia="华文宋体" w:hAnsi="GWIPA" w:cs="Times New Roman"/>
+          <w:sz w:val="24"/>
+          <w:szCs w:val="24"/>
+        </w:rPr>
+        <w:t></w:t>
+      </w:r>
+      <w:r>
+        <w:rPr>
+          <w:rFonts w:ascii="Times New Roman" w:eastAsia="华文宋体" w:hAnsi="Times New Roman" w:cs="Times New Roman" w:hint="eastAsia"/>
+          <w:sz w:val="24"/>
+          <w:szCs w:val="24"/>
+        </w:rPr>
+        <w:t>/</w:t>
+      </w:r>
+      <w:r>
+        <w:rPr>
+          <w:rFonts w:ascii="Times New Roman" w:eastAsia="华文宋体" w:hAnsi="Times New Roman" w:cs="Times New Roman"/>
+          <w:sz w:val="24"/>
+          <w:szCs w:val="24"/>
+        </w:rPr>
+        <w:br/>
+      </w:r>
+      <w:r>
+        <w:rPr>
+          <w:rFonts w:ascii="Times New Roman" w:eastAsia="华文宋体" w:hAnsi="Times New Roman" w:cs="Times New Roman" w:hint="eastAsia"/>
+          <w:sz w:val="24"/>
+          <w:szCs w:val="24"/>
+        </w:rPr>
+        <w:t xml:space="preserve">[n.] a large piece of farming equipment with one or serval curved blades to dig and trun over soil. </w:t>
+      </w:r>
+      <w:r>
+        <w:rPr>
+          <w:rFonts w:ascii="Times New Roman" w:eastAsia="华文宋体" w:hAnsi="Times New Roman" w:cs="Times New Roman"/>
+          <w:sz w:val="24"/>
+          <w:szCs w:val="24"/>
+        </w:rPr>
+        <w:br/>
+      </w:r>
+      <w:r>
+        <w:rPr>
+          <w:rFonts w:ascii="Times New Roman" w:eastAsia="华文宋体" w:hAnsi="Times New Roman" w:cs="Times New Roman" w:hint="eastAsia"/>
+          <w:sz w:val="24"/>
+          <w:szCs w:val="24"/>
+        </w:rPr>
+        <w:t>[vt.vi.] to dig and trun over a field or other area of land with a plough.</w:t>
+      </w:r>
+    </w:p>
+    <w:p>
+      <w:pPr>
+        <w:rPr>
+          <w:rFonts w:ascii="Times New Roman" w:eastAsia="华文宋体" w:hAnsi="Times New Roman" w:cs="Times New Roman"/>
+          <w:sz w:val="24"/>
+          <w:szCs w:val="24"/>
+        </w:rPr>
+      </w:pPr>
+      <w:r>
+        <w:rPr>
+          <w:rFonts w:ascii="Times New Roman" w:eastAsia="华文宋体" w:hAnsi="Times New Roman" w:cs="Times New Roman" w:hint="eastAsia"/>
+          <w:b/>
+          <w:sz w:val="24"/>
+          <w:szCs w:val="24"/>
+        </w:rPr>
+        <w:t>excavation</w:t>
+      </w:r>
+      <w:r>
+        <w:rPr>
+          <w:rFonts w:ascii="Times New Roman" w:eastAsia="华文宋体" w:hAnsi="Times New Roman" w:cs="Times New Roman" w:hint="eastAsia"/>
+          <w:sz w:val="24"/>
+          <w:szCs w:val="24"/>
+        </w:rPr>
+        <w:t xml:space="preserve"> /</w:t>
+      </w:r>
+      <w:r>
+        <w:rPr>
+          <w:rFonts w:ascii="GWIPA" w:eastAsia="华文宋体" w:hAnsi="GWIPA" w:cs="Times New Roman"/>
+          <w:sz w:val="24"/>
+          <w:szCs w:val="24"/>
+        </w:rPr>
+        <w:t></w:t>
+      </w:r>
+      <w:r>
+        <w:rPr>
+          <w:rFonts w:ascii="GWIPA" w:eastAsia="华文宋体" w:hAnsi="GWIPA" w:cs="Times New Roman"/>
+          <w:sz w:val="24"/>
+          <w:szCs w:val="24"/>
+        </w:rPr>
+        <w:t></w:t>
+      </w:r>
+      <w:r>
+        <w:rPr>
+          <w:rFonts w:ascii="GWIPA" w:eastAsia="华文宋体" w:hAnsi="GWIPA" w:cs="Times New Roman"/>
+          <w:sz w:val="24"/>
+          <w:szCs w:val="24"/>
+        </w:rPr>
+        <w:t></w:t>
+      </w:r>
+      <w:r>
+        <w:rPr>
+          <w:rFonts w:ascii="GWIPA" w:eastAsia="华文宋体" w:hAnsi="GWIPA" w:cs="Times New Roman"/>
+          <w:sz w:val="24"/>
+          <w:szCs w:val="24"/>
+        </w:rPr>
+        <w:t></w:t>
+      </w:r>
+      <w:r>
+        <w:rPr>
+          <w:rFonts w:ascii="GWIPA" w:eastAsia="华文宋体" w:hAnsi="GWIPA" w:cs="Times New Roman"/>
+          <w:sz w:val="24"/>
+          <w:szCs w:val="24"/>
+        </w:rPr>
+        <w:t></w:t>
+      </w:r>
+      <w:r>
+        <w:rPr>
+          <w:rFonts w:ascii="GWIPA" w:eastAsia="华文宋体" w:hAnsi="GWIPA" w:cs="Times New Roman"/>
+          <w:sz w:val="24"/>
+          <w:szCs w:val="24"/>
+        </w:rPr>
+        <w:t></w:t>
+      </w:r>
+      <w:r>
+        <w:rPr>
+          <w:rFonts w:ascii="GWIPA" w:eastAsia="华文宋体" w:hAnsi="GWIPA" w:cs="Times New Roman"/>
+          <w:sz w:val="24"/>
+          <w:szCs w:val="24"/>
+        </w:rPr>
+        <w:t></w:t>
+      </w:r>
+      <w:r>
+        <w:rPr>
+          <w:rFonts w:ascii="GWIPA" w:eastAsia="华文宋体" w:hAnsi="GWIPA" w:cs="Times New Roman"/>
+          <w:sz w:val="24"/>
+          <w:szCs w:val="24"/>
+        </w:rPr>
+        <w:t></w:t>
+      </w:r>
+      <w:r>
+        <w:rPr>
+          <w:rFonts w:ascii="GWIPA" w:eastAsia="华文宋体" w:hAnsi="GWIPA" w:cs="Times New Roman"/>
+          <w:sz w:val="24"/>
+          <w:szCs w:val="24"/>
+        </w:rPr>
+        <w:t></w:t>
+      </w:r>
+      <w:r>
+        <w:rPr>
+          <w:rFonts w:ascii="GWIPA" w:eastAsia="华文宋体" w:hAnsi="GWIPA" w:cs="Times New Roman"/>
+          <w:sz w:val="24"/>
+          <w:szCs w:val="24"/>
+        </w:rPr>
+        <w:t></w:t>
+      </w:r>
+      <w:r>
+        <w:rPr>
+          <w:rFonts w:ascii="GWIPA" w:eastAsia="华文宋体" w:hAnsi="GWIPA" w:cs="Times New Roman"/>
+          <w:sz w:val="24"/>
+          <w:szCs w:val="24"/>
+        </w:rPr>
+        <w:t></w:t>
+      </w:r>
+      <w:r>
+        <w:rPr>
+          <w:rFonts w:ascii="GWIPA" w:eastAsia="华文宋体" w:hAnsi="GWIPA" w:cs="Times New Roman"/>
+          <w:sz w:val="24"/>
+          <w:szCs w:val="24"/>
+        </w:rPr>
+        <w:t></w:t>
+      </w:r>
+      <w:r>
+        <w:rPr>
+          <w:rFonts w:ascii="Times New Roman" w:eastAsia="华文宋体" w:hAnsi="Times New Roman" w:cs="Times New Roman" w:hint="eastAsia"/>
+          <w:sz w:val="24"/>
+          <w:szCs w:val="24"/>
+        </w:rPr>
+        <w:t>/</w:t>
+      </w:r>
+      <w:r>
+        <w:rPr>
+          <w:rFonts w:ascii="Times New Roman" w:eastAsia="华文宋体" w:hAnsi="Times New Roman" w:cs="Times New Roman"/>
+          <w:sz w:val="24"/>
+          <w:szCs w:val="24"/>
+        </w:rPr>
+        <w:br/>
+      </w:r>
+      <w:r>
+        <w:rPr>
+          <w:rFonts w:ascii="Times New Roman" w:eastAsia="华文宋体" w:hAnsi="Times New Roman" w:cs="Times New Roman" w:hint="eastAsia"/>
+          <w:sz w:val="24"/>
+          <w:szCs w:val="24"/>
+        </w:rPr>
+        <w:t>[n.] the activity of diggin</w:t>
+      </w:r>
+      <w:r>
+        <w:rPr>
+          <w:rFonts w:ascii="Times New Roman" w:eastAsia="华文宋体" w:hAnsi="Times New Roman" w:cs="Times New Roman" w:hint="eastAsia"/>
+          <w:sz w:val="24"/>
+          <w:szCs w:val="24"/>
+        </w:rPr>
+        <w:t>g</w:t>
+      </w:r>
+      <w:r>
+        <w:rPr>
+          <w:rFonts w:ascii="Times New Roman" w:eastAsia="华文宋体" w:hAnsi="Times New Roman" w:cs="Times New Roman" w:hint="eastAsia"/>
+          <w:sz w:val="24"/>
+          <w:szCs w:val="24"/>
+        </w:rPr>
+        <w:t xml:space="preserve"> in the ground to look for old buildings or objects that have been buried for a long time.</w:t>
+      </w:r>
+    </w:p>
+    <w:p>
+      <w:pPr>
+        <w:rPr>
+          <w:rFonts w:ascii="Times New Roman" w:eastAsia="华文宋体" w:hAnsi="Times New Roman" w:cs="Times New Roman"/>
+          <w:sz w:val="24"/>
+          <w:szCs w:val="24"/>
+        </w:rPr>
+      </w:pPr>
+      <w:r>
+        <w:rPr>
+          <w:rFonts w:ascii="Times New Roman" w:eastAsia="华文宋体" w:hAnsi="Times New Roman" w:cs="Times New Roman" w:hint="eastAsia"/>
+          <w:b/>
+          <w:sz w:val="24"/>
+          <w:szCs w:val="24"/>
+        </w:rPr>
+        <w:t xml:space="preserve">husbandry </w:t>
+      </w:r>
+      <w:r>
+        <w:rPr>
+          <w:rFonts w:ascii="Times New Roman" w:eastAsia="华文宋体" w:hAnsi="Times New Roman" w:cs="Times New Roman"/>
+          <w:sz w:val="24"/>
+          <w:szCs w:val="24"/>
+        </w:rPr>
+        <w:br/>
+      </w:r>
+      <w:r>
+        <w:rPr>
+          <w:rFonts w:ascii="Times New Roman" w:eastAsia="华文宋体" w:hAnsi="Times New Roman" w:cs="Times New Roman" w:hint="eastAsia"/>
+          <w:sz w:val="24"/>
+          <w:szCs w:val="24"/>
+        </w:rPr>
+        <w:t>[n.] farming, especially when done carefully and well.</w:t>
+      </w:r>
+      <w:r>
+        <w:rPr>
+          <w:rFonts w:ascii="Times New Roman" w:eastAsia="华文宋体" w:hAnsi="Times New Roman" w:cs="Times New Roman"/>
+          <w:sz w:val="24"/>
+          <w:szCs w:val="24"/>
+        </w:rPr>
+        <w:br/>
+      </w:r>
+      <w:r>
+        <w:rPr>
+          <w:rFonts w:ascii="Times New Roman" w:eastAsia="华文宋体" w:hAnsi="Times New Roman" w:cs="Times New Roman" w:hint="eastAsia"/>
+          <w:sz w:val="24"/>
+          <w:szCs w:val="24"/>
+        </w:rPr>
+        <w:t>animal/crop husbandry.</w:t>
+      </w:r>
+    </w:p>
+    <w:p>
+      <w:pPr>
+        <w:rPr>
+          <w:rFonts w:ascii="Times New Roman" w:eastAsia="华文宋体" w:hAnsi="Times New Roman" w:cs="Times New Roman"/>
+          <w:sz w:val="24"/>
+          <w:szCs w:val="24"/>
+        </w:rPr>
+      </w:pPr>
+      <w:r>
+        <w:rPr>
+          <w:rFonts w:ascii="Times New Roman" w:eastAsia="华文宋体" w:hAnsi="Times New Roman" w:cs="Times New Roman" w:hint="eastAsia"/>
+          <w:b/>
+          <w:sz w:val="24"/>
+          <w:szCs w:val="24"/>
+        </w:rPr>
         <w:lastRenderedPageBreak/>
-        <w:t>hunter-gatherer</w:t>
-      </w:r>
-      <w:r>
-        <w:rPr>
-          <w:rFonts w:ascii="Times New Roman" w:eastAsia="华文宋体" w:hAnsi="Times New Roman" w:cs="Times New Roman"/>
-          <w:sz w:val="24"/>
-          <w:szCs w:val="24"/>
-        </w:rPr>
-        <w:br/>
-      </w:r>
-      <w:r>
-        <w:rPr>
-          <w:rFonts w:ascii="Times New Roman" w:eastAsia="华文宋体" w:hAnsi="Times New Roman" w:cs="Times New Roman" w:hint="eastAsia"/>
-          <w:sz w:val="24"/>
-          <w:szCs w:val="24"/>
-        </w:rPr>
-        <w:t>a number of a group of people who do not live in one place but move around and live by hunting, fishing and gathering plants</w:t>
-      </w:r>
-    </w:p>
-    <w:p>
-      <w:pPr>
-        <w:rPr>
-          <w:rFonts w:ascii="Times New Roman" w:eastAsia="华文宋体" w:hAnsi="Times New Roman" w:cs="Times New Roman"/>
-          <w:sz w:val="24"/>
-          <w:szCs w:val="24"/>
-        </w:rPr>
-      </w:pPr>
-      <w:r>
-        <w:rPr>
-          <w:rFonts w:ascii="Times New Roman" w:eastAsia="华文宋体" w:hAnsi="Times New Roman" w:cs="Times New Roman" w:hint="eastAsia"/>
-          <w:b/>
-          <w:sz w:val="24"/>
-          <w:szCs w:val="24"/>
-        </w:rPr>
-        <w:t>beforehand</w:t>
-      </w:r>
-      <w:r>
-        <w:rPr>
-          <w:rFonts w:ascii="Times New Roman" w:eastAsia="华文宋体" w:hAnsi="Times New Roman" w:cs="Times New Roman"/>
-          <w:b/>
-          <w:sz w:val="24"/>
-          <w:szCs w:val="24"/>
-        </w:rPr>
-        <w:br/>
-      </w:r>
-      <w:r>
-        <w:rPr>
-          <w:rFonts w:ascii="Times New Roman" w:eastAsia="华文宋体" w:hAnsi="Times New Roman" w:cs="Times New Roman" w:hint="eastAsia"/>
-          <w:sz w:val="24"/>
-          <w:szCs w:val="24"/>
-        </w:rPr>
-        <w:t>[adv.]</w:t>
-      </w:r>
-      <w:r>
-        <w:rPr>
-          <w:rFonts w:ascii="Times New Roman" w:eastAsia="华文宋体" w:hAnsi="Times New Roman" w:cs="Times New Roman"/>
-          <w:sz w:val="24"/>
-          <w:szCs w:val="24"/>
-        </w:rPr>
-        <w:br/>
-      </w:r>
-      <w:r>
-        <w:rPr>
-          <w:rFonts w:ascii="Times New Roman" w:eastAsia="华文宋体" w:hAnsi="Times New Roman" w:cs="Times New Roman" w:hint="eastAsia"/>
-          <w:sz w:val="24"/>
-          <w:szCs w:val="24"/>
-        </w:rPr>
-        <w:t>earlier; before something else happens or is done</w:t>
-      </w:r>
-      <w:r>
-        <w:rPr>
-          <w:rFonts w:ascii="Times New Roman" w:eastAsia="华文宋体" w:hAnsi="Times New Roman" w:cs="Times New Roman"/>
-          <w:sz w:val="24"/>
-          <w:szCs w:val="24"/>
-        </w:rPr>
-        <w:br/>
-      </w:r>
-      <w:r>
-        <w:rPr>
-          <w:rFonts w:ascii="Times New Roman" w:eastAsia="华文宋体" w:hAnsi="Times New Roman" w:cs="Times New Roman" w:hint="eastAsia"/>
-          <w:sz w:val="24"/>
-          <w:szCs w:val="24"/>
-        </w:rPr>
-        <w:t>I wish we</w:t>
-      </w:r>
-      <w:r>
-        <w:rPr>
-          <w:rFonts w:ascii="Times New Roman" w:eastAsia="华文宋体" w:hAnsi="Times New Roman" w:cs="Times New Roman"/>
-          <w:sz w:val="24"/>
-          <w:szCs w:val="24"/>
-        </w:rPr>
-        <w:t>’</w:t>
-      </w:r>
-      <w:r>
-        <w:rPr>
-          <w:rFonts w:ascii="Times New Roman" w:eastAsia="华文宋体" w:hAnsi="Times New Roman" w:cs="Times New Roman" w:hint="eastAsia"/>
-          <w:sz w:val="24"/>
-          <w:szCs w:val="24"/>
-        </w:rPr>
-        <w:t xml:space="preserve">d known about it </w:t>
-      </w:r>
-      <w:r>
-        <w:rPr>
-          <w:rFonts w:ascii="Times New Roman" w:eastAsia="华文宋体" w:hAnsi="Times New Roman" w:cs="Times New Roman" w:hint="eastAsia"/>
-          <w:sz w:val="24"/>
-          <w:szCs w:val="24"/>
-        </w:rPr>
-        <w:t>beforehand.</w:t>
-      </w:r>
-    </w:p>
-    <w:p>
-      <w:pPr>
-        <w:rPr>
-          <w:rFonts w:ascii="Times New Roman" w:eastAsia="华文宋体" w:hAnsi="Times New Roman" w:cs="Times New Roman"/>
-          <w:sz w:val="24"/>
-          <w:szCs w:val="24"/>
-        </w:rPr>
-      </w:pPr>
-      <w:r>
-        <w:rPr>
-          <w:rFonts w:ascii="Times New Roman" w:eastAsia="华文宋体" w:hAnsi="Times New Roman" w:cs="Times New Roman" w:hint="eastAsia"/>
-          <w:b/>
-          <w:sz w:val="24"/>
-          <w:szCs w:val="24"/>
-        </w:rPr>
-        <w:t xml:space="preserve">viable </w:t>
-      </w:r>
-      <w:r>
-        <w:rPr>
-          <w:rFonts w:ascii="Times New Roman" w:eastAsia="华文宋体" w:hAnsi="Times New Roman" w:cs="Times New Roman"/>
-          <w:b/>
-          <w:sz w:val="24"/>
-          <w:szCs w:val="24"/>
-        </w:rPr>
-        <w:br/>
-      </w:r>
-      <w:r>
-        <w:rPr>
-          <w:rFonts w:ascii="Times New Roman" w:eastAsia="华文宋体" w:hAnsi="Times New Roman" w:cs="Times New Roman" w:hint="eastAsia"/>
-          <w:sz w:val="24"/>
-          <w:szCs w:val="24"/>
-        </w:rPr>
-        <w:t xml:space="preserve">[adj.] capable of developing and surviving independently. </w:t>
-      </w:r>
-      <w:r>
-        <w:rPr>
-          <w:rFonts w:ascii="Times New Roman" w:eastAsia="华文宋体" w:hAnsi="Times New Roman" w:cs="Times New Roman"/>
-          <w:sz w:val="24"/>
-          <w:szCs w:val="24"/>
-        </w:rPr>
-        <w:br/>
-      </w:r>
-      <w:r>
-        <w:rPr>
-          <w:rFonts w:ascii="Times New Roman" w:eastAsia="华文宋体" w:hAnsi="Times New Roman" w:cs="Times New Roman" w:hint="eastAsia"/>
-          <w:sz w:val="24"/>
-          <w:szCs w:val="24"/>
-        </w:rPr>
-        <w:t xml:space="preserve">to establish a viable population. </w:t>
-      </w:r>
-    </w:p>
-    <w:p>
-      <w:pPr>
-        <w:rPr>
-          <w:rFonts w:ascii="Times New Roman" w:eastAsia="华文宋体" w:hAnsi="Times New Roman" w:cs="Times New Roman"/>
-          <w:sz w:val="24"/>
-          <w:szCs w:val="24"/>
-        </w:rPr>
-      </w:pPr>
-      <w:r>
-        <w:rPr>
-          <w:rFonts w:ascii="Times New Roman" w:eastAsia="华文宋体" w:hAnsi="Times New Roman" w:cs="Times New Roman" w:hint="eastAsia"/>
-          <w:b/>
-          <w:sz w:val="24"/>
-          <w:szCs w:val="24"/>
-        </w:rPr>
-        <w:t>sufficient</w:t>
-      </w:r>
-      <w:r>
-        <w:rPr>
-          <w:rFonts w:ascii="Times New Roman" w:eastAsia="华文宋体" w:hAnsi="Times New Roman" w:cs="Times New Roman"/>
-          <w:sz w:val="24"/>
-          <w:szCs w:val="24"/>
-        </w:rPr>
-        <w:br/>
-      </w:r>
-      <w:r>
-        <w:rPr>
-          <w:rFonts w:ascii="Times New Roman" w:eastAsia="华文宋体" w:hAnsi="Times New Roman" w:cs="Times New Roman" w:hint="eastAsia"/>
-          <w:sz w:val="24"/>
-          <w:szCs w:val="24"/>
-        </w:rPr>
-        <w:t>[adj.] enough for a particular purpose.</w:t>
-      </w:r>
-      <w:r>
-        <w:rPr>
-          <w:rFonts w:ascii="Times New Roman" w:eastAsia="华文宋体" w:hAnsi="Times New Roman" w:cs="Times New Roman"/>
-          <w:sz w:val="24"/>
-          <w:szCs w:val="24"/>
-        </w:rPr>
-        <w:br/>
-      </w:r>
-      <w:r>
-        <w:rPr>
-          <w:rFonts w:ascii="Times New Roman" w:eastAsia="华文宋体" w:hAnsi="Times New Roman" w:cs="Times New Roman" w:hint="eastAsia"/>
-          <w:sz w:val="24"/>
-          <w:szCs w:val="24"/>
-        </w:rPr>
-        <w:t>e.g. a sufficient number of men and women were transported to Ireland.</w:t>
-      </w:r>
-    </w:p>
-    <w:p>
-      <w:pPr>
-        <w:rPr>
-          <w:rFonts w:ascii="Times New Roman" w:eastAsia="华文宋体" w:hAnsi="Times New Roman" w:cs="Times New Roman"/>
-          <w:sz w:val="24"/>
-          <w:szCs w:val="24"/>
-        </w:rPr>
-      </w:pPr>
-      <w:r>
-        <w:rPr>
-          <w:rFonts w:ascii="Times New Roman" w:eastAsia="华文宋体" w:hAnsi="Times New Roman" w:cs="Times New Roman" w:hint="eastAsia"/>
-          <w:b/>
-          <w:sz w:val="24"/>
-          <w:szCs w:val="24"/>
-        </w:rPr>
-        <w:t>descend</w:t>
-      </w:r>
-      <w:r>
-        <w:rPr>
-          <w:rFonts w:ascii="Times New Roman" w:eastAsia="华文宋体" w:hAnsi="Times New Roman" w:cs="Times New Roman"/>
+        <w:t>quarry</w:t>
+      </w:r>
+      <w:r>
+        <w:rPr>
+          <w:rFonts w:ascii="Times New Roman" w:eastAsia="华文宋体" w:hAnsi="Times New Roman" w:cs="Times New Roman" w:hint="eastAsia"/>
+          <w:sz w:val="24"/>
+          <w:szCs w:val="24"/>
+        </w:rPr>
+        <w:t xml:space="preserve"> /</w:t>
+      </w:r>
+      <w:r>
+        <w:rPr>
+          <w:rFonts w:ascii="GWIPA" w:eastAsia="华文宋体" w:hAnsi="GWIPA" w:cs="Times New Roman"/>
+          <w:sz w:val="24"/>
+          <w:szCs w:val="24"/>
+        </w:rPr>
+        <w:t></w:t>
+      </w:r>
+      <w:r>
+        <w:rPr>
+          <w:rFonts w:ascii="GWIPA" w:eastAsia="华文宋体" w:hAnsi="GWIPA" w:cs="Times New Roman"/>
+          <w:sz w:val="24"/>
+          <w:szCs w:val="24"/>
+        </w:rPr>
+        <w:t></w:t>
+      </w:r>
+      <w:r>
+        <w:rPr>
+          <w:rFonts w:ascii="GWIPA" w:eastAsia="华文宋体" w:hAnsi="GWIPA" w:cs="Times New Roman"/>
+          <w:sz w:val="24"/>
+          <w:szCs w:val="24"/>
+        </w:rPr>
+        <w:t></w:t>
+      </w:r>
+      <w:r>
+        <w:rPr>
+          <w:rFonts w:ascii="GWIPA" w:eastAsia="华文宋体" w:hAnsi="GWIPA" w:cs="Times New Roman"/>
+          <w:sz w:val="24"/>
+          <w:szCs w:val="24"/>
+        </w:rPr>
+        <w:t></w:t>
+      </w:r>
+      <w:r>
+        <w:rPr>
+          <w:rFonts w:ascii="GWIPA" w:eastAsia="华文宋体" w:hAnsi="GWIPA" w:cs="Times New Roman"/>
+          <w:sz w:val="24"/>
+          <w:szCs w:val="24"/>
+        </w:rPr>
+        <w:t></w:t>
+      </w:r>
+      <w:r>
+        <w:rPr>
+          <w:rFonts w:ascii="GWIPA" w:eastAsia="华文宋体" w:hAnsi="GWIPA" w:cs="Times New Roman"/>
+          <w:sz w:val="24"/>
+          <w:szCs w:val="24"/>
+        </w:rPr>
+        <w:t></w:t>
+      </w:r>
+      <w:r>
+        <w:rPr>
+          <w:rFonts w:ascii="GWIPA" w:eastAsia="华文宋体" w:hAnsi="GWIPA" w:cs="Times New Roman"/>
+          <w:sz w:val="24"/>
+          <w:szCs w:val="24"/>
+        </w:rPr>
+        <w:t></w:t>
+      </w:r>
+      <w:r>
+        <w:rPr>
+          <w:rFonts w:ascii="GWIPA" w:eastAsia="华文宋体" w:hAnsi="GWIPA" w:cs="Times New Roman"/>
+          <w:sz w:val="24"/>
+          <w:szCs w:val="24"/>
+        </w:rPr>
+        <w:br/>
+      </w:r>
+      <w:r>
+        <w:rPr>
+          <w:rFonts w:ascii="Times New Roman" w:eastAsia="华文宋体" w:hAnsi="Times New Roman" w:cs="Times New Roman" w:hint="eastAsia"/>
+          <w:sz w:val="24"/>
+          <w:szCs w:val="24"/>
+        </w:rPr>
+        <w:t>[C.] a place where large amounts of stone, etc. are dug out of the ground.</w:t>
+      </w:r>
+      <w:r>
+        <w:rPr>
+          <w:rFonts w:ascii="Times New Roman" w:eastAsia="华文宋体" w:hAnsi="Times New Roman" w:cs="Times New Roman"/>
+          <w:sz w:val="24"/>
+          <w:szCs w:val="24"/>
+        </w:rPr>
+        <w:br/>
+      </w:r>
+      <w:r>
+        <w:rPr>
+          <w:rFonts w:ascii="Times New Roman" w:eastAsia="华文宋体" w:hAnsi="Times New Roman" w:cs="Times New Roman" w:hint="eastAsia"/>
+          <w:sz w:val="24"/>
+          <w:szCs w:val="24"/>
+        </w:rPr>
+        <w:t>a slate quarry.</w:t>
+      </w:r>
+    </w:p>
+    <w:p>
+      <w:pPr>
+        <w:rPr>
+          <w:rFonts w:ascii="Times New Roman" w:eastAsia="华文宋体" w:hAnsi="Times New Roman" w:cs="Times New Roman"/>
+          <w:sz w:val="24"/>
+          <w:szCs w:val="24"/>
+        </w:rPr>
+      </w:pPr>
+      <w:r>
+        <w:rPr>
+          <w:rFonts w:ascii="Times New Roman" w:eastAsia="华文宋体" w:hAnsi="Times New Roman" w:cs="Times New Roman" w:hint="eastAsia"/>
+          <w:b/>
+          <w:sz w:val="24"/>
+          <w:szCs w:val="24"/>
+        </w:rPr>
+        <w:t>sheer</w:t>
+      </w:r>
+      <w:r>
+        <w:rPr>
+          <w:rFonts w:ascii="Times New Roman" w:eastAsia="华文宋体" w:hAnsi="Times New Roman" w:cs="Times New Roman"/>
+          <w:sz w:val="24"/>
+          <w:szCs w:val="24"/>
+        </w:rPr>
+        <w:br/>
+      </w:r>
+      <w:r>
+        <w:rPr>
+          <w:rFonts w:ascii="Times New Roman" w:eastAsia="华文宋体" w:hAnsi="Times New Roman" w:cs="Times New Roman" w:hint="eastAsia"/>
+          <w:sz w:val="24"/>
+          <w:szCs w:val="24"/>
+        </w:rPr>
+        <w:t>[adj.] used to emphasize the size, degree or amount of sth.</w:t>
+      </w:r>
+      <w:r>
+        <w:rPr>
+          <w:rFonts w:ascii="Times New Roman" w:eastAsia="华文宋体" w:hAnsi="Times New Roman" w:cs="Times New Roman" w:hint="eastAsia"/>
+          <w:sz w:val="24"/>
+          <w:szCs w:val="24"/>
+        </w:rPr>
+        <w:t xml:space="preserve"> </w:t>
+      </w:r>
+      <w:r>
+        <w:rPr>
+          <w:rFonts w:ascii="Times New Roman" w:eastAsia="华文宋体" w:hAnsi="Times New Roman" w:cs="Times New Roman" w:hint="eastAsia"/>
+          <w:sz w:val="24"/>
+          <w:szCs w:val="24"/>
+        </w:rPr>
+        <w:t>(</w:t>
+      </w:r>
+      <w:r>
+        <w:rPr>
+          <w:rFonts w:ascii="Times New Roman" w:eastAsia="华文宋体" w:hAnsi="Times New Roman" w:cs="Times New Roman" w:hint="eastAsia"/>
+          <w:sz w:val="24"/>
+          <w:szCs w:val="24"/>
+        </w:rPr>
+        <w:t>As far as I know, t</w:t>
+      </w:r>
+      <w:r>
+        <w:rPr>
+          <w:rFonts w:ascii="Times New Roman" w:eastAsia="华文宋体" w:hAnsi="Times New Roman" w:cs="Times New Roman" w:hint="eastAsia"/>
+          <w:sz w:val="24"/>
+          <w:szCs w:val="24"/>
+        </w:rPr>
+        <w:t>here is non any coordinated Chinese words to it.)</w:t>
+      </w:r>
+      <w:r>
+        <w:rPr>
+          <w:rFonts w:ascii="Times New Roman" w:eastAsia="华文宋体" w:hAnsi="Times New Roman" w:cs="Times New Roman"/>
+          <w:sz w:val="24"/>
+          <w:szCs w:val="24"/>
+        </w:rPr>
+        <w:br/>
+      </w:r>
+      <w:r>
+        <w:rPr>
+          <w:rFonts w:ascii="Times New Roman" w:eastAsia="华文宋体" w:hAnsi="Times New Roman" w:cs="Times New Roman" w:hint="eastAsia"/>
+          <w:b/>
+          <w:sz w:val="24"/>
+          <w:szCs w:val="24"/>
+        </w:rPr>
+        <w:t>sheer volume</w:t>
+      </w:r>
+      <w:r>
+        <w:rPr>
+          <w:rFonts w:ascii="Times New Roman" w:eastAsia="华文宋体" w:hAnsi="Times New Roman" w:cs="Times New Roman" w:hint="eastAsia"/>
+          <w:sz w:val="24"/>
+          <w:szCs w:val="24"/>
+        </w:rPr>
+        <w:t xml:space="preserve"> of animal</w:t>
+      </w:r>
+      <w:r>
+        <w:rPr>
+          <w:rFonts w:ascii="Times New Roman" w:eastAsia="华文宋体" w:hAnsi="Times New Roman" w:cs="Times New Roman" w:hint="eastAsia"/>
+          <w:sz w:val="24"/>
+          <w:szCs w:val="24"/>
+        </w:rPr>
+        <w:t>.</w:t>
+      </w:r>
+      <w:r>
+        <w:rPr>
+          <w:rFonts w:ascii="Times New Roman" w:eastAsia="华文宋体" w:hAnsi="Times New Roman" w:cs="Times New Roman"/>
+          <w:sz w:val="24"/>
+          <w:szCs w:val="24"/>
+        </w:rPr>
+        <w:br/>
+      </w:r>
+      <w:r>
+        <w:rPr>
+          <w:rFonts w:ascii="Times New Roman" w:eastAsia="华文宋体" w:hAnsi="Times New Roman" w:cs="Times New Roman" w:hint="eastAsia"/>
+          <w:sz w:val="24"/>
+          <w:szCs w:val="24"/>
+        </w:rPr>
+        <w:t xml:space="preserve">The area is under threat from the sheer number of tourists using it. </w:t>
+      </w:r>
+    </w:p>
+    <w:p>
+      <w:pPr>
+        <w:rPr>
+          <w:rFonts w:ascii="Times New Roman" w:eastAsia="华文宋体" w:hAnsi="Times New Roman" w:cs="Times New Roman"/>
+          <w:sz w:val="24"/>
+          <w:szCs w:val="24"/>
+        </w:rPr>
+      </w:pPr>
+      <w:r>
+        <w:rPr>
+          <w:rFonts w:ascii="Times New Roman" w:eastAsia="华文宋体" w:hAnsi="Times New Roman" w:cs="Times New Roman" w:hint="eastAsia"/>
+          <w:b/>
+          <w:sz w:val="24"/>
+          <w:szCs w:val="24"/>
+        </w:rPr>
+        <w:t xml:space="preserve">retain </w:t>
+      </w:r>
+      <w:r>
+        <w:rPr>
+          <w:rFonts w:ascii="Times New Roman" w:eastAsia="华文宋体" w:hAnsi="Times New Roman" w:cs="Times New Roman"/>
+          <w:sz w:val="24"/>
+          <w:szCs w:val="24"/>
+        </w:rPr>
+        <w:br/>
+      </w:r>
+      <w:r>
+        <w:rPr>
+          <w:rFonts w:ascii="Times New Roman" w:eastAsia="华文宋体" w:hAnsi="Times New Roman" w:cs="Times New Roman" w:hint="eastAsia"/>
+          <w:sz w:val="24"/>
+          <w:szCs w:val="24"/>
+        </w:rPr>
+        <w:t>[vt.] to keep something.</w:t>
+      </w:r>
+      <w:r>
+        <w:rPr>
+          <w:rFonts w:ascii="Times New Roman" w:eastAsia="华文宋体" w:hAnsi="Times New Roman" w:cs="Times New Roman"/>
+          <w:sz w:val="24"/>
+          <w:szCs w:val="24"/>
+        </w:rPr>
+        <w:br/>
+      </w:r>
+      <w:r>
+        <w:rPr>
+          <w:rFonts w:ascii="Times New Roman" w:eastAsia="华文宋体" w:hAnsi="Times New Roman" w:cs="Times New Roman" w:hint="eastAsia"/>
+          <w:sz w:val="24"/>
+          <w:szCs w:val="24"/>
+        </w:rPr>
+        <w:t xml:space="preserve">This would have helped the pots to retain water. </w:t>
+      </w:r>
+    </w:p>
+    <w:p>
+      <w:pPr>
+        <w:rPr>
+          <w:rFonts w:ascii="Times New Roman" w:eastAsia="华文宋体" w:hAnsi="Times New Roman" w:cs="Times New Roman"/>
+          <w:sz w:val="24"/>
+          <w:szCs w:val="24"/>
+        </w:rPr>
+      </w:pPr>
+      <w:r>
+        <w:rPr>
+          <w:rFonts w:ascii="Times New Roman" w:eastAsia="华文宋体" w:hAnsi="Times New Roman" w:cs="Times New Roman" w:hint="eastAsia"/>
+          <w:b/>
+          <w:sz w:val="24"/>
+          <w:szCs w:val="24"/>
+        </w:rPr>
+        <w:t xml:space="preserve">glaze </w:t>
+      </w:r>
+      <w:r>
+        <w:rPr>
+          <w:rFonts w:ascii="Times New Roman" w:eastAsia="华文宋体" w:hAnsi="Times New Roman" w:cs="Times New Roman"/>
+          <w:b/>
           <w:sz w:val="24"/>
           <w:szCs w:val="24"/>
         </w:rPr>
@@ -5957,638 +6888,6 @@
           <w:sz w:val="24"/>
           <w:szCs w:val="24"/>
         </w:rPr>
-        <w:t xml:space="preserve">be a blood relative of </w:t>
-      </w:r>
-    </w:p>
-    <w:p>
-      <w:pPr>
-        <w:rPr>
-          <w:rFonts w:ascii="Times New Roman" w:eastAsia="华文宋体" w:hAnsi="Times New Roman" w:cs="Times New Roman"/>
-          <w:sz w:val="24"/>
-          <w:szCs w:val="24"/>
-        </w:rPr>
-      </w:pPr>
-      <w:r>
-        <w:rPr>
-          <w:rFonts w:ascii="Times New Roman" w:eastAsia="华文宋体" w:hAnsi="Times New Roman" w:cs="Times New Roman" w:hint="eastAsia"/>
-          <w:b/>
-          <w:sz w:val="24"/>
-          <w:szCs w:val="24"/>
-        </w:rPr>
-        <w:t>plough</w:t>
-      </w:r>
-      <w:r>
-        <w:rPr>
-          <w:rFonts w:ascii="Times New Roman" w:eastAsia="华文宋体" w:hAnsi="Times New Roman" w:cs="Times New Roman" w:hint="eastAsia"/>
-          <w:sz w:val="24"/>
-          <w:szCs w:val="24"/>
-        </w:rPr>
-        <w:t xml:space="preserve"> /</w:t>
-      </w:r>
-      <w:r>
-        <w:rPr>
-          <w:rFonts w:ascii="GWIPA" w:eastAsia="华文宋体" w:hAnsi="GWIPA" w:cs="Times New Roman"/>
-          <w:sz w:val="24"/>
-          <w:szCs w:val="24"/>
-        </w:rPr>
-        <w:t></w:t>
-      </w:r>
-      <w:r>
-        <w:rPr>
-          <w:rFonts w:ascii="GWIPA" w:eastAsia="华文宋体" w:hAnsi="GWIPA" w:cs="Times New Roman"/>
-          <w:sz w:val="24"/>
-          <w:szCs w:val="24"/>
-        </w:rPr>
-        <w:t></w:t>
-      </w:r>
-      <w:r>
-        <w:rPr>
-          <w:rFonts w:ascii="GWIPA" w:eastAsia="华文宋体" w:hAnsi="GWIPA" w:cs="Times New Roman"/>
-          <w:sz w:val="24"/>
-          <w:szCs w:val="24"/>
-        </w:rPr>
-        <w:t></w:t>
-      </w:r>
-      <w:r>
-        <w:rPr>
-          <w:rFonts w:ascii="GWIPA" w:eastAsia="华文宋体" w:hAnsi="GWIPA" w:cs="Times New Roman"/>
-          <w:sz w:val="24"/>
-          <w:szCs w:val="24"/>
-        </w:rPr>
-        <w:t></w:t>
-      </w:r>
-      <w:r>
-        <w:rPr>
-          <w:rFonts w:ascii="Times New Roman" w:eastAsia="华文宋体" w:hAnsi="Times New Roman" w:cs="Times New Roman" w:hint="eastAsia"/>
-          <w:sz w:val="24"/>
-          <w:szCs w:val="24"/>
-        </w:rPr>
-        <w:t>/</w:t>
-      </w:r>
-      <w:r>
-        <w:rPr>
-          <w:rFonts w:ascii="Times New Roman" w:eastAsia="华文宋体" w:hAnsi="Times New Roman" w:cs="Times New Roman"/>
-          <w:sz w:val="24"/>
-          <w:szCs w:val="24"/>
-        </w:rPr>
-        <w:br/>
-      </w:r>
-      <w:r>
-        <w:rPr>
-          <w:rFonts w:ascii="Times New Roman" w:eastAsia="华文宋体" w:hAnsi="Times New Roman" w:cs="Times New Roman" w:hint="eastAsia"/>
-          <w:sz w:val="24"/>
-          <w:szCs w:val="24"/>
-        </w:rPr>
-        <w:t xml:space="preserve">[n.] a large piece of farming equipment with one or serval curved blades to dig and trun over soil. </w:t>
-      </w:r>
-      <w:r>
-        <w:rPr>
-          <w:rFonts w:ascii="Times New Roman" w:eastAsia="华文宋体" w:hAnsi="Times New Roman" w:cs="Times New Roman"/>
-          <w:sz w:val="24"/>
-          <w:szCs w:val="24"/>
-        </w:rPr>
-        <w:br/>
-      </w:r>
-      <w:r>
-        <w:rPr>
-          <w:rFonts w:ascii="Times New Roman" w:eastAsia="华文宋体" w:hAnsi="Times New Roman" w:cs="Times New Roman" w:hint="eastAsia"/>
-          <w:sz w:val="24"/>
-          <w:szCs w:val="24"/>
-        </w:rPr>
-        <w:t>[vt.vi.] to dig and trun over a field or other area of land with a plough.</w:t>
-      </w:r>
-    </w:p>
-    <w:p>
-      <w:pPr>
-        <w:rPr>
-          <w:rFonts w:ascii="Times New Roman" w:eastAsia="华文宋体" w:hAnsi="Times New Roman" w:cs="Times New Roman"/>
-          <w:sz w:val="24"/>
-          <w:szCs w:val="24"/>
-        </w:rPr>
-      </w:pPr>
-      <w:r>
-        <w:rPr>
-          <w:rFonts w:ascii="Times New Roman" w:eastAsia="华文宋体" w:hAnsi="Times New Roman" w:cs="Times New Roman" w:hint="eastAsia"/>
-          <w:b/>
-          <w:sz w:val="24"/>
-          <w:szCs w:val="24"/>
-        </w:rPr>
-        <w:t>excavation</w:t>
-      </w:r>
-      <w:r>
-        <w:rPr>
-          <w:rFonts w:ascii="Times New Roman" w:eastAsia="华文宋体" w:hAnsi="Times New Roman" w:cs="Times New Roman" w:hint="eastAsia"/>
-          <w:sz w:val="24"/>
-          <w:szCs w:val="24"/>
-        </w:rPr>
-        <w:t xml:space="preserve"> /</w:t>
-      </w:r>
-      <w:r>
-        <w:rPr>
-          <w:rFonts w:ascii="GWIPA" w:eastAsia="华文宋体" w:hAnsi="GWIPA" w:cs="Times New Roman"/>
-          <w:sz w:val="24"/>
-          <w:szCs w:val="24"/>
-        </w:rPr>
-        <w:t></w:t>
-      </w:r>
-      <w:r>
-        <w:rPr>
-          <w:rFonts w:ascii="GWIPA" w:eastAsia="华文宋体" w:hAnsi="GWIPA" w:cs="Times New Roman"/>
-          <w:sz w:val="24"/>
-          <w:szCs w:val="24"/>
-        </w:rPr>
-        <w:t></w:t>
-      </w:r>
-      <w:r>
-        <w:rPr>
-          <w:rFonts w:ascii="GWIPA" w:eastAsia="华文宋体" w:hAnsi="GWIPA" w:cs="Times New Roman"/>
-          <w:sz w:val="24"/>
-          <w:szCs w:val="24"/>
-        </w:rPr>
-        <w:t></w:t>
-      </w:r>
-      <w:r>
-        <w:rPr>
-          <w:rFonts w:ascii="GWIPA" w:eastAsia="华文宋体" w:hAnsi="GWIPA" w:cs="Times New Roman"/>
-          <w:sz w:val="24"/>
-          <w:szCs w:val="24"/>
-        </w:rPr>
-        <w:t></w:t>
-      </w:r>
-      <w:r>
-        <w:rPr>
-          <w:rFonts w:ascii="GWIPA" w:eastAsia="华文宋体" w:hAnsi="GWIPA" w:cs="Times New Roman"/>
-          <w:sz w:val="24"/>
-          <w:szCs w:val="24"/>
-        </w:rPr>
-        <w:t></w:t>
-      </w:r>
-      <w:r>
-        <w:rPr>
-          <w:rFonts w:ascii="GWIPA" w:eastAsia="华文宋体" w:hAnsi="GWIPA" w:cs="Times New Roman"/>
-          <w:sz w:val="24"/>
-          <w:szCs w:val="24"/>
-        </w:rPr>
-        <w:t></w:t>
-      </w:r>
-      <w:r>
-        <w:rPr>
-          <w:rFonts w:ascii="GWIPA" w:eastAsia="华文宋体" w:hAnsi="GWIPA" w:cs="Times New Roman"/>
-          <w:sz w:val="24"/>
-          <w:szCs w:val="24"/>
-        </w:rPr>
-        <w:t></w:t>
-      </w:r>
-      <w:r>
-        <w:rPr>
-          <w:rFonts w:ascii="GWIPA" w:eastAsia="华文宋体" w:hAnsi="GWIPA" w:cs="Times New Roman"/>
-          <w:sz w:val="24"/>
-          <w:szCs w:val="24"/>
-        </w:rPr>
-        <w:t></w:t>
-      </w:r>
-      <w:r>
-        <w:rPr>
-          <w:rFonts w:ascii="GWIPA" w:eastAsia="华文宋体" w:hAnsi="GWIPA" w:cs="Times New Roman"/>
-          <w:sz w:val="24"/>
-          <w:szCs w:val="24"/>
-        </w:rPr>
-        <w:t></w:t>
-      </w:r>
-      <w:r>
-        <w:rPr>
-          <w:rFonts w:ascii="GWIPA" w:eastAsia="华文宋体" w:hAnsi="GWIPA" w:cs="Times New Roman"/>
-          <w:sz w:val="24"/>
-          <w:szCs w:val="24"/>
-        </w:rPr>
-        <w:t></w:t>
-      </w:r>
-      <w:r>
-        <w:rPr>
-          <w:rFonts w:ascii="GWIPA" w:eastAsia="华文宋体" w:hAnsi="GWIPA" w:cs="Times New Roman"/>
-          <w:sz w:val="24"/>
-          <w:szCs w:val="24"/>
-        </w:rPr>
-        <w:t></w:t>
-      </w:r>
-      <w:r>
-        <w:rPr>
-          <w:rFonts w:ascii="GWIPA" w:eastAsia="华文宋体" w:hAnsi="GWIPA" w:cs="Times New Roman"/>
-          <w:sz w:val="24"/>
-          <w:szCs w:val="24"/>
-        </w:rPr>
-        <w:t></w:t>
-      </w:r>
-      <w:r>
-        <w:rPr>
-          <w:rFonts w:ascii="Times New Roman" w:eastAsia="华文宋体" w:hAnsi="Times New Roman" w:cs="Times New Roman" w:hint="eastAsia"/>
-          <w:sz w:val="24"/>
-          <w:szCs w:val="24"/>
-        </w:rPr>
-        <w:t>/</w:t>
-      </w:r>
-      <w:r>
-        <w:rPr>
-          <w:rFonts w:ascii="Times New Roman" w:eastAsia="华文宋体" w:hAnsi="Times New Roman" w:cs="Times New Roman"/>
-          <w:sz w:val="24"/>
-          <w:szCs w:val="24"/>
-        </w:rPr>
-        <w:br/>
-      </w:r>
-      <w:r>
-        <w:rPr>
-          <w:rFonts w:ascii="Times New Roman" w:eastAsia="华文宋体" w:hAnsi="Times New Roman" w:cs="Times New Roman" w:hint="eastAsia"/>
-          <w:sz w:val="24"/>
-          <w:szCs w:val="24"/>
-        </w:rPr>
-        <w:t>[n.] the activity of diggin</w:t>
-      </w:r>
-      <w:r>
-        <w:rPr>
-          <w:rFonts w:ascii="Times New Roman" w:eastAsia="华文宋体" w:hAnsi="Times New Roman" w:cs="Times New Roman" w:hint="eastAsia"/>
-          <w:sz w:val="24"/>
-          <w:szCs w:val="24"/>
-        </w:rPr>
-        <w:t>g</w:t>
-      </w:r>
-      <w:r>
-        <w:rPr>
-          <w:rFonts w:ascii="Times New Roman" w:eastAsia="华文宋体" w:hAnsi="Times New Roman" w:cs="Times New Roman" w:hint="eastAsia"/>
-          <w:sz w:val="24"/>
-          <w:szCs w:val="24"/>
-        </w:rPr>
-        <w:t xml:space="preserve"> in the ground to look for old buildings or objects that have been buried for a long time.</w:t>
-      </w:r>
-    </w:p>
-    <w:p>
-      <w:pPr>
-        <w:rPr>
-          <w:rFonts w:ascii="Times New Roman" w:eastAsia="华文宋体" w:hAnsi="Times New Roman" w:cs="Times New Roman"/>
-          <w:sz w:val="24"/>
-          <w:szCs w:val="24"/>
-        </w:rPr>
-      </w:pPr>
-      <w:r>
-        <w:rPr>
-          <w:rFonts w:ascii="Times New Roman" w:eastAsia="华文宋体" w:hAnsi="Times New Roman" w:cs="Times New Roman" w:hint="eastAsia"/>
-          <w:b/>
-          <w:sz w:val="24"/>
-          <w:szCs w:val="24"/>
-        </w:rPr>
-        <w:t xml:space="preserve">husbandry </w:t>
-      </w:r>
-      <w:r>
-        <w:rPr>
-          <w:rFonts w:ascii="Times New Roman" w:eastAsia="华文宋体" w:hAnsi="Times New Roman" w:cs="Times New Roman"/>
-          <w:sz w:val="24"/>
-          <w:szCs w:val="24"/>
-        </w:rPr>
-        <w:br/>
-      </w:r>
-      <w:r>
-        <w:rPr>
-          <w:rFonts w:ascii="Times New Roman" w:eastAsia="华文宋体" w:hAnsi="Times New Roman" w:cs="Times New Roman" w:hint="eastAsia"/>
-          <w:sz w:val="24"/>
-          <w:szCs w:val="24"/>
-        </w:rPr>
-        <w:t>[n.] farming, especially when done carefully and well.</w:t>
-      </w:r>
-      <w:r>
-        <w:rPr>
-          <w:rFonts w:ascii="Times New Roman" w:eastAsia="华文宋体" w:hAnsi="Times New Roman" w:cs="Times New Roman"/>
-          <w:sz w:val="24"/>
-          <w:szCs w:val="24"/>
-        </w:rPr>
-        <w:br/>
-      </w:r>
-      <w:r>
-        <w:rPr>
-          <w:rFonts w:ascii="Times New Roman" w:eastAsia="华文宋体" w:hAnsi="Times New Roman" w:cs="Times New Roman" w:hint="eastAsia"/>
-          <w:sz w:val="24"/>
-          <w:szCs w:val="24"/>
-        </w:rPr>
-        <w:t>animal/crop husbandry.</w:t>
-      </w:r>
-    </w:p>
-    <w:p>
-      <w:pPr>
-        <w:rPr>
-          <w:rFonts w:ascii="Times New Roman" w:eastAsia="华文宋体" w:hAnsi="Times New Roman" w:cs="Times New Roman"/>
-          <w:sz w:val="24"/>
-          <w:szCs w:val="24"/>
-        </w:rPr>
-      </w:pPr>
-      <w:r>
-        <w:rPr>
-          <w:rFonts w:ascii="Times New Roman" w:eastAsia="华文宋体" w:hAnsi="Times New Roman" w:cs="Times New Roman" w:hint="eastAsia"/>
-          <w:b/>
-          <w:sz w:val="24"/>
-          <w:szCs w:val="24"/>
-        </w:rPr>
-        <w:t>quarry</w:t>
-      </w:r>
-      <w:r>
-        <w:rPr>
-          <w:rFonts w:ascii="Times New Roman" w:eastAsia="华文宋体" w:hAnsi="Times New Roman" w:cs="Times New Roman" w:hint="eastAsia"/>
-          <w:sz w:val="24"/>
-          <w:szCs w:val="24"/>
-        </w:rPr>
-        <w:t xml:space="preserve"> /</w:t>
-      </w:r>
-      <w:r>
-        <w:rPr>
-          <w:rFonts w:ascii="GWIPA" w:eastAsia="华文宋体" w:hAnsi="GWIPA" w:cs="Times New Roman"/>
-          <w:sz w:val="24"/>
-          <w:szCs w:val="24"/>
-        </w:rPr>
-        <w:t></w:t>
-      </w:r>
-      <w:r>
-        <w:rPr>
-          <w:rFonts w:ascii="GWIPA" w:eastAsia="华文宋体" w:hAnsi="GWIPA" w:cs="Times New Roman"/>
-          <w:sz w:val="24"/>
-          <w:szCs w:val="24"/>
-        </w:rPr>
-        <w:t></w:t>
-      </w:r>
-      <w:r>
-        <w:rPr>
-          <w:rFonts w:ascii="GWIPA" w:eastAsia="华文宋体" w:hAnsi="GWIPA" w:cs="Times New Roman"/>
-          <w:sz w:val="24"/>
-          <w:szCs w:val="24"/>
-        </w:rPr>
-        <w:t></w:t>
-      </w:r>
-      <w:r>
-        <w:rPr>
-          <w:rFonts w:ascii="GWIPA" w:eastAsia="华文宋体" w:hAnsi="GWIPA" w:cs="Times New Roman"/>
-          <w:sz w:val="24"/>
-          <w:szCs w:val="24"/>
-        </w:rPr>
-        <w:t></w:t>
-      </w:r>
-      <w:r>
-        <w:rPr>
-          <w:rFonts w:ascii="GWIPA" w:eastAsia="华文宋体" w:hAnsi="GWIPA" w:cs="Times New Roman"/>
-          <w:sz w:val="24"/>
-          <w:szCs w:val="24"/>
-        </w:rPr>
-        <w:t></w:t>
-      </w:r>
-      <w:r>
-        <w:rPr>
-          <w:rFonts w:ascii="GWIPA" w:eastAsia="华文宋体" w:hAnsi="GWIPA" w:cs="Times New Roman"/>
-          <w:sz w:val="24"/>
-          <w:szCs w:val="24"/>
-        </w:rPr>
-        <w:t></w:t>
-      </w:r>
-      <w:r>
-        <w:rPr>
-          <w:rFonts w:ascii="GWIPA" w:eastAsia="华文宋体" w:hAnsi="GWIPA" w:cs="Times New Roman"/>
-          <w:sz w:val="24"/>
-          <w:szCs w:val="24"/>
-        </w:rPr>
-        <w:t></w:t>
-      </w:r>
-      <w:r>
-        <w:rPr>
-          <w:rFonts w:ascii="GWIPA" w:eastAsia="华文宋体" w:hAnsi="GWIPA" w:cs="Times New Roman"/>
-          <w:sz w:val="24"/>
-          <w:szCs w:val="24"/>
-        </w:rPr>
-        <w:br/>
-      </w:r>
-      <w:r>
-        <w:rPr>
-          <w:rFonts w:ascii="Times New Roman" w:eastAsia="华文宋体" w:hAnsi="Times New Roman" w:cs="Times New Roman" w:hint="eastAsia"/>
-          <w:sz w:val="24"/>
-          <w:szCs w:val="24"/>
-        </w:rPr>
-        <w:t>[C.] a place where large amounts of stone, etc. are dug out of the ground.</w:t>
-      </w:r>
-      <w:r>
-        <w:rPr>
-          <w:rFonts w:ascii="Times New Roman" w:eastAsia="华文宋体" w:hAnsi="Times New Roman" w:cs="Times New Roman"/>
-          <w:sz w:val="24"/>
-          <w:szCs w:val="24"/>
-        </w:rPr>
-        <w:br/>
-      </w:r>
-      <w:r>
-        <w:rPr>
-          <w:rFonts w:ascii="Times New Roman" w:eastAsia="华文宋体" w:hAnsi="Times New Roman" w:cs="Times New Roman" w:hint="eastAsia"/>
-          <w:sz w:val="24"/>
-          <w:szCs w:val="24"/>
-        </w:rPr>
-        <w:t>a slate quarry.</w:t>
-      </w:r>
-    </w:p>
-    <w:p>
-      <w:pPr>
-        <w:rPr>
-          <w:rFonts w:ascii="Times New Roman" w:eastAsia="华文宋体" w:hAnsi="Times New Roman" w:cs="Times New Roman"/>
-          <w:sz w:val="24"/>
-          <w:szCs w:val="24"/>
-        </w:rPr>
-      </w:pPr>
-      <w:r>
-        <w:rPr>
-          <w:rFonts w:ascii="Times New Roman" w:eastAsia="华文宋体" w:hAnsi="Times New Roman" w:cs="Times New Roman" w:hint="eastAsia"/>
-          <w:b/>
-          <w:sz w:val="24"/>
-          <w:szCs w:val="24"/>
-        </w:rPr>
-        <w:t>sheer</w:t>
-      </w:r>
-      <w:r>
-        <w:rPr>
-          <w:rFonts w:ascii="Times New Roman" w:eastAsia="华文宋体" w:hAnsi="Times New Roman" w:cs="Times New Roman"/>
-          <w:sz w:val="24"/>
-          <w:szCs w:val="24"/>
-        </w:rPr>
-        <w:br/>
-      </w:r>
-      <w:r>
-        <w:rPr>
-          <w:rFonts w:ascii="Times New Roman" w:eastAsia="华文宋体" w:hAnsi="Times New Roman" w:cs="Times New Roman" w:hint="eastAsia"/>
-          <w:sz w:val="24"/>
-          <w:szCs w:val="24"/>
-        </w:rPr>
-        <w:t>[adj.] used to emphasize the size, degree or amount of sth.</w:t>
-      </w:r>
-      <w:r>
-        <w:rPr>
-          <w:rFonts w:ascii="Times New Roman" w:eastAsia="华文宋体" w:hAnsi="Times New Roman" w:cs="Times New Roman" w:hint="eastAsia"/>
-          <w:sz w:val="24"/>
-          <w:szCs w:val="24"/>
-        </w:rPr>
-        <w:t xml:space="preserve"> </w:t>
-      </w:r>
-      <w:r>
-        <w:rPr>
-          <w:rFonts w:ascii="Times New Roman" w:eastAsia="华文宋体" w:hAnsi="Times New Roman" w:cs="Times New Roman" w:hint="eastAsia"/>
-          <w:sz w:val="24"/>
-          <w:szCs w:val="24"/>
-        </w:rPr>
-        <w:t>(</w:t>
-      </w:r>
-      <w:r>
-        <w:rPr>
-          <w:rFonts w:ascii="Times New Roman" w:eastAsia="华文宋体" w:hAnsi="Times New Roman" w:cs="Times New Roman" w:hint="eastAsia"/>
-          <w:sz w:val="24"/>
-          <w:szCs w:val="24"/>
-        </w:rPr>
-        <w:t>As far as I know, t</w:t>
-      </w:r>
-      <w:r>
-        <w:rPr>
-          <w:rFonts w:ascii="Times New Roman" w:eastAsia="华文宋体" w:hAnsi="Times New Roman" w:cs="Times New Roman" w:hint="eastAsia"/>
-          <w:sz w:val="24"/>
-          <w:szCs w:val="24"/>
-        </w:rPr>
-        <w:t>here is non any coordinated Chinese words to it.)</w:t>
-      </w:r>
-      <w:r>
-        <w:rPr>
-          <w:rFonts w:ascii="Times New Roman" w:eastAsia="华文宋体" w:hAnsi="Times New Roman" w:cs="Times New Roman"/>
-          <w:sz w:val="24"/>
-          <w:szCs w:val="24"/>
-        </w:rPr>
-        <w:br/>
-      </w:r>
-      <w:r>
-        <w:rPr>
-          <w:rFonts w:ascii="Times New Roman" w:eastAsia="华文宋体" w:hAnsi="Times New Roman" w:cs="Times New Roman" w:hint="eastAsia"/>
-          <w:b/>
-          <w:sz w:val="24"/>
-          <w:szCs w:val="24"/>
-        </w:rPr>
-        <w:t>sheer volume</w:t>
-      </w:r>
-      <w:r>
-        <w:rPr>
-          <w:rFonts w:ascii="Times New Roman" w:eastAsia="华文宋体" w:hAnsi="Times New Roman" w:cs="Times New Roman" w:hint="eastAsia"/>
-          <w:sz w:val="24"/>
-          <w:szCs w:val="24"/>
-        </w:rPr>
-        <w:t xml:space="preserve"> of animal</w:t>
-      </w:r>
-      <w:r>
-        <w:rPr>
-          <w:rFonts w:ascii="Times New Roman" w:eastAsia="华文宋体" w:hAnsi="Times New Roman" w:cs="Times New Roman" w:hint="eastAsia"/>
-          <w:sz w:val="24"/>
-          <w:szCs w:val="24"/>
-        </w:rPr>
-        <w:t>.</w:t>
-      </w:r>
-      <w:r>
-        <w:rPr>
-          <w:rFonts w:ascii="Times New Roman" w:eastAsia="华文宋体" w:hAnsi="Times New Roman" w:cs="Times New Roman"/>
-          <w:sz w:val="24"/>
-          <w:szCs w:val="24"/>
-        </w:rPr>
-        <w:br/>
-      </w:r>
-      <w:r>
-        <w:rPr>
-          <w:rFonts w:ascii="Times New Roman" w:eastAsia="华文宋体" w:hAnsi="Times New Roman" w:cs="Times New Roman" w:hint="eastAsia"/>
-          <w:sz w:val="24"/>
-          <w:szCs w:val="24"/>
-        </w:rPr>
-        <w:t xml:space="preserve">The area is under threat from the sheer number of tourists using it. </w:t>
-      </w:r>
-    </w:p>
-    <w:p>
-      <w:pPr>
-        <w:rPr>
-          <w:rFonts w:ascii="Times New Roman" w:eastAsia="华文宋体" w:hAnsi="Times New Roman" w:cs="Times New Roman"/>
-          <w:sz w:val="24"/>
-          <w:szCs w:val="24"/>
-        </w:rPr>
-      </w:pPr>
-      <w:r>
-        <w:rPr>
-          <w:rFonts w:ascii="Times New Roman" w:eastAsia="华文宋体" w:hAnsi="Times New Roman" w:cs="Times New Roman" w:hint="eastAsia"/>
-          <w:b/>
-          <w:sz w:val="24"/>
-          <w:szCs w:val="24"/>
-        </w:rPr>
-        <w:t xml:space="preserve">retain </w:t>
-      </w:r>
-      <w:r>
-        <w:rPr>
-          <w:rFonts w:ascii="Times New Roman" w:eastAsia="华文宋体" w:hAnsi="Times New Roman" w:cs="Times New Roman"/>
-          <w:sz w:val="24"/>
-          <w:szCs w:val="24"/>
-        </w:rPr>
-        <w:br/>
-      </w:r>
-      <w:r>
-        <w:rPr>
-          <w:rFonts w:ascii="Times New Roman" w:eastAsia="华文宋体" w:hAnsi="Times New Roman" w:cs="Times New Roman" w:hint="eastAsia"/>
-          <w:sz w:val="24"/>
-          <w:szCs w:val="24"/>
-        </w:rPr>
-        <w:t>[vt.] to keep something.</w:t>
-      </w:r>
-      <w:r>
-        <w:rPr>
-          <w:rFonts w:ascii="Times New Roman" w:eastAsia="华文宋体" w:hAnsi="Times New Roman" w:cs="Times New Roman"/>
-          <w:sz w:val="24"/>
-          <w:szCs w:val="24"/>
-        </w:rPr>
-        <w:br/>
-      </w:r>
-      <w:r>
-        <w:rPr>
-          <w:rFonts w:ascii="Times New Roman" w:eastAsia="华文宋体" w:hAnsi="Times New Roman" w:cs="Times New Roman" w:hint="eastAsia"/>
-          <w:sz w:val="24"/>
-          <w:szCs w:val="24"/>
-        </w:rPr>
-        <w:t xml:space="preserve">This would have helped the pots to retain water. </w:t>
-      </w:r>
-    </w:p>
-    <w:p>
-      <w:pPr>
-        <w:rPr>
-          <w:rFonts w:ascii="Times New Roman" w:eastAsia="华文宋体" w:hAnsi="Times New Roman" w:cs="Times New Roman"/>
-          <w:sz w:val="24"/>
-          <w:szCs w:val="24"/>
-        </w:rPr>
-      </w:pPr>
-      <w:r>
-        <w:rPr>
-          <w:rFonts w:ascii="Times New Roman" w:eastAsia="华文宋体" w:hAnsi="Times New Roman" w:cs="Times New Roman" w:hint="eastAsia"/>
-          <w:b/>
-          <w:sz w:val="24"/>
-          <w:szCs w:val="24"/>
-        </w:rPr>
-        <w:t xml:space="preserve">glaze </w:t>
-      </w:r>
-      <w:r>
-        <w:rPr>
-          <w:rFonts w:ascii="Times New Roman" w:eastAsia="华文宋体" w:hAnsi="Times New Roman" w:cs="Times New Roman"/>
-          <w:b/>
-          <w:sz w:val="24"/>
-          <w:szCs w:val="24"/>
-        </w:rPr>
-        <w:br/>
-      </w:r>
-      <w:r>
-        <w:rPr>
-          <w:rFonts w:ascii="Times New Roman" w:eastAsia="华文宋体" w:hAnsi="Times New Roman" w:cs="Times New Roman" w:hint="eastAsia"/>
-          <w:sz w:val="24"/>
-          <w:szCs w:val="24"/>
-        </w:rPr>
-        <w:t xml:space="preserve">[vt.] </w:t>
-      </w:r>
-      <w:r>
-        <w:rPr>
-          <w:rFonts w:ascii="Times New Roman" w:eastAsia="华文宋体" w:hAnsi="Times New Roman" w:cs="Times New Roman" w:hint="eastAsia"/>
-          <w:sz w:val="24"/>
-          <w:szCs w:val="24"/>
-        </w:rPr>
         <w:t>上釉；上光</w:t>
       </w:r>
     </w:p>
@@ -6607,7 +6906,6 @@
           <w:sz w:val="24"/>
           <w:szCs w:val="24"/>
         </w:rPr>
-        <w:lastRenderedPageBreak/>
         <w:t xml:space="preserve">stitch </w:t>
       </w:r>
       <w:r>
@@ -6998,6 +7296,7 @@
           <w:sz w:val="24"/>
           <w:szCs w:val="24"/>
         </w:rPr>
+        <w:lastRenderedPageBreak/>
         <w:t>sanctuary</w:t>
       </w:r>
       <w:r>
@@ -8027,7 +8326,7 @@
   <a:extraClrSchemeLst/>
   <a:extLst>
     <a:ext uri="{05A4C25C-085E-4340-85A3-A5531E510DB2}">
-      <thm15:themeFamily xmlns:thm15="http://schemas.microsoft.com/office/thememl/2012/main" xmlns="" name="Office Theme" id="{62F939B6-93AF-4DB8-9C6B-D6C7DFDC589F}" vid="{4A3C46E8-61CC-4603-A589-7422A47A8E4A}"/>
+      <thm15:themeFamily xmlns="" xmlns:thm15="http://schemas.microsoft.com/office/thememl/2012/main" name="Office Theme" id="{62F939B6-93AF-4DB8-9C6B-D6C7DFDC589F}" vid="{4A3C46E8-61CC-4603-A589-7422A47A8E4A}"/>
     </a:ext>
   </a:extLst>
 </a:theme>

</xml_diff>

<commit_message>
add new words to IETLS
</commit_message>
<xml_diff>
--- a/IELTS Notes/Vocabulary of IELTS Test/Vocabulary of Listening Test.docx
+++ b/IELTS Notes/Vocabulary of IELTS Test/Vocabulary of Listening Test.docx
@@ -59,8 +59,9 @@
     </w:p>
     <w:p>
       <w:pPr>
-        <w:rPr>
-          <w:rFonts w:ascii="Times New Roman" w:hAnsi="Times New Roman" w:cs="Times New Roman" w:hint="eastAsia"/>
+        <w:outlineLvl w:val="2"/>
+        <w:rPr>
+          <w:rFonts w:ascii="Times New Roman" w:hAnsi="Times New Roman" w:cs="Times New Roman"/>
           <w:b/>
           <w:bCs/>
           <w:i/>
@@ -132,7 +133,7 @@
     <w:p>
       <w:pPr>
         <w:rPr>
-          <w:rFonts w:ascii="Times New Roman" w:hAnsi="Times New Roman" w:cs="Times New Roman" w:hint="eastAsia"/>
+          <w:rFonts w:ascii="Times New Roman" w:hAnsi="Times New Roman" w:cs="Times New Roman"/>
           <w:sz w:val="24"/>
           <w:szCs w:val="24"/>
         </w:rPr>
@@ -157,7 +158,6 @@
         </w:rPr>
         <w:t xml:space="preserve"> </w:t>
       </w:r>
-      <w:bookmarkStart w:id="0" w:name="_GoBack"/>
       <w:r>
         <w:rPr>
           <w:rFonts w:ascii="Times New Roman" w:hAnsi="Times New Roman" w:cs="Times New Roman" w:hint="eastAsia"/>
@@ -266,7 +266,6 @@
         </w:rPr>
         <w:t></w:t>
       </w:r>
-      <w:bookmarkEnd w:id="0"/>
       <w:r>
         <w:rPr>
           <w:rFonts w:ascii="Times New Roman" w:hAnsi="Times New Roman" w:cs="Times New Roman" w:hint="eastAsia"/>
@@ -467,7 +466,199 @@
           <w:sz w:val="24"/>
           <w:szCs w:val="24"/>
         </w:rPr>
-        <w:t>[n</w:t>
+        <w:t>[C.] a written record of money that owed to a business and of money that has paid by it.</w:t>
+      </w:r>
+      <w:r>
+        <w:rPr>
+          <w:rFonts w:ascii="Times New Roman" w:hAnsi="Times New Roman" w:cs="Times New Roman"/>
+          <w:sz w:val="24"/>
+          <w:szCs w:val="24"/>
+        </w:rPr>
+        <w:br/>
+      </w:r>
+      <w:r>
+        <w:rPr>
+          <w:rFonts w:ascii="Times New Roman" w:hAnsi="Times New Roman" w:cs="Times New Roman" w:hint="eastAsia"/>
+          <w:sz w:val="24"/>
+          <w:szCs w:val="24"/>
+        </w:rPr>
+        <w:t>e.g. to keep the accounts up to date.</w:t>
+      </w:r>
+      <w:r>
+        <w:rPr>
+          <w:rFonts w:ascii="Times New Roman" w:hAnsi="Times New Roman" w:cs="Times New Roman"/>
+          <w:sz w:val="24"/>
+          <w:szCs w:val="24"/>
+        </w:rPr>
+        <w:br/>
+      </w:r>
+      <w:r>
+        <w:rPr>
+          <w:rFonts w:ascii="Times New Roman" w:hAnsi="Times New Roman" w:cs="Times New Roman" w:hint="eastAsia"/>
+          <w:sz w:val="24"/>
+          <w:szCs w:val="24"/>
+        </w:rPr>
+        <w:t>She gave the police a full account of the incident.</w:t>
+      </w:r>
+    </w:p>
+    <w:p>
+      <w:pPr>
+        <w:rPr>
+          <w:rFonts w:ascii="Times New Roman" w:hAnsi="Times New Roman" w:cs="Times New Roman"/>
+          <w:sz w:val="24"/>
+          <w:szCs w:val="24"/>
+        </w:rPr>
+      </w:pPr>
+      <w:r>
+        <w:rPr>
+          <w:rFonts w:ascii="Times New Roman" w:hAnsi="Times New Roman" w:cs="Times New Roman" w:hint="eastAsia"/>
+          <w:b/>
+          <w:sz w:val="24"/>
+          <w:szCs w:val="24"/>
+        </w:rPr>
+        <w:t>roam</w:t>
+      </w:r>
+      <w:r>
+        <w:rPr>
+          <w:rFonts w:ascii="Times New Roman" w:hAnsi="Times New Roman" w:cs="Times New Roman"/>
+          <w:sz w:val="24"/>
+          <w:szCs w:val="24"/>
+        </w:rPr>
+        <w:br/>
+      </w:r>
+      <w:r>
+        <w:rPr>
+          <w:rFonts w:ascii="Times New Roman" w:hAnsi="Times New Roman" w:cs="Times New Roman" w:hint="eastAsia"/>
+          <w:sz w:val="24"/>
+          <w:szCs w:val="24"/>
+        </w:rPr>
+        <w:t>[vi.vt.] to walk or travel around an area without any definite aim or direction.</w:t>
+      </w:r>
+      <w:r>
+        <w:rPr>
+          <w:rFonts w:ascii="Times New Roman" w:hAnsi="Times New Roman" w:cs="Times New Roman"/>
+          <w:sz w:val="24"/>
+          <w:szCs w:val="24"/>
+        </w:rPr>
+        <w:br/>
+      </w:r>
+      <w:r>
+        <w:rPr>
+          <w:rFonts w:ascii="Times New Roman" w:hAnsi="Times New Roman" w:cs="Times New Roman" w:hint="eastAsia"/>
+          <w:sz w:val="24"/>
+          <w:szCs w:val="24"/>
+        </w:rPr>
+        <w:t xml:space="preserve">The sheep are allowed to roam freely on this land. </w:t>
+      </w:r>
+    </w:p>
+    <w:p>
+      <w:pPr>
+        <w:rPr>
+          <w:rFonts w:ascii="Times New Roman" w:hAnsi="Times New Roman" w:cs="Times New Roman" w:hint="eastAsia"/>
+          <w:sz w:val="24"/>
+          <w:szCs w:val="24"/>
+        </w:rPr>
+      </w:pPr>
+      <w:r>
+        <w:rPr>
+          <w:rFonts w:ascii="Times New Roman" w:hAnsi="Times New Roman" w:cs="Times New Roman" w:hint="eastAsia"/>
+          <w:b/>
+          <w:sz w:val="24"/>
+          <w:szCs w:val="24"/>
+        </w:rPr>
+        <w:t>stable</w:t>
+      </w:r>
+      <w:r>
+        <w:rPr>
+          <w:rFonts w:ascii="Times New Roman" w:hAnsi="Times New Roman" w:cs="Times New Roman"/>
+          <w:b/>
+          <w:sz w:val="24"/>
+          <w:szCs w:val="24"/>
+        </w:rPr>
+        <w:br/>
+      </w:r>
+      <w:r>
+        <w:rPr>
+          <w:rFonts w:ascii="Times New Roman" w:hAnsi="Times New Roman" w:cs="Times New Roman" w:hint="eastAsia"/>
+          <w:sz w:val="24"/>
+          <w:szCs w:val="24"/>
+        </w:rPr>
+        <w:t>[n.C.] a building in which horses are kept.</w:t>
+      </w:r>
+      <w:r>
+        <w:rPr>
+          <w:rFonts w:ascii="Times New Roman" w:hAnsi="Times New Roman" w:cs="Times New Roman"/>
+          <w:sz w:val="24"/>
+          <w:szCs w:val="24"/>
+        </w:rPr>
+        <w:br/>
+      </w:r>
+      <w:r>
+        <w:rPr>
+          <w:rFonts w:ascii="Times New Roman" w:hAnsi="Times New Roman" w:cs="Times New Roman" w:hint="eastAsia"/>
+          <w:sz w:val="24"/>
+          <w:szCs w:val="24"/>
+        </w:rPr>
+        <w:t>The hosre was led back to its stable.</w:t>
+      </w:r>
+    </w:p>
+    <w:p>
+      <w:pPr>
+        <w:rPr>
+          <w:rFonts w:ascii="Times New Roman" w:hAnsi="Times New Roman" w:cs="Times New Roman"/>
+          <w:sz w:val="24"/>
+          <w:szCs w:val="24"/>
+        </w:rPr>
+      </w:pPr>
+      <w:r>
+        <w:rPr>
+          <w:rFonts w:ascii="Times New Roman" w:hAnsi="Times New Roman" w:cs="Times New Roman" w:hint="eastAsia"/>
+          <w:b/>
+          <w:bCs/>
+          <w:sz w:val="24"/>
+          <w:szCs w:val="24"/>
+        </w:rPr>
+        <w:t>evaporate</w:t>
+      </w:r>
+      <w:r>
+        <w:rPr>
+          <w:rFonts w:ascii="Times New Roman" w:hAnsi="Times New Roman" w:cs="Times New Roman"/>
+          <w:sz w:val="24"/>
+          <w:szCs w:val="24"/>
+        </w:rPr>
+        <w:br/>
+      </w:r>
+      <w:r>
+        <w:rPr>
+          <w:rFonts w:ascii="Times New Roman" w:hAnsi="Times New Roman" w:cs="Times New Roman" w:hint="eastAsia"/>
+          <w:sz w:val="24"/>
+          <w:szCs w:val="24"/>
+        </w:rPr>
+        <w:t>[vt</w:t>
+      </w:r>
+      <w:r>
+        <w:rPr>
+          <w:rFonts w:ascii="Times New Roman" w:hAnsi="Times New Roman" w:cs="Times New Roman" w:hint="eastAsia"/>
+          <w:sz w:val="24"/>
+          <w:szCs w:val="24"/>
+        </w:rPr>
+        <w:t xml:space="preserve">.] </w:t>
+      </w:r>
+      <w:r>
+        <w:rPr>
+          <w:rFonts w:ascii="Times New Roman" w:hAnsi="Times New Roman" w:cs="Times New Roman" w:hint="eastAsia"/>
+          <w:sz w:val="24"/>
+          <w:szCs w:val="24"/>
+        </w:rPr>
+        <w:t>to change liquid into</w:t>
+      </w:r>
+      <w:r>
+        <w:rPr>
+          <w:rFonts w:ascii="Times New Roman" w:hAnsi="Times New Roman" w:cs="Times New Roman" w:hint="eastAsia"/>
+          <w:sz w:val="24"/>
+          <w:szCs w:val="24"/>
+        </w:rPr>
+        <w:t xml:space="preserve"> a gas, especially steam</w:t>
       </w:r>
       <w:r>
         <w:rPr>
@@ -477,217 +668,76 @@
         </w:rPr>
         <w:t>.</w:t>
       </w:r>
-      <w:r>
-        <w:rPr>
-          <w:rFonts w:ascii="Times New Roman" w:hAnsi="Times New Roman" w:cs="Times New Roman" w:hint="eastAsia"/>
-          <w:sz w:val="24"/>
-          <w:szCs w:val="24"/>
-        </w:rPr>
-        <w:t>C.</w:t>
-      </w:r>
-      <w:r>
-        <w:rPr>
-          <w:rFonts w:ascii="Times New Roman" w:hAnsi="Times New Roman" w:cs="Times New Roman" w:hint="eastAsia"/>
-          <w:sz w:val="24"/>
-          <w:szCs w:val="24"/>
-        </w:rPr>
-        <w:t xml:space="preserve">] </w:t>
-      </w:r>
-      <w:r>
-        <w:rPr>
-          <w:rFonts w:ascii="Times New Roman" w:hAnsi="Times New Roman" w:cs="Times New Roman" w:hint="eastAsia"/>
-          <w:sz w:val="24"/>
-          <w:szCs w:val="24"/>
-        </w:rPr>
-        <w:t>a written or spoken of something that has happened</w:t>
-      </w:r>
-      <w:r>
-        <w:rPr>
-          <w:rFonts w:ascii="Times New Roman" w:hAnsi="Times New Roman" w:cs="Times New Roman" w:hint="eastAsia"/>
-          <w:sz w:val="24"/>
-          <w:szCs w:val="24"/>
-        </w:rPr>
-        <w:t>.</w:t>
-      </w:r>
-      <w:r>
-        <w:rPr>
-          <w:rFonts w:ascii="Times New Roman" w:hAnsi="Times New Roman" w:cs="Times New Roman"/>
-          <w:sz w:val="24"/>
-          <w:szCs w:val="24"/>
-        </w:rPr>
-        <w:br/>
-      </w:r>
-      <w:r>
-        <w:rPr>
-          <w:rFonts w:ascii="Times New Roman" w:hAnsi="Times New Roman" w:cs="Times New Roman" w:hint="eastAsia"/>
-          <w:sz w:val="24"/>
-          <w:szCs w:val="24"/>
-        </w:rPr>
-        <w:t>She gave the police a full account of the incident.</w:t>
-      </w:r>
-    </w:p>
-    <w:p>
-      <w:pPr>
-        <w:rPr>
-          <w:rFonts w:ascii="Times New Roman" w:hAnsi="Times New Roman" w:cs="Times New Roman"/>
-          <w:sz w:val="24"/>
-          <w:szCs w:val="24"/>
-        </w:rPr>
-      </w:pPr>
-      <w:r>
-        <w:rPr>
-          <w:rFonts w:ascii="Times New Roman" w:hAnsi="Times New Roman" w:cs="Times New Roman" w:hint="eastAsia"/>
-          <w:b/>
-          <w:sz w:val="24"/>
-          <w:szCs w:val="24"/>
-        </w:rPr>
-        <w:t>roam</w:t>
-      </w:r>
-      <w:r>
-        <w:rPr>
-          <w:rFonts w:ascii="Times New Roman" w:hAnsi="Times New Roman" w:cs="Times New Roman"/>
-          <w:sz w:val="24"/>
-          <w:szCs w:val="24"/>
-        </w:rPr>
-        <w:br/>
-      </w:r>
-      <w:r>
-        <w:rPr>
-          <w:rFonts w:ascii="Times New Roman" w:hAnsi="Times New Roman" w:cs="Times New Roman" w:hint="eastAsia"/>
-          <w:sz w:val="24"/>
-          <w:szCs w:val="24"/>
-        </w:rPr>
-        <w:t>[vi.vt.] to walk or travel around an area without any definite aim or direction.</w:t>
-      </w:r>
-      <w:r>
-        <w:rPr>
-          <w:rFonts w:ascii="Times New Roman" w:hAnsi="Times New Roman" w:cs="Times New Roman"/>
-          <w:sz w:val="24"/>
-          <w:szCs w:val="24"/>
-        </w:rPr>
-        <w:br/>
-      </w:r>
-      <w:r>
-        <w:rPr>
-          <w:rFonts w:ascii="Times New Roman" w:hAnsi="Times New Roman" w:cs="Times New Roman" w:hint="eastAsia"/>
-          <w:sz w:val="24"/>
-          <w:szCs w:val="24"/>
-        </w:rPr>
-        <w:t xml:space="preserve">The sheep are allowed to roam freely on this land. </w:t>
-      </w:r>
-    </w:p>
-    <w:p>
-      <w:pPr>
-        <w:rPr>
-          <w:rFonts w:ascii="Times New Roman" w:hAnsi="Times New Roman" w:cs="Times New Roman"/>
-          <w:sz w:val="24"/>
-          <w:szCs w:val="24"/>
-        </w:rPr>
-      </w:pPr>
-      <w:r>
-        <w:rPr>
-          <w:rFonts w:ascii="Times New Roman" w:hAnsi="Times New Roman" w:cs="Times New Roman" w:hint="eastAsia"/>
-          <w:b/>
-          <w:sz w:val="24"/>
-          <w:szCs w:val="24"/>
-        </w:rPr>
-        <w:t>stable</w:t>
-      </w:r>
-      <w:r>
-        <w:rPr>
-          <w:rFonts w:ascii="Times New Roman" w:hAnsi="Times New Roman" w:cs="Times New Roman"/>
-          <w:b/>
-          <w:sz w:val="24"/>
-          <w:szCs w:val="24"/>
-        </w:rPr>
-        <w:br/>
-      </w:r>
-      <w:r>
-        <w:rPr>
-          <w:rFonts w:ascii="Times New Roman" w:hAnsi="Times New Roman" w:cs="Times New Roman" w:hint="eastAsia"/>
-          <w:sz w:val="24"/>
-          <w:szCs w:val="24"/>
-        </w:rPr>
-        <w:t>[n.C.] a building in which horses are kept.</w:t>
-      </w:r>
-      <w:r>
-        <w:rPr>
-          <w:rFonts w:ascii="Times New Roman" w:hAnsi="Times New Roman" w:cs="Times New Roman"/>
-          <w:sz w:val="24"/>
-          <w:szCs w:val="24"/>
-        </w:rPr>
-        <w:br/>
-      </w:r>
-      <w:r>
-        <w:rPr>
-          <w:rFonts w:ascii="Times New Roman" w:hAnsi="Times New Roman" w:cs="Times New Roman" w:hint="eastAsia"/>
-          <w:sz w:val="24"/>
-          <w:szCs w:val="24"/>
-        </w:rPr>
-        <w:t>The hosre was led back to its stable.</w:t>
-      </w:r>
-    </w:p>
-    <w:p>
-      <w:pPr>
-        <w:rPr>
-          <w:rFonts w:ascii="Times New Roman" w:hAnsi="Times New Roman" w:cs="Times New Roman"/>
-          <w:sz w:val="24"/>
-          <w:szCs w:val="24"/>
-        </w:rPr>
-      </w:pPr>
-      <w:r>
-        <w:rPr>
-          <w:rFonts w:ascii="Times New Roman" w:hAnsi="Times New Roman" w:cs="Times New Roman" w:hint="eastAsia"/>
-          <w:b/>
-          <w:sz w:val="24"/>
-          <w:szCs w:val="24"/>
-        </w:rPr>
-        <w:t>account</w:t>
-      </w:r>
-      <w:r>
-        <w:rPr>
-          <w:rFonts w:ascii="Times New Roman" w:hAnsi="Times New Roman" w:cs="Times New Roman"/>
-          <w:sz w:val="24"/>
-          <w:szCs w:val="24"/>
-        </w:rPr>
-        <w:br/>
-      </w:r>
-      <w:r>
-        <w:rPr>
-          <w:rFonts w:ascii="Times New Roman" w:hAnsi="Times New Roman" w:cs="Times New Roman" w:hint="eastAsia"/>
-          <w:sz w:val="24"/>
-          <w:szCs w:val="24"/>
-        </w:rPr>
-        <w:t>[C.] a written record of money that owed to a business and of money that has paid by it.</w:t>
-      </w:r>
-      <w:r>
-        <w:rPr>
-          <w:rFonts w:ascii="Times New Roman" w:hAnsi="Times New Roman" w:cs="Times New Roman"/>
-          <w:sz w:val="24"/>
-          <w:szCs w:val="24"/>
-        </w:rPr>
-        <w:br/>
-      </w:r>
-      <w:r>
-        <w:rPr>
-          <w:rFonts w:ascii="Times New Roman" w:hAnsi="Times New Roman" w:cs="Times New Roman" w:hint="eastAsia"/>
-          <w:sz w:val="24"/>
-          <w:szCs w:val="24"/>
-        </w:rPr>
-        <w:t>e.g. to keep the accounts up to date.</w:t>
-      </w:r>
-    </w:p>
-    <w:p>
-      <w:pPr>
-        <w:rPr>
-          <w:rFonts w:ascii="Times New Roman" w:hAnsi="Times New Roman" w:cs="Times New Roman"/>
-          <w:sz w:val="24"/>
-          <w:szCs w:val="24"/>
-        </w:rPr>
-      </w:pPr>
-    </w:p>
-    <w:p>
-      <w:pPr>
+    </w:p>
+    <w:p>
+      <w:pPr>
+        <w:rPr>
+          <w:rFonts w:ascii="Times New Roman" w:hAnsi="Times New Roman" w:cs="Times New Roman" w:hint="eastAsia"/>
+          <w:sz w:val="24"/>
+          <w:szCs w:val="24"/>
+        </w:rPr>
+      </w:pPr>
+      <w:r>
+        <w:rPr>
+          <w:rFonts w:ascii="Times New Roman" w:hAnsi="Times New Roman" w:cs="Times New Roman" w:hint="eastAsia"/>
+          <w:b/>
+          <w:sz w:val="24"/>
+          <w:szCs w:val="24"/>
+        </w:rPr>
+        <w:t>gust</w:t>
+      </w:r>
+      <w:r>
+        <w:rPr>
+          <w:rFonts w:ascii="Times New Roman" w:hAnsi="Times New Roman" w:cs="Times New Roman"/>
+          <w:sz w:val="24"/>
+          <w:szCs w:val="24"/>
+        </w:rPr>
+        <w:br/>
+      </w:r>
+      <w:r>
+        <w:rPr>
+          <w:rFonts w:ascii="Times New Roman" w:hAnsi="Times New Roman" w:cs="Times New Roman" w:hint="eastAsia"/>
+          <w:sz w:val="24"/>
+          <w:szCs w:val="24"/>
+        </w:rPr>
+        <w:t>[C.] a sudden increase in the amount and speed of wind that is blowing.</w:t>
+      </w:r>
+      <w:r>
+        <w:rPr>
+          <w:rFonts w:ascii="Times New Roman" w:hAnsi="Times New Roman" w:cs="Times New Roman"/>
+          <w:sz w:val="24"/>
+          <w:szCs w:val="24"/>
+        </w:rPr>
+        <w:br/>
+      </w:r>
+      <w:r>
+        <w:rPr>
+          <w:rFonts w:ascii="Times New Roman" w:hAnsi="Times New Roman" w:cs="Times New Roman" w:hint="eastAsia"/>
+          <w:sz w:val="24"/>
+          <w:szCs w:val="24"/>
+        </w:rPr>
+        <w:t>[vi.] to suddenly blow very hard</w:t>
+      </w:r>
+      <w:r>
+        <w:rPr>
+          <w:rFonts w:ascii="Times New Roman" w:hAnsi="Times New Roman" w:cs="Times New Roman"/>
+          <w:sz w:val="24"/>
+          <w:szCs w:val="24"/>
+        </w:rPr>
+        <w:br/>
+      </w:r>
+      <w:r>
+        <w:rPr>
+          <w:rFonts w:ascii="Times New Roman" w:hAnsi="Times New Roman" w:cs="Times New Roman" w:hint="eastAsia"/>
+          <w:sz w:val="24"/>
+          <w:szCs w:val="24"/>
+        </w:rPr>
+        <w:t>The wind gusted through the branches.</w:t>
+      </w:r>
+    </w:p>
+    <w:p>
+      <w:pPr>
+        <w:outlineLvl w:val="2"/>
         <w:rPr>
           <w:rFonts w:ascii="Times New Roman" w:hAnsi="Times New Roman" w:cs="Times New Roman"/>
           <w:b/>
@@ -703,16 +753,37 @@
           <w:rFonts w:ascii="Times New Roman" w:hAnsi="Times New Roman" w:cs="Times New Roman"/>
           <w:b/>
           <w:bCs/>
+          <w:sz w:val="28"/>
+          <w:szCs w:val="28"/>
+        </w:rPr>
+        <w:t xml:space="preserve">Test </w:t>
+      </w:r>
+      <w:r>
+        <w:rPr>
+          <w:rFonts w:ascii="Times New Roman" w:hAnsi="Times New Roman" w:cs="Times New Roman" w:hint="eastAsia"/>
+          <w:b/>
+          <w:bCs/>
+          <w:sz w:val="28"/>
+          <w:szCs w:val="28"/>
+        </w:rPr>
+        <w:t>2</w:t>
+      </w:r>
+    </w:p>
+    <w:p>
+      <w:pPr>
+        <w:rPr>
+          <w:rFonts w:ascii="Times New Roman" w:hAnsi="Times New Roman" w:cs="Times New Roman"/>
+          <w:b/>
+          <w:bCs/>
           <w:i/>
           <w:iCs/>
           <w:sz w:val="24"/>
           <w:szCs w:val="24"/>
         </w:rPr>
-        <w:t xml:space="preserve">Section </w:t>
-      </w:r>
-      <w:r>
-        <w:rPr>
-          <w:rFonts w:ascii="Times New Roman" w:hAnsi="Times New Roman" w:cs="Times New Roman" w:hint="eastAsia"/>
+      </w:pPr>
+      <w:r>
+        <w:rPr>
+          <w:rFonts w:ascii="Times New Roman" w:hAnsi="Times New Roman" w:cs="Times New Roman"/>
           <w:b/>
           <w:bCs/>
           <w:i/>
@@ -720,66 +791,191 @@
           <w:sz w:val="24"/>
           <w:szCs w:val="24"/>
         </w:rPr>
-        <w:t>4</w:t>
-      </w:r>
-    </w:p>
-    <w:p>
-      <w:pPr>
-        <w:rPr>
-          <w:rFonts w:ascii="Times New Roman" w:hAnsi="Times New Roman" w:cs="Times New Roman"/>
-          <w:sz w:val="24"/>
-          <w:szCs w:val="24"/>
-        </w:rPr>
-      </w:pPr>
-      <w:r>
-        <w:rPr>
-          <w:rFonts w:ascii="Times New Roman" w:hAnsi="Times New Roman" w:cs="Times New Roman" w:hint="eastAsia"/>
-          <w:b/>
-          <w:bCs/>
-          <w:sz w:val="24"/>
-          <w:szCs w:val="24"/>
-        </w:rPr>
-        <w:t>evaporate</w:t>
-      </w:r>
-      <w:r>
-        <w:rPr>
-          <w:rFonts w:ascii="Times New Roman" w:hAnsi="Times New Roman" w:cs="Times New Roman"/>
-          <w:sz w:val="24"/>
-          <w:szCs w:val="24"/>
-        </w:rPr>
-        <w:br/>
-      </w:r>
-      <w:r>
-        <w:rPr>
-          <w:rFonts w:ascii="Times New Roman" w:hAnsi="Times New Roman" w:cs="Times New Roman" w:hint="eastAsia"/>
-          <w:sz w:val="24"/>
-          <w:szCs w:val="24"/>
-        </w:rPr>
-        <w:t>[vt</w:t>
-      </w:r>
-      <w:r>
-        <w:rPr>
-          <w:rFonts w:ascii="Times New Roman" w:hAnsi="Times New Roman" w:cs="Times New Roman" w:hint="eastAsia"/>
-          <w:sz w:val="24"/>
-          <w:szCs w:val="24"/>
-        </w:rPr>
-        <w:t xml:space="preserve">.] </w:t>
-      </w:r>
-      <w:r>
-        <w:rPr>
-          <w:rFonts w:ascii="Times New Roman" w:hAnsi="Times New Roman" w:cs="Times New Roman" w:hint="eastAsia"/>
-          <w:sz w:val="24"/>
-          <w:szCs w:val="24"/>
-        </w:rPr>
-        <w:t>to change liquid into</w:t>
-      </w:r>
-      <w:r>
-        <w:rPr>
-          <w:rFonts w:ascii="Times New Roman" w:hAnsi="Times New Roman" w:cs="Times New Roman" w:hint="eastAsia"/>
-          <w:sz w:val="24"/>
-          <w:szCs w:val="24"/>
-        </w:rPr>
-        <w:t xml:space="preserve"> a gas, especially steam</w:t>
+        <w:t xml:space="preserve">Section </w:t>
+      </w:r>
+      <w:r>
+        <w:rPr>
+          <w:rFonts w:ascii="Times New Roman" w:hAnsi="Times New Roman" w:cs="Times New Roman" w:hint="eastAsia"/>
+          <w:b/>
+          <w:bCs/>
+          <w:i/>
+          <w:iCs/>
+          <w:sz w:val="24"/>
+          <w:szCs w:val="24"/>
+        </w:rPr>
+        <w:t>1</w:t>
+      </w:r>
+    </w:p>
+    <w:p>
+      <w:pPr>
+        <w:rPr>
+          <w:rFonts w:ascii="Times New Roman" w:hAnsi="Times New Roman" w:cs="Times New Roman" w:hint="eastAsia"/>
+          <w:sz w:val="24"/>
+          <w:szCs w:val="24"/>
+        </w:rPr>
+      </w:pPr>
+      <w:r>
+        <w:rPr>
+          <w:rFonts w:ascii="Times New Roman" w:hAnsi="Times New Roman" w:cs="Times New Roman" w:hint="eastAsia"/>
+          <w:b/>
+          <w:bCs/>
+          <w:sz w:val="24"/>
+          <w:szCs w:val="24"/>
+        </w:rPr>
+        <w:t>chill</w:t>
+      </w:r>
+      <w:r>
+        <w:rPr>
+          <w:rFonts w:ascii="Times New Roman" w:hAnsi="Times New Roman" w:cs="Times New Roman" w:hint="eastAsia"/>
+          <w:b/>
+          <w:bCs/>
+          <w:sz w:val="24"/>
+          <w:szCs w:val="24"/>
+        </w:rPr>
+        <w:t xml:space="preserve"> </w:t>
+      </w:r>
+      <w:r>
+        <w:rPr>
+          <w:rFonts w:ascii="Times New Roman" w:hAnsi="Times New Roman" w:cs="Times New Roman"/>
+          <w:bCs/>
+          <w:sz w:val="24"/>
+          <w:szCs w:val="24"/>
+        </w:rPr>
+        <w:br/>
+      </w:r>
+      <w:r>
+        <w:rPr>
+          <w:rFonts w:ascii="Times New Roman" w:hAnsi="Times New Roman" w:cs="Times New Roman" w:hint="eastAsia"/>
+          <w:sz w:val="24"/>
+          <w:szCs w:val="24"/>
+        </w:rPr>
+        <w:t>[</w:t>
+      </w:r>
+      <w:r>
+        <w:rPr>
+          <w:rFonts w:ascii="Times New Roman" w:hAnsi="Times New Roman" w:cs="Times New Roman" w:hint="eastAsia"/>
+          <w:sz w:val="24"/>
+          <w:szCs w:val="24"/>
+        </w:rPr>
+        <w:t>vt.</w:t>
+      </w:r>
+      <w:r>
+        <w:rPr>
+          <w:rFonts w:ascii="Times New Roman" w:hAnsi="Times New Roman" w:cs="Times New Roman" w:hint="eastAsia"/>
+          <w:sz w:val="24"/>
+          <w:szCs w:val="24"/>
+        </w:rPr>
+        <w:t>vi.</w:t>
+      </w:r>
+      <w:r>
+        <w:rPr>
+          <w:rFonts w:ascii="Times New Roman" w:hAnsi="Times New Roman" w:cs="Times New Roman" w:hint="eastAsia"/>
+          <w:sz w:val="24"/>
+          <w:szCs w:val="24"/>
+        </w:rPr>
+        <w:t>]</w:t>
+      </w:r>
+      <w:r>
+        <w:rPr>
+          <w:rFonts w:ascii="Times New Roman" w:hAnsi="Times New Roman" w:cs="Times New Roman" w:hint="eastAsia"/>
+          <w:sz w:val="24"/>
+          <w:szCs w:val="24"/>
+        </w:rPr>
+        <w:t xml:space="preserve"> when food or a dink chills or when sb chills it, it is made very cold but not freeze.</w:t>
+      </w:r>
+      <w:r>
+        <w:rPr>
+          <w:rFonts w:ascii="Times New Roman" w:hAnsi="Times New Roman" w:cs="Times New Roman"/>
+          <w:sz w:val="24"/>
+          <w:szCs w:val="24"/>
+        </w:rPr>
+        <w:br/>
+      </w:r>
+      <w:r>
+        <w:rPr>
+          <w:rFonts w:ascii="Times New Roman" w:hAnsi="Times New Roman" w:cs="Times New Roman" w:hint="eastAsia"/>
+          <w:sz w:val="24"/>
+          <w:szCs w:val="24"/>
+        </w:rPr>
+        <w:t>chilled water.</w:t>
+      </w:r>
+    </w:p>
+    <w:p>
+      <w:pPr>
+        <w:rPr>
+          <w:rFonts w:ascii="Times New Roman" w:hAnsi="Times New Roman" w:cs="Times New Roman" w:hint="eastAsia"/>
+          <w:sz w:val="24"/>
+          <w:szCs w:val="24"/>
+        </w:rPr>
+      </w:pPr>
+    </w:p>
+    <w:p>
+      <w:pPr>
+        <w:rPr>
+          <w:rFonts w:ascii="Times New Roman" w:hAnsi="Times New Roman" w:cs="Times New Roman" w:hint="eastAsia"/>
+          <w:sz w:val="24"/>
+          <w:szCs w:val="24"/>
+        </w:rPr>
+      </w:pPr>
+      <w:r>
+        <w:rPr>
+          <w:rFonts w:ascii="Times New Roman" w:hAnsi="Times New Roman" w:cs="Times New Roman" w:hint="eastAsia"/>
+          <w:b/>
+          <w:sz w:val="24"/>
+          <w:szCs w:val="24"/>
+        </w:rPr>
+        <w:lastRenderedPageBreak/>
+        <w:t>teller</w:t>
+      </w:r>
+      <w:r>
+        <w:rPr>
+          <w:rFonts w:ascii="Times New Roman" w:hAnsi="Times New Roman" w:cs="Times New Roman" w:hint="eastAsia"/>
+          <w:b/>
+          <w:sz w:val="24"/>
+          <w:szCs w:val="24"/>
+        </w:rPr>
+        <w:t xml:space="preserve"> </w:t>
+      </w:r>
+      <w:r>
+        <w:rPr>
+          <w:rFonts w:ascii="Times New Roman" w:hAnsi="Times New Roman" w:cs="Times New Roman"/>
+          <w:b/>
+          <w:sz w:val="24"/>
+          <w:szCs w:val="24"/>
+        </w:rPr>
+        <w:br/>
+      </w:r>
+      <w:r>
+        <w:rPr>
+          <w:rFonts w:ascii="Times New Roman" w:hAnsi="Times New Roman" w:cs="Times New Roman" w:hint="eastAsia"/>
+          <w:sz w:val="24"/>
+          <w:szCs w:val="24"/>
+        </w:rPr>
+        <w:t xml:space="preserve">1. [C.] a person whose job is to receive an pay out money in a bank. </w:t>
+      </w:r>
+      <w:r>
+        <w:rPr>
+          <w:rFonts w:ascii="Times New Roman" w:hAnsi="Times New Roman" w:cs="Times New Roman"/>
+          <w:sz w:val="24"/>
+          <w:szCs w:val="24"/>
+        </w:rPr>
+        <w:br/>
+      </w:r>
+      <w:r>
+        <w:rPr>
+          <w:rFonts w:ascii="Times New Roman" w:hAnsi="Times New Roman" w:cs="Times New Roman" w:hint="eastAsia"/>
+          <w:sz w:val="24"/>
+          <w:szCs w:val="24"/>
+        </w:rPr>
+        <w:t xml:space="preserve">A female teller is in the town hall of a bank to help </w:t>
+      </w:r>
+      <w:r>
+        <w:rPr>
+          <w:rFonts w:ascii="Times New Roman" w:hAnsi="Times New Roman" w:cs="Times New Roman" w:hint="eastAsia"/>
+          <w:sz w:val="24"/>
+          <w:szCs w:val="24"/>
+        </w:rPr>
+        <w:t>the elderly</w:t>
       </w:r>
       <w:r>
         <w:rPr>
@@ -789,6 +985,197 @@
         </w:rPr>
         <w:t>.</w:t>
       </w:r>
+      <w:r>
+        <w:rPr>
+          <w:rFonts w:ascii="Times New Roman" w:hAnsi="Times New Roman" w:cs="Times New Roman"/>
+          <w:sz w:val="24"/>
+          <w:szCs w:val="24"/>
+        </w:rPr>
+        <w:br/>
+      </w:r>
+      <w:r>
+        <w:rPr>
+          <w:rFonts w:ascii="Times New Roman" w:hAnsi="Times New Roman" w:cs="Times New Roman" w:hint="eastAsia"/>
+          <w:sz w:val="24"/>
+          <w:szCs w:val="24"/>
+        </w:rPr>
+        <w:t>2. [C.] a machine that pays out money automatically.</w:t>
+      </w:r>
+      <w:r>
+        <w:rPr>
+          <w:rFonts w:ascii="Times New Roman" w:hAnsi="Times New Roman" w:cs="Times New Roman"/>
+          <w:sz w:val="24"/>
+          <w:szCs w:val="24"/>
+        </w:rPr>
+        <w:br/>
+      </w:r>
+      <w:r>
+        <w:rPr>
+          <w:rFonts w:ascii="Times New Roman" w:hAnsi="Times New Roman" w:cs="Times New Roman" w:hint="eastAsia"/>
+          <w:sz w:val="24"/>
+          <w:szCs w:val="24"/>
+        </w:rPr>
+        <w:t>ATM is an acronym of aotumatic teller machines.</w:t>
+      </w:r>
+    </w:p>
+    <w:p>
+      <w:pPr>
+        <w:rPr>
+          <w:rFonts w:ascii="Times New Roman" w:hAnsi="Times New Roman" w:cs="Times New Roman"/>
+          <w:sz w:val="24"/>
+          <w:szCs w:val="24"/>
+        </w:rPr>
+      </w:pPr>
+      <w:r>
+        <w:rPr>
+          <w:rFonts w:ascii="Times New Roman" w:hAnsi="Times New Roman" w:cs="Times New Roman" w:hint="eastAsia"/>
+          <w:b/>
+          <w:sz w:val="24"/>
+          <w:szCs w:val="24"/>
+        </w:rPr>
+        <w:t>cash</w:t>
+      </w:r>
+      <w:r>
+        <w:rPr>
+          <w:rFonts w:ascii="Times New Roman" w:hAnsi="Times New Roman" w:cs="Times New Roman"/>
+          <w:sz w:val="24"/>
+          <w:szCs w:val="24"/>
+        </w:rPr>
+        <w:br/>
+      </w:r>
+      <w:r>
+        <w:rPr>
+          <w:rFonts w:ascii="Times New Roman" w:hAnsi="Times New Roman" w:cs="Times New Roman" w:hint="eastAsia"/>
+          <w:sz w:val="24"/>
+          <w:szCs w:val="24"/>
+        </w:rPr>
+        <w:t xml:space="preserve">[vt.] </w:t>
+      </w:r>
+      <w:r>
+        <w:rPr>
+          <w:rFonts w:ascii="Times New Roman" w:hAnsi="Times New Roman" w:cs="Times New Roman" w:hint="eastAsia"/>
+          <w:sz w:val="24"/>
+          <w:szCs w:val="24"/>
+        </w:rPr>
+        <w:t>to exchange a cheque/check for the amount of money that is worth.</w:t>
+      </w:r>
+      <w:r>
+        <w:rPr>
+          <w:rFonts w:ascii="Times New Roman" w:hAnsi="Times New Roman" w:cs="Times New Roman"/>
+          <w:sz w:val="24"/>
+          <w:szCs w:val="24"/>
+        </w:rPr>
+        <w:br/>
+      </w:r>
+      <w:r>
+        <w:rPr>
+          <w:rFonts w:ascii="Times New Roman" w:hAnsi="Times New Roman" w:cs="Times New Roman" w:hint="eastAsia"/>
+          <w:sz w:val="24"/>
+          <w:szCs w:val="24"/>
+        </w:rPr>
+        <w:t>cash a cheque(BrE)/check(AmE)</w:t>
+      </w:r>
+      <w:r>
+        <w:rPr>
+          <w:rFonts w:ascii="Times New Roman" w:hAnsi="Times New Roman" w:cs="Times New Roman"/>
+          <w:sz w:val="24"/>
+          <w:szCs w:val="24"/>
+        </w:rPr>
+        <w:br/>
+      </w:r>
+      <w:r>
+        <w:rPr>
+          <w:rFonts w:ascii="Times New Roman" w:hAnsi="Times New Roman" w:cs="Times New Roman" w:hint="eastAsia"/>
+          <w:b/>
+          <w:sz w:val="24"/>
+          <w:szCs w:val="24"/>
+        </w:rPr>
+        <w:t>travellers</w:t>
+      </w:r>
+      <w:r>
+        <w:rPr>
+          <w:rFonts w:ascii="Times New Roman" w:hAnsi="Times New Roman" w:cs="Times New Roman"/>
+          <w:b/>
+          <w:sz w:val="24"/>
+          <w:szCs w:val="24"/>
+        </w:rPr>
+        <w:t>’</w:t>
+      </w:r>
+      <w:r>
+        <w:rPr>
+          <w:rFonts w:ascii="Times New Roman" w:hAnsi="Times New Roman" w:cs="Times New Roman" w:hint="eastAsia"/>
+          <w:b/>
+          <w:sz w:val="24"/>
+          <w:szCs w:val="24"/>
+        </w:rPr>
+        <w:t xml:space="preserve"> cheque</w:t>
+      </w:r>
+      <w:r>
+        <w:rPr>
+          <w:rFonts w:ascii="Times New Roman" w:hAnsi="Times New Roman" w:cs="Times New Roman"/>
+          <w:sz w:val="24"/>
+          <w:szCs w:val="24"/>
+        </w:rPr>
+        <w:br/>
+      </w:r>
+      <w:r>
+        <w:rPr>
+          <w:rFonts w:ascii="Times New Roman" w:hAnsi="Times New Roman" w:cs="Times New Roman" w:hint="eastAsia"/>
+          <w:sz w:val="24"/>
+          <w:szCs w:val="24"/>
+        </w:rPr>
+        <w:t>[collocation] a cheque for a fixed amount, sold by a bank or a travel agent that can be exchanged for cash in froeign countries.</w:t>
+      </w:r>
+      <w:r>
+        <w:rPr>
+          <w:rFonts w:ascii="Times New Roman" w:hAnsi="Times New Roman" w:cs="Times New Roman"/>
+          <w:sz w:val="24"/>
+          <w:szCs w:val="24"/>
+        </w:rPr>
+        <w:br/>
+      </w:r>
+      <w:r>
+        <w:rPr>
+          <w:rFonts w:ascii="Times New Roman" w:hAnsi="Times New Roman" w:cs="Times New Roman" w:hint="eastAsia"/>
+          <w:sz w:val="24"/>
+          <w:szCs w:val="24"/>
+        </w:rPr>
+        <w:t>Travellers</w:t>
+      </w:r>
+      <w:r>
+        <w:rPr>
+          <w:rFonts w:ascii="Times New Roman" w:hAnsi="Times New Roman" w:cs="Times New Roman"/>
+          <w:sz w:val="24"/>
+          <w:szCs w:val="24"/>
+        </w:rPr>
+        <w:t>’</w:t>
+      </w:r>
+      <w:r>
+        <w:rPr>
+          <w:rFonts w:ascii="Times New Roman" w:hAnsi="Times New Roman" w:cs="Times New Roman" w:hint="eastAsia"/>
+          <w:sz w:val="24"/>
+          <w:szCs w:val="24"/>
+        </w:rPr>
+        <w:t xml:space="preserve"> cheque</w:t>
+      </w:r>
+      <w:r>
+        <w:rPr>
+          <w:rFonts w:ascii="Times New Roman" w:hAnsi="Times New Roman" w:cs="Times New Roman" w:hint="eastAsia"/>
+          <w:sz w:val="24"/>
+          <w:szCs w:val="24"/>
+        </w:rPr>
+        <w:t>s can be cashed at</w:t>
+      </w:r>
+      <w:bookmarkStart w:id="0" w:name="_GoBack"/>
+      <w:bookmarkEnd w:id="0"/>
+      <w:r>
+        <w:rPr>
+          <w:rFonts w:ascii="Times New Roman" w:hAnsi="Times New Roman" w:cs="Times New Roman" w:hint="eastAsia"/>
+          <w:sz w:val="24"/>
+          <w:szCs w:val="24"/>
+        </w:rPr>
+        <w:t xml:space="preserve"> most hotels.</w:t>
+      </w:r>
     </w:p>
     <w:p>
       <w:pPr>
@@ -798,63 +1185,6 @@
           <w:szCs w:val="24"/>
         </w:rPr>
       </w:pPr>
-      <w:r>
-        <w:rPr>
-          <w:rFonts w:ascii="Times New Roman" w:hAnsi="Times New Roman" w:cs="Times New Roman" w:hint="eastAsia"/>
-          <w:b/>
-          <w:sz w:val="24"/>
-          <w:szCs w:val="24"/>
-        </w:rPr>
-        <w:t>gust</w:t>
-      </w:r>
-      <w:r>
-        <w:rPr>
-          <w:rFonts w:ascii="Times New Roman" w:hAnsi="Times New Roman" w:cs="Times New Roman"/>
-          <w:sz w:val="24"/>
-          <w:szCs w:val="24"/>
-        </w:rPr>
-        <w:br/>
-      </w:r>
-      <w:r>
-        <w:rPr>
-          <w:rFonts w:ascii="Times New Roman" w:hAnsi="Times New Roman" w:cs="Times New Roman" w:hint="eastAsia"/>
-          <w:sz w:val="24"/>
-          <w:szCs w:val="24"/>
-        </w:rPr>
-        <w:t>[C.] a sudden increase in the amount and speed of wind that is blowing.</w:t>
-      </w:r>
-      <w:r>
-        <w:rPr>
-          <w:rFonts w:ascii="Times New Roman" w:hAnsi="Times New Roman" w:cs="Times New Roman"/>
-          <w:sz w:val="24"/>
-          <w:szCs w:val="24"/>
-        </w:rPr>
-        <w:br/>
-      </w:r>
-      <w:r>
-        <w:rPr>
-          <w:rFonts w:ascii="Times New Roman" w:hAnsi="Times New Roman" w:cs="Times New Roman" w:hint="eastAsia"/>
-          <w:sz w:val="24"/>
-          <w:szCs w:val="24"/>
-        </w:rPr>
-        <w:t>[vi.] to suddenly blow very hard</w:t>
-      </w:r>
-      <w:r>
-        <w:rPr>
-          <w:rFonts w:ascii="Times New Roman" w:hAnsi="Times New Roman" w:cs="Times New Roman"/>
-          <w:sz w:val="24"/>
-          <w:szCs w:val="24"/>
-        </w:rPr>
-        <w:br/>
-      </w:r>
-      <w:r>
-        <w:rPr>
-          <w:rFonts w:ascii="Times New Roman" w:hAnsi="Times New Roman" w:cs="Times New Roman" w:hint="eastAsia"/>
-          <w:sz w:val="24"/>
-          <w:szCs w:val="24"/>
-        </w:rPr>
-        <w:t>The wind gusted through the branches.</w:t>
-      </w:r>
     </w:p>
     <w:p>
       <w:pPr>
@@ -906,7 +1236,6 @@
           <w:sz w:val="28"/>
           <w:szCs w:val="28"/>
         </w:rPr>
-        <w:lastRenderedPageBreak/>
         <w:t>Test 1</w:t>
       </w:r>
     </w:p>
@@ -1383,6 +1712,7 @@
           <w:sz w:val="24"/>
           <w:szCs w:val="24"/>
         </w:rPr>
+        <w:lastRenderedPageBreak/>
         <w:t>prospectus</w:t>
       </w:r>
       <w:r>
@@ -1584,7 +1914,6 @@
           <w:b/>
           <w:bCs/>
         </w:rPr>
-        <w:lastRenderedPageBreak/>
         <w:t>booklet</w:t>
       </w:r>
       <w:r>
@@ -2107,6 +2436,7 @@
           <w:sz w:val="28"/>
           <w:szCs w:val="28"/>
         </w:rPr>
+        <w:lastRenderedPageBreak/>
         <w:t>Section 2</w:t>
       </w:r>
     </w:p>
@@ -2490,7 +2820,6 @@
           <w:sz w:val="24"/>
           <w:szCs w:val="24"/>
         </w:rPr>
-        <w:lastRenderedPageBreak/>
         <w:t>exceed</w:t>
       </w:r>
       <w:r>
@@ -3262,6 +3591,7 @@
           <w:sz w:val="24"/>
           <w:szCs w:val="24"/>
         </w:rPr>
+        <w:lastRenderedPageBreak/>
         <w:t>session</w:t>
       </w:r>
       <w:r>
@@ -3644,7 +3974,6 @@
           <w:sz w:val="24"/>
           <w:szCs w:val="24"/>
         </w:rPr>
-        <w:lastRenderedPageBreak/>
         <w:t>muddle</w:t>
       </w:r>
       <w:r>
@@ -4614,6 +4943,7 @@
           <w:sz w:val="28"/>
           <w:szCs w:val="24"/>
         </w:rPr>
+        <w:lastRenderedPageBreak/>
         <w:t xml:space="preserve">Section </w:t>
       </w:r>
       <w:r>
@@ -5590,6 +5920,7 @@
           <w:sz w:val="24"/>
           <w:szCs w:val="24"/>
         </w:rPr>
+        <w:lastRenderedPageBreak/>
         <w:t xml:space="preserve">let </w:t>
       </w:r>
       <w:r>
@@ -5908,16 +6239,7 @@
           <w:sz w:val="24"/>
           <w:szCs w:val="24"/>
         </w:rPr>
-        <w:t xml:space="preserve">[n.C.] a flat, usually square, pieced of baked clay, carpet or other material that is used </w:t>
-      </w:r>
-      <w:r>
-        <w:rPr>
-          <w:rFonts w:ascii="Times New Roman" w:eastAsia="华文宋体" w:hAnsi="Times New Roman" w:cs="Times New Roman" w:hint="eastAsia"/>
-          <w:sz w:val="24"/>
-          <w:szCs w:val="24"/>
-        </w:rPr>
-        <w:lastRenderedPageBreak/>
-        <w:t>in rows for covering walls and floors.</w:t>
+        <w:t>[n.C.] a flat, usually square, pieced of baked clay, carpet or other material that is used in rows for covering walls and floors.</w:t>
       </w:r>
       <w:r>
         <w:rPr>
@@ -6327,6 +6649,7 @@
           <w:sz w:val="24"/>
           <w:szCs w:val="24"/>
         </w:rPr>
+        <w:lastRenderedPageBreak/>
         <w:t>hunter-gatherer</w:t>
       </w:r>
       <w:r>
@@ -6595,639 +6918,639 @@
           <w:sz w:val="24"/>
           <w:szCs w:val="24"/>
         </w:rPr>
+        <w:t>plough</w:t>
+      </w:r>
+      <w:r>
+        <w:rPr>
+          <w:rFonts w:ascii="Times New Roman" w:eastAsia="华文宋体" w:hAnsi="Times New Roman" w:cs="Times New Roman" w:hint="eastAsia"/>
+          <w:sz w:val="24"/>
+          <w:szCs w:val="24"/>
+        </w:rPr>
+        <w:t xml:space="preserve"> /</w:t>
+      </w:r>
+      <w:r>
+        <w:rPr>
+          <w:rFonts w:ascii="GWIPA" w:eastAsia="华文宋体" w:hAnsi="GWIPA" w:cs="Times New Roman"/>
+          <w:sz w:val="24"/>
+          <w:szCs w:val="24"/>
+        </w:rPr>
+        <w:t></w:t>
+      </w:r>
+      <w:r>
+        <w:rPr>
+          <w:rFonts w:ascii="GWIPA" w:eastAsia="华文宋体" w:hAnsi="GWIPA" w:cs="Times New Roman"/>
+          <w:sz w:val="24"/>
+          <w:szCs w:val="24"/>
+        </w:rPr>
+        <w:t></w:t>
+      </w:r>
+      <w:r>
+        <w:rPr>
+          <w:rFonts w:ascii="GWIPA" w:eastAsia="华文宋体" w:hAnsi="GWIPA" w:cs="Times New Roman"/>
+          <w:sz w:val="24"/>
+          <w:szCs w:val="24"/>
+        </w:rPr>
+        <w:t></w:t>
+      </w:r>
+      <w:r>
+        <w:rPr>
+          <w:rFonts w:ascii="GWIPA" w:eastAsia="华文宋体" w:hAnsi="GWIPA" w:cs="Times New Roman"/>
+          <w:sz w:val="24"/>
+          <w:szCs w:val="24"/>
+        </w:rPr>
+        <w:t></w:t>
+      </w:r>
+      <w:r>
+        <w:rPr>
+          <w:rFonts w:ascii="Times New Roman" w:eastAsia="华文宋体" w:hAnsi="Times New Roman" w:cs="Times New Roman" w:hint="eastAsia"/>
+          <w:sz w:val="24"/>
+          <w:szCs w:val="24"/>
+        </w:rPr>
+        <w:t>/</w:t>
+      </w:r>
+      <w:r>
+        <w:rPr>
+          <w:rFonts w:ascii="Times New Roman" w:eastAsia="华文宋体" w:hAnsi="Times New Roman" w:cs="Times New Roman"/>
+          <w:sz w:val="24"/>
+          <w:szCs w:val="24"/>
+        </w:rPr>
+        <w:br/>
+      </w:r>
+      <w:r>
+        <w:rPr>
+          <w:rFonts w:ascii="Times New Roman" w:eastAsia="华文宋体" w:hAnsi="Times New Roman" w:cs="Times New Roman" w:hint="eastAsia"/>
+          <w:sz w:val="24"/>
+          <w:szCs w:val="24"/>
+        </w:rPr>
+        <w:t xml:space="preserve">[n.] a large piece of farming equipment with one or serval curved blades to dig and trun over soil. </w:t>
+      </w:r>
+      <w:r>
+        <w:rPr>
+          <w:rFonts w:ascii="Times New Roman" w:eastAsia="华文宋体" w:hAnsi="Times New Roman" w:cs="Times New Roman"/>
+          <w:sz w:val="24"/>
+          <w:szCs w:val="24"/>
+        </w:rPr>
+        <w:br/>
+      </w:r>
+      <w:r>
+        <w:rPr>
+          <w:rFonts w:ascii="Times New Roman" w:eastAsia="华文宋体" w:hAnsi="Times New Roman" w:cs="Times New Roman" w:hint="eastAsia"/>
+          <w:sz w:val="24"/>
+          <w:szCs w:val="24"/>
+        </w:rPr>
+        <w:t>[vt.vi.] to dig and trun over a field or other area of land with a plough.</w:t>
+      </w:r>
+    </w:p>
+    <w:p>
+      <w:pPr>
+        <w:rPr>
+          <w:rFonts w:ascii="Times New Roman" w:eastAsia="华文宋体" w:hAnsi="Times New Roman" w:cs="Times New Roman"/>
+          <w:sz w:val="24"/>
+          <w:szCs w:val="24"/>
+        </w:rPr>
+      </w:pPr>
+      <w:r>
+        <w:rPr>
+          <w:rFonts w:ascii="Times New Roman" w:eastAsia="华文宋体" w:hAnsi="Times New Roman" w:cs="Times New Roman" w:hint="eastAsia"/>
+          <w:b/>
+          <w:sz w:val="24"/>
+          <w:szCs w:val="24"/>
+        </w:rPr>
+        <w:t>excavation</w:t>
+      </w:r>
+      <w:r>
+        <w:rPr>
+          <w:rFonts w:ascii="Times New Roman" w:eastAsia="华文宋体" w:hAnsi="Times New Roman" w:cs="Times New Roman" w:hint="eastAsia"/>
+          <w:sz w:val="24"/>
+          <w:szCs w:val="24"/>
+        </w:rPr>
+        <w:t xml:space="preserve"> /</w:t>
+      </w:r>
+      <w:r>
+        <w:rPr>
+          <w:rFonts w:ascii="GWIPA" w:eastAsia="华文宋体" w:hAnsi="GWIPA" w:cs="Times New Roman"/>
+          <w:sz w:val="24"/>
+          <w:szCs w:val="24"/>
+        </w:rPr>
+        <w:t></w:t>
+      </w:r>
+      <w:r>
+        <w:rPr>
+          <w:rFonts w:ascii="GWIPA" w:eastAsia="华文宋体" w:hAnsi="GWIPA" w:cs="Times New Roman"/>
+          <w:sz w:val="24"/>
+          <w:szCs w:val="24"/>
+        </w:rPr>
+        <w:t></w:t>
+      </w:r>
+      <w:r>
+        <w:rPr>
+          <w:rFonts w:ascii="GWIPA" w:eastAsia="华文宋体" w:hAnsi="GWIPA" w:cs="Times New Roman"/>
+          <w:sz w:val="24"/>
+          <w:szCs w:val="24"/>
+        </w:rPr>
+        <w:t></w:t>
+      </w:r>
+      <w:r>
+        <w:rPr>
+          <w:rFonts w:ascii="GWIPA" w:eastAsia="华文宋体" w:hAnsi="GWIPA" w:cs="Times New Roman"/>
+          <w:sz w:val="24"/>
+          <w:szCs w:val="24"/>
+        </w:rPr>
+        <w:t></w:t>
+      </w:r>
+      <w:r>
+        <w:rPr>
+          <w:rFonts w:ascii="GWIPA" w:eastAsia="华文宋体" w:hAnsi="GWIPA" w:cs="Times New Roman"/>
+          <w:sz w:val="24"/>
+          <w:szCs w:val="24"/>
+        </w:rPr>
+        <w:t></w:t>
+      </w:r>
+      <w:r>
+        <w:rPr>
+          <w:rFonts w:ascii="GWIPA" w:eastAsia="华文宋体" w:hAnsi="GWIPA" w:cs="Times New Roman"/>
+          <w:sz w:val="24"/>
+          <w:szCs w:val="24"/>
+        </w:rPr>
+        <w:t></w:t>
+      </w:r>
+      <w:r>
+        <w:rPr>
+          <w:rFonts w:ascii="GWIPA" w:eastAsia="华文宋体" w:hAnsi="GWIPA" w:cs="Times New Roman"/>
+          <w:sz w:val="24"/>
+          <w:szCs w:val="24"/>
+        </w:rPr>
+        <w:t></w:t>
+      </w:r>
+      <w:r>
+        <w:rPr>
+          <w:rFonts w:ascii="GWIPA" w:eastAsia="华文宋体" w:hAnsi="GWIPA" w:cs="Times New Roman"/>
+          <w:sz w:val="24"/>
+          <w:szCs w:val="24"/>
+        </w:rPr>
+        <w:t></w:t>
+      </w:r>
+      <w:r>
+        <w:rPr>
+          <w:rFonts w:ascii="GWIPA" w:eastAsia="华文宋体" w:hAnsi="GWIPA" w:cs="Times New Roman"/>
+          <w:sz w:val="24"/>
+          <w:szCs w:val="24"/>
+        </w:rPr>
+        <w:t></w:t>
+      </w:r>
+      <w:r>
+        <w:rPr>
+          <w:rFonts w:ascii="GWIPA" w:eastAsia="华文宋体" w:hAnsi="GWIPA" w:cs="Times New Roman"/>
+          <w:sz w:val="24"/>
+          <w:szCs w:val="24"/>
+        </w:rPr>
+        <w:t></w:t>
+      </w:r>
+      <w:r>
+        <w:rPr>
+          <w:rFonts w:ascii="GWIPA" w:eastAsia="华文宋体" w:hAnsi="GWIPA" w:cs="Times New Roman"/>
+          <w:sz w:val="24"/>
+          <w:szCs w:val="24"/>
+        </w:rPr>
+        <w:t></w:t>
+      </w:r>
+      <w:r>
+        <w:rPr>
+          <w:rFonts w:ascii="GWIPA" w:eastAsia="华文宋体" w:hAnsi="GWIPA" w:cs="Times New Roman"/>
+          <w:sz w:val="24"/>
+          <w:szCs w:val="24"/>
+        </w:rPr>
+        <w:t></w:t>
+      </w:r>
+      <w:r>
+        <w:rPr>
+          <w:rFonts w:ascii="Times New Roman" w:eastAsia="华文宋体" w:hAnsi="Times New Roman" w:cs="Times New Roman" w:hint="eastAsia"/>
+          <w:sz w:val="24"/>
+          <w:szCs w:val="24"/>
+        </w:rPr>
+        <w:t>/</w:t>
+      </w:r>
+      <w:r>
+        <w:rPr>
+          <w:rFonts w:ascii="Times New Roman" w:eastAsia="华文宋体" w:hAnsi="Times New Roman" w:cs="Times New Roman"/>
+          <w:sz w:val="24"/>
+          <w:szCs w:val="24"/>
+        </w:rPr>
+        <w:br/>
+      </w:r>
+      <w:r>
+        <w:rPr>
+          <w:rFonts w:ascii="Times New Roman" w:eastAsia="华文宋体" w:hAnsi="Times New Roman" w:cs="Times New Roman" w:hint="eastAsia"/>
+          <w:sz w:val="24"/>
+          <w:szCs w:val="24"/>
+        </w:rPr>
+        <w:t>[n.] the activity of diggin</w:t>
+      </w:r>
+      <w:r>
+        <w:rPr>
+          <w:rFonts w:ascii="Times New Roman" w:eastAsia="华文宋体" w:hAnsi="Times New Roman" w:cs="Times New Roman" w:hint="eastAsia"/>
+          <w:sz w:val="24"/>
+          <w:szCs w:val="24"/>
+        </w:rPr>
+        <w:t>g</w:t>
+      </w:r>
+      <w:r>
+        <w:rPr>
+          <w:rFonts w:ascii="Times New Roman" w:eastAsia="华文宋体" w:hAnsi="Times New Roman" w:cs="Times New Roman" w:hint="eastAsia"/>
+          <w:sz w:val="24"/>
+          <w:szCs w:val="24"/>
+        </w:rPr>
+        <w:t xml:space="preserve"> in the ground to look for old buildings or objects that have been buried for a long time.</w:t>
+      </w:r>
+    </w:p>
+    <w:p>
+      <w:pPr>
+        <w:rPr>
+          <w:rFonts w:ascii="Times New Roman" w:eastAsia="华文宋体" w:hAnsi="Times New Roman" w:cs="Times New Roman"/>
+          <w:sz w:val="24"/>
+          <w:szCs w:val="24"/>
+        </w:rPr>
+      </w:pPr>
+      <w:r>
+        <w:rPr>
+          <w:rFonts w:ascii="Times New Roman" w:eastAsia="华文宋体" w:hAnsi="Times New Roman" w:cs="Times New Roman" w:hint="eastAsia"/>
+          <w:b/>
+          <w:sz w:val="24"/>
+          <w:szCs w:val="24"/>
+        </w:rPr>
+        <w:t xml:space="preserve">husbandry </w:t>
+      </w:r>
+      <w:r>
+        <w:rPr>
+          <w:rFonts w:ascii="Times New Roman" w:eastAsia="华文宋体" w:hAnsi="Times New Roman" w:cs="Times New Roman"/>
+          <w:sz w:val="24"/>
+          <w:szCs w:val="24"/>
+        </w:rPr>
+        <w:br/>
+      </w:r>
+      <w:r>
+        <w:rPr>
+          <w:rFonts w:ascii="Times New Roman" w:eastAsia="华文宋体" w:hAnsi="Times New Roman" w:cs="Times New Roman" w:hint="eastAsia"/>
+          <w:sz w:val="24"/>
+          <w:szCs w:val="24"/>
+        </w:rPr>
+        <w:t>[n.] farming, especially when done carefully and well.</w:t>
+      </w:r>
+      <w:r>
+        <w:rPr>
+          <w:rFonts w:ascii="Times New Roman" w:eastAsia="华文宋体" w:hAnsi="Times New Roman" w:cs="Times New Roman"/>
+          <w:sz w:val="24"/>
+          <w:szCs w:val="24"/>
+        </w:rPr>
+        <w:br/>
+      </w:r>
+      <w:r>
+        <w:rPr>
+          <w:rFonts w:ascii="Times New Roman" w:eastAsia="华文宋体" w:hAnsi="Times New Roman" w:cs="Times New Roman" w:hint="eastAsia"/>
+          <w:sz w:val="24"/>
+          <w:szCs w:val="24"/>
+        </w:rPr>
+        <w:t>animal/crop husbandry.</w:t>
+      </w:r>
+    </w:p>
+    <w:p>
+      <w:pPr>
+        <w:rPr>
+          <w:rFonts w:ascii="Times New Roman" w:eastAsia="华文宋体" w:hAnsi="Times New Roman" w:cs="Times New Roman"/>
+          <w:sz w:val="24"/>
+          <w:szCs w:val="24"/>
+        </w:rPr>
+      </w:pPr>
+      <w:r>
+        <w:rPr>
+          <w:rFonts w:ascii="Times New Roman" w:eastAsia="华文宋体" w:hAnsi="Times New Roman" w:cs="Times New Roman" w:hint="eastAsia"/>
+          <w:b/>
+          <w:sz w:val="24"/>
+          <w:szCs w:val="24"/>
+        </w:rPr>
+        <w:t>quarry</w:t>
+      </w:r>
+      <w:r>
+        <w:rPr>
+          <w:rFonts w:ascii="Times New Roman" w:eastAsia="华文宋体" w:hAnsi="Times New Roman" w:cs="Times New Roman" w:hint="eastAsia"/>
+          <w:sz w:val="24"/>
+          <w:szCs w:val="24"/>
+        </w:rPr>
+        <w:t xml:space="preserve"> /</w:t>
+      </w:r>
+      <w:r>
+        <w:rPr>
+          <w:rFonts w:ascii="GWIPA" w:eastAsia="华文宋体" w:hAnsi="GWIPA" w:cs="Times New Roman"/>
+          <w:sz w:val="24"/>
+          <w:szCs w:val="24"/>
+        </w:rPr>
+        <w:t></w:t>
+      </w:r>
+      <w:r>
+        <w:rPr>
+          <w:rFonts w:ascii="GWIPA" w:eastAsia="华文宋体" w:hAnsi="GWIPA" w:cs="Times New Roman"/>
+          <w:sz w:val="24"/>
+          <w:szCs w:val="24"/>
+        </w:rPr>
+        <w:t></w:t>
+      </w:r>
+      <w:r>
+        <w:rPr>
+          <w:rFonts w:ascii="GWIPA" w:eastAsia="华文宋体" w:hAnsi="GWIPA" w:cs="Times New Roman"/>
+          <w:sz w:val="24"/>
+          <w:szCs w:val="24"/>
+        </w:rPr>
+        <w:t></w:t>
+      </w:r>
+      <w:r>
+        <w:rPr>
+          <w:rFonts w:ascii="GWIPA" w:eastAsia="华文宋体" w:hAnsi="GWIPA" w:cs="Times New Roman"/>
+          <w:sz w:val="24"/>
+          <w:szCs w:val="24"/>
+        </w:rPr>
+        <w:t></w:t>
+      </w:r>
+      <w:r>
+        <w:rPr>
+          <w:rFonts w:ascii="GWIPA" w:eastAsia="华文宋体" w:hAnsi="GWIPA" w:cs="Times New Roman"/>
+          <w:sz w:val="24"/>
+          <w:szCs w:val="24"/>
+        </w:rPr>
+        <w:t></w:t>
+      </w:r>
+      <w:r>
+        <w:rPr>
+          <w:rFonts w:ascii="GWIPA" w:eastAsia="华文宋体" w:hAnsi="GWIPA" w:cs="Times New Roman"/>
+          <w:sz w:val="24"/>
+          <w:szCs w:val="24"/>
+        </w:rPr>
+        <w:t></w:t>
+      </w:r>
+      <w:r>
+        <w:rPr>
+          <w:rFonts w:ascii="GWIPA" w:eastAsia="华文宋体" w:hAnsi="GWIPA" w:cs="Times New Roman"/>
+          <w:sz w:val="24"/>
+          <w:szCs w:val="24"/>
+        </w:rPr>
+        <w:t></w:t>
+      </w:r>
+      <w:r>
+        <w:rPr>
+          <w:rFonts w:ascii="GWIPA" w:eastAsia="华文宋体" w:hAnsi="GWIPA" w:cs="Times New Roman"/>
+          <w:sz w:val="24"/>
+          <w:szCs w:val="24"/>
+        </w:rPr>
+        <w:br/>
+      </w:r>
+      <w:r>
+        <w:rPr>
+          <w:rFonts w:ascii="Times New Roman" w:eastAsia="华文宋体" w:hAnsi="Times New Roman" w:cs="Times New Roman" w:hint="eastAsia"/>
+          <w:sz w:val="24"/>
+          <w:szCs w:val="24"/>
+        </w:rPr>
+        <w:t>[C.] a place where large amounts of stone, etc. are dug out of the ground.</w:t>
+      </w:r>
+      <w:r>
+        <w:rPr>
+          <w:rFonts w:ascii="Times New Roman" w:eastAsia="华文宋体" w:hAnsi="Times New Roman" w:cs="Times New Roman"/>
+          <w:sz w:val="24"/>
+          <w:szCs w:val="24"/>
+        </w:rPr>
+        <w:br/>
+      </w:r>
+      <w:r>
+        <w:rPr>
+          <w:rFonts w:ascii="Times New Roman" w:eastAsia="华文宋体" w:hAnsi="Times New Roman" w:cs="Times New Roman" w:hint="eastAsia"/>
+          <w:sz w:val="24"/>
+          <w:szCs w:val="24"/>
+        </w:rPr>
+        <w:t>a slate quarry.</w:t>
+      </w:r>
+    </w:p>
+    <w:p>
+      <w:pPr>
+        <w:rPr>
+          <w:rFonts w:ascii="Times New Roman" w:eastAsia="华文宋体" w:hAnsi="Times New Roman" w:cs="Times New Roman"/>
+          <w:sz w:val="24"/>
+          <w:szCs w:val="24"/>
+        </w:rPr>
+      </w:pPr>
+      <w:r>
+        <w:rPr>
+          <w:rFonts w:ascii="Times New Roman" w:eastAsia="华文宋体" w:hAnsi="Times New Roman" w:cs="Times New Roman" w:hint="eastAsia"/>
+          <w:b/>
+          <w:sz w:val="24"/>
+          <w:szCs w:val="24"/>
+        </w:rPr>
+        <w:t>sheer</w:t>
+      </w:r>
+      <w:r>
+        <w:rPr>
+          <w:rFonts w:ascii="Times New Roman" w:eastAsia="华文宋体" w:hAnsi="Times New Roman" w:cs="Times New Roman"/>
+          <w:sz w:val="24"/>
+          <w:szCs w:val="24"/>
+        </w:rPr>
+        <w:br/>
+      </w:r>
+      <w:r>
+        <w:rPr>
+          <w:rFonts w:ascii="Times New Roman" w:eastAsia="华文宋体" w:hAnsi="Times New Roman" w:cs="Times New Roman" w:hint="eastAsia"/>
+          <w:sz w:val="24"/>
+          <w:szCs w:val="24"/>
+        </w:rPr>
+        <w:t>[adj.] used to emphasize the size, degree or amount of sth.</w:t>
+      </w:r>
+      <w:r>
+        <w:rPr>
+          <w:rFonts w:ascii="Times New Roman" w:eastAsia="华文宋体" w:hAnsi="Times New Roman" w:cs="Times New Roman" w:hint="eastAsia"/>
+          <w:sz w:val="24"/>
+          <w:szCs w:val="24"/>
+        </w:rPr>
+        <w:t xml:space="preserve"> </w:t>
+      </w:r>
+      <w:r>
+        <w:rPr>
+          <w:rFonts w:ascii="Times New Roman" w:eastAsia="华文宋体" w:hAnsi="Times New Roman" w:cs="Times New Roman" w:hint="eastAsia"/>
+          <w:sz w:val="24"/>
+          <w:szCs w:val="24"/>
+        </w:rPr>
+        <w:t>(</w:t>
+      </w:r>
+      <w:r>
+        <w:rPr>
+          <w:rFonts w:ascii="Times New Roman" w:eastAsia="华文宋体" w:hAnsi="Times New Roman" w:cs="Times New Roman" w:hint="eastAsia"/>
+          <w:sz w:val="24"/>
+          <w:szCs w:val="24"/>
+        </w:rPr>
+        <w:t>As far as I know, t</w:t>
+      </w:r>
+      <w:r>
+        <w:rPr>
+          <w:rFonts w:ascii="Times New Roman" w:eastAsia="华文宋体" w:hAnsi="Times New Roman" w:cs="Times New Roman" w:hint="eastAsia"/>
+          <w:sz w:val="24"/>
+          <w:szCs w:val="24"/>
+        </w:rPr>
+        <w:t>here is non any coordinated Chinese words to it.)</w:t>
+      </w:r>
+      <w:r>
+        <w:rPr>
+          <w:rFonts w:ascii="Times New Roman" w:eastAsia="华文宋体" w:hAnsi="Times New Roman" w:cs="Times New Roman"/>
+          <w:sz w:val="24"/>
+          <w:szCs w:val="24"/>
+        </w:rPr>
+        <w:br/>
+      </w:r>
+      <w:r>
+        <w:rPr>
+          <w:rFonts w:ascii="Times New Roman" w:eastAsia="华文宋体" w:hAnsi="Times New Roman" w:cs="Times New Roman" w:hint="eastAsia"/>
+          <w:b/>
+          <w:sz w:val="24"/>
+          <w:szCs w:val="24"/>
+        </w:rPr>
+        <w:t>sheer volume</w:t>
+      </w:r>
+      <w:r>
+        <w:rPr>
+          <w:rFonts w:ascii="Times New Roman" w:eastAsia="华文宋体" w:hAnsi="Times New Roman" w:cs="Times New Roman" w:hint="eastAsia"/>
+          <w:sz w:val="24"/>
+          <w:szCs w:val="24"/>
+        </w:rPr>
+        <w:t xml:space="preserve"> of animal</w:t>
+      </w:r>
+      <w:r>
+        <w:rPr>
+          <w:rFonts w:ascii="Times New Roman" w:eastAsia="华文宋体" w:hAnsi="Times New Roman" w:cs="Times New Roman" w:hint="eastAsia"/>
+          <w:sz w:val="24"/>
+          <w:szCs w:val="24"/>
+        </w:rPr>
+        <w:t>.</w:t>
+      </w:r>
+      <w:r>
+        <w:rPr>
+          <w:rFonts w:ascii="Times New Roman" w:eastAsia="华文宋体" w:hAnsi="Times New Roman" w:cs="Times New Roman"/>
+          <w:sz w:val="24"/>
+          <w:szCs w:val="24"/>
+        </w:rPr>
+        <w:br/>
+      </w:r>
+      <w:r>
+        <w:rPr>
+          <w:rFonts w:ascii="Times New Roman" w:eastAsia="华文宋体" w:hAnsi="Times New Roman" w:cs="Times New Roman" w:hint="eastAsia"/>
+          <w:sz w:val="24"/>
+          <w:szCs w:val="24"/>
+        </w:rPr>
+        <w:t xml:space="preserve">The area is under threat from the sheer number of tourists using it. </w:t>
+      </w:r>
+    </w:p>
+    <w:p>
+      <w:pPr>
+        <w:rPr>
+          <w:rFonts w:ascii="Times New Roman" w:eastAsia="华文宋体" w:hAnsi="Times New Roman" w:cs="Times New Roman"/>
+          <w:sz w:val="24"/>
+          <w:szCs w:val="24"/>
+        </w:rPr>
+      </w:pPr>
+      <w:r>
+        <w:rPr>
+          <w:rFonts w:ascii="Times New Roman" w:eastAsia="华文宋体" w:hAnsi="Times New Roman" w:cs="Times New Roman" w:hint="eastAsia"/>
+          <w:b/>
+          <w:sz w:val="24"/>
+          <w:szCs w:val="24"/>
+        </w:rPr>
+        <w:t xml:space="preserve">retain </w:t>
+      </w:r>
+      <w:r>
+        <w:rPr>
+          <w:rFonts w:ascii="Times New Roman" w:eastAsia="华文宋体" w:hAnsi="Times New Roman" w:cs="Times New Roman"/>
+          <w:sz w:val="24"/>
+          <w:szCs w:val="24"/>
+        </w:rPr>
+        <w:br/>
+      </w:r>
+      <w:r>
+        <w:rPr>
+          <w:rFonts w:ascii="Times New Roman" w:eastAsia="华文宋体" w:hAnsi="Times New Roman" w:cs="Times New Roman" w:hint="eastAsia"/>
+          <w:sz w:val="24"/>
+          <w:szCs w:val="24"/>
+        </w:rPr>
+        <w:t>[vt.] to keep something.</w:t>
+      </w:r>
+      <w:r>
+        <w:rPr>
+          <w:rFonts w:ascii="Times New Roman" w:eastAsia="华文宋体" w:hAnsi="Times New Roman" w:cs="Times New Roman"/>
+          <w:sz w:val="24"/>
+          <w:szCs w:val="24"/>
+        </w:rPr>
+        <w:br/>
+      </w:r>
+      <w:r>
+        <w:rPr>
+          <w:rFonts w:ascii="Times New Roman" w:eastAsia="华文宋体" w:hAnsi="Times New Roman" w:cs="Times New Roman" w:hint="eastAsia"/>
+          <w:sz w:val="24"/>
+          <w:szCs w:val="24"/>
+        </w:rPr>
+        <w:t xml:space="preserve">This would have helped the pots to retain water. </w:t>
+      </w:r>
+    </w:p>
+    <w:p>
+      <w:pPr>
+        <w:rPr>
+          <w:rFonts w:ascii="Times New Roman" w:eastAsia="华文宋体" w:hAnsi="Times New Roman" w:cs="Times New Roman"/>
+          <w:sz w:val="24"/>
+          <w:szCs w:val="24"/>
+        </w:rPr>
+      </w:pPr>
+      <w:r>
+        <w:rPr>
+          <w:rFonts w:ascii="Times New Roman" w:eastAsia="华文宋体" w:hAnsi="Times New Roman" w:cs="Times New Roman" w:hint="eastAsia"/>
+          <w:b/>
+          <w:sz w:val="24"/>
+          <w:szCs w:val="24"/>
+        </w:rPr>
+        <w:t xml:space="preserve">glaze </w:t>
+      </w:r>
+      <w:r>
+        <w:rPr>
+          <w:rFonts w:ascii="Times New Roman" w:eastAsia="华文宋体" w:hAnsi="Times New Roman" w:cs="Times New Roman"/>
+          <w:b/>
+          <w:sz w:val="24"/>
+          <w:szCs w:val="24"/>
+        </w:rPr>
+        <w:br/>
+      </w:r>
+      <w:r>
+        <w:rPr>
+          <w:rFonts w:ascii="Times New Roman" w:eastAsia="华文宋体" w:hAnsi="Times New Roman" w:cs="Times New Roman" w:hint="eastAsia"/>
+          <w:sz w:val="24"/>
+          <w:szCs w:val="24"/>
+        </w:rPr>
+        <w:t xml:space="preserve">[vt.] </w:t>
+      </w:r>
+      <w:r>
+        <w:rPr>
+          <w:rFonts w:ascii="Times New Roman" w:eastAsia="华文宋体" w:hAnsi="Times New Roman" w:cs="Times New Roman" w:hint="eastAsia"/>
+          <w:sz w:val="24"/>
+          <w:szCs w:val="24"/>
+        </w:rPr>
+        <w:t>上釉；上光</w:t>
+      </w:r>
+    </w:p>
+    <w:p>
+      <w:pPr>
+        <w:rPr>
+          <w:rFonts w:ascii="Times New Roman" w:eastAsia="华文宋体" w:hAnsi="Times New Roman" w:cs="Times New Roman"/>
+          <w:sz w:val="24"/>
+          <w:szCs w:val="24"/>
+        </w:rPr>
+      </w:pPr>
+      <w:r>
+        <w:rPr>
+          <w:rFonts w:ascii="Times New Roman" w:eastAsia="华文宋体" w:hAnsi="Times New Roman" w:cs="Times New Roman" w:hint="eastAsia"/>
+          <w:b/>
+          <w:sz w:val="24"/>
+          <w:szCs w:val="24"/>
+        </w:rPr>
         <w:lastRenderedPageBreak/>
-        <w:t>plough</w:t>
-      </w:r>
-      <w:r>
-        <w:rPr>
-          <w:rFonts w:ascii="Times New Roman" w:eastAsia="华文宋体" w:hAnsi="Times New Roman" w:cs="Times New Roman" w:hint="eastAsia"/>
-          <w:sz w:val="24"/>
-          <w:szCs w:val="24"/>
-        </w:rPr>
-        <w:t xml:space="preserve"> /</w:t>
-      </w:r>
-      <w:r>
-        <w:rPr>
-          <w:rFonts w:ascii="GWIPA" w:eastAsia="华文宋体" w:hAnsi="GWIPA" w:cs="Times New Roman"/>
-          <w:sz w:val="24"/>
-          <w:szCs w:val="24"/>
-        </w:rPr>
-        <w:t></w:t>
-      </w:r>
-      <w:r>
-        <w:rPr>
-          <w:rFonts w:ascii="GWIPA" w:eastAsia="华文宋体" w:hAnsi="GWIPA" w:cs="Times New Roman"/>
-          <w:sz w:val="24"/>
-          <w:szCs w:val="24"/>
-        </w:rPr>
-        <w:t></w:t>
-      </w:r>
-      <w:r>
-        <w:rPr>
-          <w:rFonts w:ascii="GWIPA" w:eastAsia="华文宋体" w:hAnsi="GWIPA" w:cs="Times New Roman"/>
-          <w:sz w:val="24"/>
-          <w:szCs w:val="24"/>
-        </w:rPr>
-        <w:t></w:t>
-      </w:r>
-      <w:r>
-        <w:rPr>
-          <w:rFonts w:ascii="GWIPA" w:eastAsia="华文宋体" w:hAnsi="GWIPA" w:cs="Times New Roman"/>
-          <w:sz w:val="24"/>
-          <w:szCs w:val="24"/>
-        </w:rPr>
-        <w:t></w:t>
-      </w:r>
-      <w:r>
-        <w:rPr>
-          <w:rFonts w:ascii="Times New Roman" w:eastAsia="华文宋体" w:hAnsi="Times New Roman" w:cs="Times New Roman" w:hint="eastAsia"/>
-          <w:sz w:val="24"/>
-          <w:szCs w:val="24"/>
-        </w:rPr>
-        <w:t>/</w:t>
-      </w:r>
-      <w:r>
-        <w:rPr>
-          <w:rFonts w:ascii="Times New Roman" w:eastAsia="华文宋体" w:hAnsi="Times New Roman" w:cs="Times New Roman"/>
-          <w:sz w:val="24"/>
-          <w:szCs w:val="24"/>
-        </w:rPr>
-        <w:br/>
-      </w:r>
-      <w:r>
-        <w:rPr>
-          <w:rFonts w:ascii="Times New Roman" w:eastAsia="华文宋体" w:hAnsi="Times New Roman" w:cs="Times New Roman" w:hint="eastAsia"/>
-          <w:sz w:val="24"/>
-          <w:szCs w:val="24"/>
-        </w:rPr>
-        <w:t xml:space="preserve">[n.] a large piece of farming equipment with one or serval curved blades to dig and trun over soil. </w:t>
-      </w:r>
-      <w:r>
-        <w:rPr>
-          <w:rFonts w:ascii="Times New Roman" w:eastAsia="华文宋体" w:hAnsi="Times New Roman" w:cs="Times New Roman"/>
-          <w:sz w:val="24"/>
-          <w:szCs w:val="24"/>
-        </w:rPr>
-        <w:br/>
-      </w:r>
-      <w:r>
-        <w:rPr>
-          <w:rFonts w:ascii="Times New Roman" w:eastAsia="华文宋体" w:hAnsi="Times New Roman" w:cs="Times New Roman" w:hint="eastAsia"/>
-          <w:sz w:val="24"/>
-          <w:szCs w:val="24"/>
-        </w:rPr>
-        <w:t>[vt.vi.] to dig and trun over a field or other area of land with a plough.</w:t>
-      </w:r>
-    </w:p>
-    <w:p>
-      <w:pPr>
-        <w:rPr>
-          <w:rFonts w:ascii="Times New Roman" w:eastAsia="华文宋体" w:hAnsi="Times New Roman" w:cs="Times New Roman"/>
-          <w:sz w:val="24"/>
-          <w:szCs w:val="24"/>
-        </w:rPr>
-      </w:pPr>
-      <w:r>
-        <w:rPr>
-          <w:rFonts w:ascii="Times New Roman" w:eastAsia="华文宋体" w:hAnsi="Times New Roman" w:cs="Times New Roman" w:hint="eastAsia"/>
-          <w:b/>
-          <w:sz w:val="24"/>
-          <w:szCs w:val="24"/>
-        </w:rPr>
-        <w:t>excavation</w:t>
-      </w:r>
-      <w:r>
-        <w:rPr>
-          <w:rFonts w:ascii="Times New Roman" w:eastAsia="华文宋体" w:hAnsi="Times New Roman" w:cs="Times New Roman" w:hint="eastAsia"/>
-          <w:sz w:val="24"/>
-          <w:szCs w:val="24"/>
-        </w:rPr>
-        <w:t xml:space="preserve"> /</w:t>
-      </w:r>
-      <w:r>
-        <w:rPr>
-          <w:rFonts w:ascii="GWIPA" w:eastAsia="华文宋体" w:hAnsi="GWIPA" w:cs="Times New Roman"/>
-          <w:sz w:val="24"/>
-          <w:szCs w:val="24"/>
-        </w:rPr>
-        <w:t></w:t>
-      </w:r>
-      <w:r>
-        <w:rPr>
-          <w:rFonts w:ascii="GWIPA" w:eastAsia="华文宋体" w:hAnsi="GWIPA" w:cs="Times New Roman"/>
-          <w:sz w:val="24"/>
-          <w:szCs w:val="24"/>
-        </w:rPr>
-        <w:t></w:t>
-      </w:r>
-      <w:r>
-        <w:rPr>
-          <w:rFonts w:ascii="GWIPA" w:eastAsia="华文宋体" w:hAnsi="GWIPA" w:cs="Times New Roman"/>
-          <w:sz w:val="24"/>
-          <w:szCs w:val="24"/>
-        </w:rPr>
-        <w:t></w:t>
-      </w:r>
-      <w:r>
-        <w:rPr>
-          <w:rFonts w:ascii="GWIPA" w:eastAsia="华文宋体" w:hAnsi="GWIPA" w:cs="Times New Roman"/>
-          <w:sz w:val="24"/>
-          <w:szCs w:val="24"/>
-        </w:rPr>
-        <w:t></w:t>
-      </w:r>
-      <w:r>
-        <w:rPr>
-          <w:rFonts w:ascii="GWIPA" w:eastAsia="华文宋体" w:hAnsi="GWIPA" w:cs="Times New Roman"/>
-          <w:sz w:val="24"/>
-          <w:szCs w:val="24"/>
-        </w:rPr>
-        <w:t></w:t>
-      </w:r>
-      <w:r>
-        <w:rPr>
-          <w:rFonts w:ascii="GWIPA" w:eastAsia="华文宋体" w:hAnsi="GWIPA" w:cs="Times New Roman"/>
-          <w:sz w:val="24"/>
-          <w:szCs w:val="24"/>
-        </w:rPr>
-        <w:t></w:t>
-      </w:r>
-      <w:r>
-        <w:rPr>
-          <w:rFonts w:ascii="GWIPA" w:eastAsia="华文宋体" w:hAnsi="GWIPA" w:cs="Times New Roman"/>
-          <w:sz w:val="24"/>
-          <w:szCs w:val="24"/>
-        </w:rPr>
-        <w:t></w:t>
-      </w:r>
-      <w:r>
-        <w:rPr>
-          <w:rFonts w:ascii="GWIPA" w:eastAsia="华文宋体" w:hAnsi="GWIPA" w:cs="Times New Roman"/>
-          <w:sz w:val="24"/>
-          <w:szCs w:val="24"/>
-        </w:rPr>
-        <w:t></w:t>
-      </w:r>
-      <w:r>
-        <w:rPr>
-          <w:rFonts w:ascii="GWIPA" w:eastAsia="华文宋体" w:hAnsi="GWIPA" w:cs="Times New Roman"/>
-          <w:sz w:val="24"/>
-          <w:szCs w:val="24"/>
-        </w:rPr>
-        <w:t></w:t>
-      </w:r>
-      <w:r>
-        <w:rPr>
-          <w:rFonts w:ascii="GWIPA" w:eastAsia="华文宋体" w:hAnsi="GWIPA" w:cs="Times New Roman"/>
-          <w:sz w:val="24"/>
-          <w:szCs w:val="24"/>
-        </w:rPr>
-        <w:t></w:t>
-      </w:r>
-      <w:r>
-        <w:rPr>
-          <w:rFonts w:ascii="GWIPA" w:eastAsia="华文宋体" w:hAnsi="GWIPA" w:cs="Times New Roman"/>
-          <w:sz w:val="24"/>
-          <w:szCs w:val="24"/>
-        </w:rPr>
-        <w:t></w:t>
-      </w:r>
-      <w:r>
-        <w:rPr>
-          <w:rFonts w:ascii="GWIPA" w:eastAsia="华文宋体" w:hAnsi="GWIPA" w:cs="Times New Roman"/>
-          <w:sz w:val="24"/>
-          <w:szCs w:val="24"/>
-        </w:rPr>
-        <w:t></w:t>
-      </w:r>
-      <w:r>
-        <w:rPr>
-          <w:rFonts w:ascii="Times New Roman" w:eastAsia="华文宋体" w:hAnsi="Times New Roman" w:cs="Times New Roman" w:hint="eastAsia"/>
-          <w:sz w:val="24"/>
-          <w:szCs w:val="24"/>
-        </w:rPr>
-        <w:t>/</w:t>
-      </w:r>
-      <w:r>
-        <w:rPr>
-          <w:rFonts w:ascii="Times New Roman" w:eastAsia="华文宋体" w:hAnsi="Times New Roman" w:cs="Times New Roman"/>
-          <w:sz w:val="24"/>
-          <w:szCs w:val="24"/>
-        </w:rPr>
-        <w:br/>
-      </w:r>
-      <w:r>
-        <w:rPr>
-          <w:rFonts w:ascii="Times New Roman" w:eastAsia="华文宋体" w:hAnsi="Times New Roman" w:cs="Times New Roman" w:hint="eastAsia"/>
-          <w:sz w:val="24"/>
-          <w:szCs w:val="24"/>
-        </w:rPr>
-        <w:t>[n.] the activity of diggin</w:t>
-      </w:r>
-      <w:r>
-        <w:rPr>
-          <w:rFonts w:ascii="Times New Roman" w:eastAsia="华文宋体" w:hAnsi="Times New Roman" w:cs="Times New Roman" w:hint="eastAsia"/>
-          <w:sz w:val="24"/>
-          <w:szCs w:val="24"/>
-        </w:rPr>
-        <w:t>g</w:t>
-      </w:r>
-      <w:r>
-        <w:rPr>
-          <w:rFonts w:ascii="Times New Roman" w:eastAsia="华文宋体" w:hAnsi="Times New Roman" w:cs="Times New Roman" w:hint="eastAsia"/>
-          <w:sz w:val="24"/>
-          <w:szCs w:val="24"/>
-        </w:rPr>
-        <w:t xml:space="preserve"> in the ground to look for old buildings or objects that have been buried for a long time.</w:t>
-      </w:r>
-    </w:p>
-    <w:p>
-      <w:pPr>
-        <w:rPr>
-          <w:rFonts w:ascii="Times New Roman" w:eastAsia="华文宋体" w:hAnsi="Times New Roman" w:cs="Times New Roman"/>
-          <w:sz w:val="24"/>
-          <w:szCs w:val="24"/>
-        </w:rPr>
-      </w:pPr>
-      <w:r>
-        <w:rPr>
-          <w:rFonts w:ascii="Times New Roman" w:eastAsia="华文宋体" w:hAnsi="Times New Roman" w:cs="Times New Roman" w:hint="eastAsia"/>
-          <w:b/>
-          <w:sz w:val="24"/>
-          <w:szCs w:val="24"/>
-        </w:rPr>
-        <w:t xml:space="preserve">husbandry </w:t>
-      </w:r>
-      <w:r>
-        <w:rPr>
-          <w:rFonts w:ascii="Times New Roman" w:eastAsia="华文宋体" w:hAnsi="Times New Roman" w:cs="Times New Roman"/>
-          <w:sz w:val="24"/>
-          <w:szCs w:val="24"/>
-        </w:rPr>
-        <w:br/>
-      </w:r>
-      <w:r>
-        <w:rPr>
-          <w:rFonts w:ascii="Times New Roman" w:eastAsia="华文宋体" w:hAnsi="Times New Roman" w:cs="Times New Roman" w:hint="eastAsia"/>
-          <w:sz w:val="24"/>
-          <w:szCs w:val="24"/>
-        </w:rPr>
-        <w:t>[n.] farming, especially when done carefully and well.</w:t>
-      </w:r>
-      <w:r>
-        <w:rPr>
-          <w:rFonts w:ascii="Times New Roman" w:eastAsia="华文宋体" w:hAnsi="Times New Roman" w:cs="Times New Roman"/>
-          <w:sz w:val="24"/>
-          <w:szCs w:val="24"/>
-        </w:rPr>
-        <w:br/>
-      </w:r>
-      <w:r>
-        <w:rPr>
-          <w:rFonts w:ascii="Times New Roman" w:eastAsia="华文宋体" w:hAnsi="Times New Roman" w:cs="Times New Roman" w:hint="eastAsia"/>
-          <w:sz w:val="24"/>
-          <w:szCs w:val="24"/>
-        </w:rPr>
-        <w:t>animal/crop husbandry.</w:t>
-      </w:r>
-    </w:p>
-    <w:p>
-      <w:pPr>
-        <w:rPr>
-          <w:rFonts w:ascii="Times New Roman" w:eastAsia="华文宋体" w:hAnsi="Times New Roman" w:cs="Times New Roman"/>
-          <w:sz w:val="24"/>
-          <w:szCs w:val="24"/>
-        </w:rPr>
-      </w:pPr>
-      <w:r>
-        <w:rPr>
-          <w:rFonts w:ascii="Times New Roman" w:eastAsia="华文宋体" w:hAnsi="Times New Roman" w:cs="Times New Roman" w:hint="eastAsia"/>
-          <w:b/>
-          <w:sz w:val="24"/>
-          <w:szCs w:val="24"/>
-        </w:rPr>
-        <w:t>quarry</w:t>
-      </w:r>
-      <w:r>
-        <w:rPr>
-          <w:rFonts w:ascii="Times New Roman" w:eastAsia="华文宋体" w:hAnsi="Times New Roman" w:cs="Times New Roman" w:hint="eastAsia"/>
-          <w:sz w:val="24"/>
-          <w:szCs w:val="24"/>
-        </w:rPr>
-        <w:t xml:space="preserve"> /</w:t>
-      </w:r>
-      <w:r>
-        <w:rPr>
-          <w:rFonts w:ascii="GWIPA" w:eastAsia="华文宋体" w:hAnsi="GWIPA" w:cs="Times New Roman"/>
-          <w:sz w:val="24"/>
-          <w:szCs w:val="24"/>
-        </w:rPr>
-        <w:t></w:t>
-      </w:r>
-      <w:r>
-        <w:rPr>
-          <w:rFonts w:ascii="GWIPA" w:eastAsia="华文宋体" w:hAnsi="GWIPA" w:cs="Times New Roman"/>
-          <w:sz w:val="24"/>
-          <w:szCs w:val="24"/>
-        </w:rPr>
-        <w:t></w:t>
-      </w:r>
-      <w:r>
-        <w:rPr>
-          <w:rFonts w:ascii="GWIPA" w:eastAsia="华文宋体" w:hAnsi="GWIPA" w:cs="Times New Roman"/>
-          <w:sz w:val="24"/>
-          <w:szCs w:val="24"/>
-        </w:rPr>
-        <w:t></w:t>
-      </w:r>
-      <w:r>
-        <w:rPr>
-          <w:rFonts w:ascii="GWIPA" w:eastAsia="华文宋体" w:hAnsi="GWIPA" w:cs="Times New Roman"/>
-          <w:sz w:val="24"/>
-          <w:szCs w:val="24"/>
-        </w:rPr>
-        <w:t></w:t>
-      </w:r>
-      <w:r>
-        <w:rPr>
-          <w:rFonts w:ascii="GWIPA" w:eastAsia="华文宋体" w:hAnsi="GWIPA" w:cs="Times New Roman"/>
-          <w:sz w:val="24"/>
-          <w:szCs w:val="24"/>
-        </w:rPr>
-        <w:t></w:t>
-      </w:r>
-      <w:r>
-        <w:rPr>
-          <w:rFonts w:ascii="GWIPA" w:eastAsia="华文宋体" w:hAnsi="GWIPA" w:cs="Times New Roman"/>
-          <w:sz w:val="24"/>
-          <w:szCs w:val="24"/>
-        </w:rPr>
-        <w:t></w:t>
-      </w:r>
-      <w:r>
-        <w:rPr>
-          <w:rFonts w:ascii="GWIPA" w:eastAsia="华文宋体" w:hAnsi="GWIPA" w:cs="Times New Roman"/>
-          <w:sz w:val="24"/>
-          <w:szCs w:val="24"/>
-        </w:rPr>
-        <w:t></w:t>
-      </w:r>
-      <w:r>
-        <w:rPr>
-          <w:rFonts w:ascii="GWIPA" w:eastAsia="华文宋体" w:hAnsi="GWIPA" w:cs="Times New Roman"/>
-          <w:sz w:val="24"/>
-          <w:szCs w:val="24"/>
-        </w:rPr>
-        <w:br/>
-      </w:r>
-      <w:r>
-        <w:rPr>
-          <w:rFonts w:ascii="Times New Roman" w:eastAsia="华文宋体" w:hAnsi="Times New Roman" w:cs="Times New Roman" w:hint="eastAsia"/>
-          <w:sz w:val="24"/>
-          <w:szCs w:val="24"/>
-        </w:rPr>
-        <w:t>[C.] a place where large amounts of stone, etc. are dug out of the ground.</w:t>
-      </w:r>
-      <w:r>
-        <w:rPr>
-          <w:rFonts w:ascii="Times New Roman" w:eastAsia="华文宋体" w:hAnsi="Times New Roman" w:cs="Times New Roman"/>
-          <w:sz w:val="24"/>
-          <w:szCs w:val="24"/>
-        </w:rPr>
-        <w:br/>
-      </w:r>
-      <w:r>
-        <w:rPr>
-          <w:rFonts w:ascii="Times New Roman" w:eastAsia="华文宋体" w:hAnsi="Times New Roman" w:cs="Times New Roman" w:hint="eastAsia"/>
-          <w:sz w:val="24"/>
-          <w:szCs w:val="24"/>
-        </w:rPr>
-        <w:t>a slate quarry.</w:t>
-      </w:r>
-    </w:p>
-    <w:p>
-      <w:pPr>
-        <w:rPr>
-          <w:rFonts w:ascii="Times New Roman" w:eastAsia="华文宋体" w:hAnsi="Times New Roman" w:cs="Times New Roman"/>
-          <w:sz w:val="24"/>
-          <w:szCs w:val="24"/>
-        </w:rPr>
-      </w:pPr>
-      <w:r>
-        <w:rPr>
-          <w:rFonts w:ascii="Times New Roman" w:eastAsia="华文宋体" w:hAnsi="Times New Roman" w:cs="Times New Roman" w:hint="eastAsia"/>
-          <w:b/>
-          <w:sz w:val="24"/>
-          <w:szCs w:val="24"/>
-        </w:rPr>
-        <w:t>sheer</w:t>
-      </w:r>
-      <w:r>
-        <w:rPr>
-          <w:rFonts w:ascii="Times New Roman" w:eastAsia="华文宋体" w:hAnsi="Times New Roman" w:cs="Times New Roman"/>
-          <w:sz w:val="24"/>
-          <w:szCs w:val="24"/>
-        </w:rPr>
-        <w:br/>
-      </w:r>
-      <w:r>
-        <w:rPr>
-          <w:rFonts w:ascii="Times New Roman" w:eastAsia="华文宋体" w:hAnsi="Times New Roman" w:cs="Times New Roman" w:hint="eastAsia"/>
-          <w:sz w:val="24"/>
-          <w:szCs w:val="24"/>
-        </w:rPr>
-        <w:t>[adj.] used to emphasize the size, degree or amount of sth.</w:t>
-      </w:r>
-      <w:r>
-        <w:rPr>
-          <w:rFonts w:ascii="Times New Roman" w:eastAsia="华文宋体" w:hAnsi="Times New Roman" w:cs="Times New Roman" w:hint="eastAsia"/>
-          <w:sz w:val="24"/>
-          <w:szCs w:val="24"/>
-        </w:rPr>
-        <w:t xml:space="preserve"> </w:t>
-      </w:r>
-      <w:r>
-        <w:rPr>
-          <w:rFonts w:ascii="Times New Roman" w:eastAsia="华文宋体" w:hAnsi="Times New Roman" w:cs="Times New Roman" w:hint="eastAsia"/>
-          <w:sz w:val="24"/>
-          <w:szCs w:val="24"/>
-        </w:rPr>
-        <w:t>(</w:t>
-      </w:r>
-      <w:r>
-        <w:rPr>
-          <w:rFonts w:ascii="Times New Roman" w:eastAsia="华文宋体" w:hAnsi="Times New Roman" w:cs="Times New Roman" w:hint="eastAsia"/>
-          <w:sz w:val="24"/>
-          <w:szCs w:val="24"/>
-        </w:rPr>
-        <w:t>As far as I know, t</w:t>
-      </w:r>
-      <w:r>
-        <w:rPr>
-          <w:rFonts w:ascii="Times New Roman" w:eastAsia="华文宋体" w:hAnsi="Times New Roman" w:cs="Times New Roman" w:hint="eastAsia"/>
-          <w:sz w:val="24"/>
-          <w:szCs w:val="24"/>
-        </w:rPr>
-        <w:t>here is non any coordinated Chinese words to it.)</w:t>
-      </w:r>
-      <w:r>
-        <w:rPr>
-          <w:rFonts w:ascii="Times New Roman" w:eastAsia="华文宋体" w:hAnsi="Times New Roman" w:cs="Times New Roman"/>
-          <w:sz w:val="24"/>
-          <w:szCs w:val="24"/>
-        </w:rPr>
-        <w:br/>
-      </w:r>
-      <w:r>
-        <w:rPr>
-          <w:rFonts w:ascii="Times New Roman" w:eastAsia="华文宋体" w:hAnsi="Times New Roman" w:cs="Times New Roman" w:hint="eastAsia"/>
-          <w:b/>
-          <w:sz w:val="24"/>
-          <w:szCs w:val="24"/>
-        </w:rPr>
-        <w:t>sheer volume</w:t>
-      </w:r>
-      <w:r>
-        <w:rPr>
-          <w:rFonts w:ascii="Times New Roman" w:eastAsia="华文宋体" w:hAnsi="Times New Roman" w:cs="Times New Roman" w:hint="eastAsia"/>
-          <w:sz w:val="24"/>
-          <w:szCs w:val="24"/>
-        </w:rPr>
-        <w:t xml:space="preserve"> of animal</w:t>
-      </w:r>
-      <w:r>
-        <w:rPr>
-          <w:rFonts w:ascii="Times New Roman" w:eastAsia="华文宋体" w:hAnsi="Times New Roman" w:cs="Times New Roman" w:hint="eastAsia"/>
-          <w:sz w:val="24"/>
-          <w:szCs w:val="24"/>
-        </w:rPr>
-        <w:t>.</w:t>
-      </w:r>
-      <w:r>
-        <w:rPr>
-          <w:rFonts w:ascii="Times New Roman" w:eastAsia="华文宋体" w:hAnsi="Times New Roman" w:cs="Times New Roman"/>
-          <w:sz w:val="24"/>
-          <w:szCs w:val="24"/>
-        </w:rPr>
-        <w:br/>
-      </w:r>
-      <w:r>
-        <w:rPr>
-          <w:rFonts w:ascii="Times New Roman" w:eastAsia="华文宋体" w:hAnsi="Times New Roman" w:cs="Times New Roman" w:hint="eastAsia"/>
-          <w:sz w:val="24"/>
-          <w:szCs w:val="24"/>
-        </w:rPr>
-        <w:t xml:space="preserve">The area is under threat from the sheer number of tourists using it. </w:t>
-      </w:r>
-    </w:p>
-    <w:p>
-      <w:pPr>
-        <w:rPr>
-          <w:rFonts w:ascii="Times New Roman" w:eastAsia="华文宋体" w:hAnsi="Times New Roman" w:cs="Times New Roman"/>
-          <w:sz w:val="24"/>
-          <w:szCs w:val="24"/>
-        </w:rPr>
-      </w:pPr>
-      <w:r>
-        <w:rPr>
-          <w:rFonts w:ascii="Times New Roman" w:eastAsia="华文宋体" w:hAnsi="Times New Roman" w:cs="Times New Roman" w:hint="eastAsia"/>
-          <w:b/>
-          <w:sz w:val="24"/>
-          <w:szCs w:val="24"/>
-        </w:rPr>
-        <w:t xml:space="preserve">retain </w:t>
-      </w:r>
-      <w:r>
-        <w:rPr>
-          <w:rFonts w:ascii="Times New Roman" w:eastAsia="华文宋体" w:hAnsi="Times New Roman" w:cs="Times New Roman"/>
-          <w:sz w:val="24"/>
-          <w:szCs w:val="24"/>
-        </w:rPr>
-        <w:br/>
-      </w:r>
-      <w:r>
-        <w:rPr>
-          <w:rFonts w:ascii="Times New Roman" w:eastAsia="华文宋体" w:hAnsi="Times New Roman" w:cs="Times New Roman" w:hint="eastAsia"/>
-          <w:sz w:val="24"/>
-          <w:szCs w:val="24"/>
-        </w:rPr>
-        <w:t>[vt.] to keep something.</w:t>
-      </w:r>
-      <w:r>
-        <w:rPr>
-          <w:rFonts w:ascii="Times New Roman" w:eastAsia="华文宋体" w:hAnsi="Times New Roman" w:cs="Times New Roman"/>
-          <w:sz w:val="24"/>
-          <w:szCs w:val="24"/>
-        </w:rPr>
-        <w:br/>
-      </w:r>
-      <w:r>
-        <w:rPr>
-          <w:rFonts w:ascii="Times New Roman" w:eastAsia="华文宋体" w:hAnsi="Times New Roman" w:cs="Times New Roman" w:hint="eastAsia"/>
-          <w:sz w:val="24"/>
-          <w:szCs w:val="24"/>
-        </w:rPr>
-        <w:t xml:space="preserve">This would have helped the pots to retain water. </w:t>
-      </w:r>
-    </w:p>
-    <w:p>
-      <w:pPr>
-        <w:rPr>
-          <w:rFonts w:ascii="Times New Roman" w:eastAsia="华文宋体" w:hAnsi="Times New Roman" w:cs="Times New Roman"/>
-          <w:sz w:val="24"/>
-          <w:szCs w:val="24"/>
-        </w:rPr>
-      </w:pPr>
-      <w:r>
-        <w:rPr>
-          <w:rFonts w:ascii="Times New Roman" w:eastAsia="华文宋体" w:hAnsi="Times New Roman" w:cs="Times New Roman" w:hint="eastAsia"/>
-          <w:b/>
-          <w:sz w:val="24"/>
-          <w:szCs w:val="24"/>
-        </w:rPr>
-        <w:t xml:space="preserve">glaze </w:t>
-      </w:r>
-      <w:r>
-        <w:rPr>
-          <w:rFonts w:ascii="Times New Roman" w:eastAsia="华文宋体" w:hAnsi="Times New Roman" w:cs="Times New Roman"/>
-          <w:b/>
-          <w:sz w:val="24"/>
-          <w:szCs w:val="24"/>
-        </w:rPr>
-        <w:br/>
-      </w:r>
-      <w:r>
-        <w:rPr>
-          <w:rFonts w:ascii="Times New Roman" w:eastAsia="华文宋体" w:hAnsi="Times New Roman" w:cs="Times New Roman" w:hint="eastAsia"/>
-          <w:sz w:val="24"/>
-          <w:szCs w:val="24"/>
-        </w:rPr>
-        <w:t xml:space="preserve">[vt.] </w:t>
-      </w:r>
-      <w:r>
-        <w:rPr>
-          <w:rFonts w:ascii="Times New Roman" w:eastAsia="华文宋体" w:hAnsi="Times New Roman" w:cs="Times New Roman" w:hint="eastAsia"/>
-          <w:sz w:val="24"/>
-          <w:szCs w:val="24"/>
-        </w:rPr>
-        <w:t>上釉；上光</w:t>
-      </w:r>
-    </w:p>
-    <w:p>
-      <w:pPr>
-        <w:rPr>
-          <w:rFonts w:ascii="Times New Roman" w:eastAsia="华文宋体" w:hAnsi="Times New Roman" w:cs="Times New Roman"/>
-          <w:sz w:val="24"/>
-          <w:szCs w:val="24"/>
-        </w:rPr>
-      </w:pPr>
-      <w:r>
-        <w:rPr>
-          <w:rFonts w:ascii="Times New Roman" w:eastAsia="华文宋体" w:hAnsi="Times New Roman" w:cs="Times New Roman" w:hint="eastAsia"/>
-          <w:b/>
-          <w:sz w:val="24"/>
-          <w:szCs w:val="24"/>
-        </w:rPr>
         <w:t xml:space="preserve">stitch </w:t>
       </w:r>
       <w:r>
@@ -7450,7 +7773,6 @@
           <w:sz w:val="24"/>
           <w:szCs w:val="24"/>
         </w:rPr>
-        <w:lastRenderedPageBreak/>
         <w:t>overdue</w:t>
       </w:r>
       <w:r>
@@ -8648,7 +8970,7 @@
   <a:extraClrSchemeLst/>
   <a:extLst>
     <a:ext uri="{05A4C25C-085E-4340-85A3-A5531E510DB2}">
-      <thm15:themeFamily xmlns:thm15="http://schemas.microsoft.com/office/thememl/2012/main" xmlns="" name="Office Theme" id="{62F939B6-93AF-4DB8-9C6B-D6C7DFDC589F}" vid="{4A3C46E8-61CC-4603-A589-7422A47A8E4A}"/>
+      <thm15:themeFamily xmlns="" xmlns:thm15="http://schemas.microsoft.com/office/thememl/2012/main" name="Office Theme" id="{62F939B6-93AF-4DB8-9C6B-D6C7DFDC589F}" vid="{4A3C46E8-61CC-4603-A589-7422A47A8E4A}"/>
     </a:ext>
   </a:extLst>
 </a:theme>

</xml_diff>